<commit_message>
发布 LoomQ 赛题与 Starter Kit v1.0
</commit_message>
<xml_diff>
--- a/LoomQ-赛题.docx
+++ b/LoomQ-赛题.docx
@@ -2,6 +2,29 @@
 <file path=word/document.xml><?xml version="1.0" encoding="utf-8"?>
 <w:document xmlns:w="http://schemas.openxmlformats.org/wordprocessingml/2006/main" xmlns:m="http://schemas.openxmlformats.org/officeDocument/2006/math" xmlns:r="http://schemas.openxmlformats.org/officeDocument/2006/relationships" xmlns:o="urn:schemas-microsoft-com:office:office" xmlns:v="urn:schemas-microsoft-com:vml" xmlns:w10="urn:schemas-microsoft-com:office:word" xmlns:a="http://schemas.openxmlformats.org/drawingml/2006/main" xmlns:pic="http://schemas.openxmlformats.org/drawingml/2006/picture" xmlns:wp="http://schemas.openxmlformats.org/drawingml/2006/wordprocessingDrawing">
   <w:body>
+    <w:p>
+      <w:pPr>
+        <w:pStyle w:val="Title"/>
+      </w:pPr>
+      <w:r>
+        <w:t xml:space="preserve">LoomQ · </w:t>
+      </w:r>
+      <w:r>
+        <w:rPr>
+          <w:rFonts w:hint="eastAsia" w:ascii="Arial Unicode MS" w:hAnsi="Arial Unicode MS" w:cs="Arial Unicode MS" w:eastAsia="Arial Unicode MS"/>
+        </w:rPr>
+        <w:t xml:space="preserve">量子接入平权计划（SheNicest</w:t>
+      </w:r>
+      <w:r>
+        <w:t xml:space="preserve"> 2026 </w:t>
+      </w:r>
+      <w:r>
+        <w:rPr>
+          <w:rFonts w:hint="eastAsia" w:ascii="Arial Unicode MS" w:hAnsi="Arial Unicode MS" w:cs="Arial Unicode MS" w:eastAsia="Arial Unicode MS"/>
+        </w:rPr>
+        <w:t xml:space="preserve">赛题）</w:t>
+      </w:r>
+    </w:p>
     <w:bookmarkStart w:id="37" w:name="Xd5c79ed3509b4f79dd6f80ca23f265ab7fd0c33"/>
     <w:p>
       <w:pPr>
@@ -12,7 +35,7 @@
       </w:r>
       <w:r>
         <w:rPr>
-          <w:rFonts w:hint="eastAsia"/>
+          <w:rFonts w:hint="eastAsia" w:ascii="Arial Unicode MS" w:hAnsi="Arial Unicode MS" w:cs="Arial Unicode MS" w:eastAsia="Arial Unicode MS"/>
         </w:rPr>
         <w:t xml:space="preserve">量子接入平权计划</w:t>
       </w:r>
@@ -30,7 +53,7 @@
       </w:r>
       <w:r>
         <w:rPr>
-          <w:rFonts w:hint="eastAsia"/>
+          <w:rFonts w:hint="eastAsia" w:ascii="Arial Unicode MS" w:hAnsi="Arial Unicode MS" w:cs="Arial Unicode MS" w:eastAsia="Arial Unicode MS"/>
         </w:rPr>
         <w:t xml:space="preserve">让不懂”黑话”的人，也能指挥最前沿的算力</w:t>
       </w:r>
@@ -41,7 +64,7 @@
       </w:pPr>
       <w:r>
         <w:rPr>
-          <w:rFonts w:hint="eastAsia"/>
+          <w:rFonts w:hint="eastAsia" w:ascii="Arial Unicode MS" w:hAnsi="Arial Unicode MS" w:cs="Arial Unicode MS" w:eastAsia="Arial Unicode MS"/>
           <w:b/>
           <w:bCs/>
         </w:rPr>
@@ -49,7 +72,7 @@
       </w:r>
       <w:r>
         <w:rPr>
-          <w:rFonts w:hint="eastAsia"/>
+          <w:rFonts w:hint="eastAsia" w:ascii="Arial Unicode MS" w:hAnsi="Arial Unicode MS" w:cs="Arial Unicode MS" w:eastAsia="Arial Unicode MS"/>
         </w:rPr>
         <w:t xml:space="preserve">：AI</w:t>
       </w:r>
@@ -58,7 +81,7 @@
       </w:r>
       <w:r>
         <w:rPr>
-          <w:rFonts w:hint="eastAsia"/>
+          <w:rFonts w:hint="eastAsia" w:ascii="Arial Unicode MS" w:hAnsi="Arial Unicode MS" w:cs="Arial Unicode MS" w:eastAsia="Arial Unicode MS"/>
         </w:rPr>
         <w:t xml:space="preserve">应用</w:t>
       </w:r>
@@ -67,7 +90,7 @@
       </w:r>
       <w:r>
         <w:rPr>
-          <w:rFonts w:hint="eastAsia"/>
+          <w:rFonts w:hint="eastAsia" w:ascii="Arial Unicode MS" w:hAnsi="Arial Unicode MS" w:cs="Arial Unicode MS" w:eastAsia="Arial Unicode MS"/>
         </w:rPr>
         <w:t xml:space="preserve">硬核系统</w:t>
       </w:r>
@@ -76,7 +99,7 @@
       </w:r>
       <w:r>
         <w:rPr>
-          <w:rFonts w:hint="eastAsia"/>
+          <w:rFonts w:hint="eastAsia" w:ascii="Arial Unicode MS" w:hAnsi="Arial Unicode MS" w:cs="Arial Unicode MS" w:eastAsia="Arial Unicode MS"/>
           <w:b/>
           <w:bCs/>
         </w:rPr>
@@ -84,7 +107,7 @@
       </w:r>
       <w:r>
         <w:rPr>
-          <w:rFonts w:hint="eastAsia"/>
+          <w:rFonts w:hint="eastAsia" w:ascii="Arial Unicode MS" w:hAnsi="Arial Unicode MS" w:cs="Arial Unicode MS" w:eastAsia="Arial Unicode MS"/>
         </w:rPr>
         <w:t xml:space="preserve">：96</w:t>
       </w:r>
@@ -93,7 +116,7 @@
       </w:r>
       <w:r>
         <w:rPr>
-          <w:rFonts w:hint="eastAsia"/>
+          <w:rFonts w:hint="eastAsia" w:ascii="Arial Unicode MS" w:hAnsi="Arial Unicode MS" w:cs="Arial Unicode MS" w:eastAsia="Arial Unicode MS"/>
         </w:rPr>
         <w:t xml:space="preserve">小时</w:t>
       </w:r>
@@ -102,7 +125,7 @@
       </w:r>
       <w:r>
         <w:rPr>
-          <w:rFonts w:hint="eastAsia"/>
+          <w:rFonts w:hint="eastAsia" w:ascii="Arial Unicode MS" w:hAnsi="Arial Unicode MS" w:cs="Arial Unicode MS" w:eastAsia="Arial Unicode MS"/>
           <w:b/>
           <w:bCs/>
         </w:rPr>
@@ -110,7 +133,7 @@
       </w:r>
       <w:r>
         <w:rPr>
-          <w:rFonts w:hint="eastAsia"/>
+          <w:rFonts w:hint="eastAsia" w:ascii="Arial Unicode MS" w:hAnsi="Arial Unicode MS" w:cs="Arial Unicode MS" w:eastAsia="Arial Unicode MS"/>
         </w:rPr>
         <w:t xml:space="preserve">：1–4</w:t>
       </w:r>
@@ -119,7 +142,7 @@
       </w:r>
       <w:r>
         <w:rPr>
-          <w:rFonts w:hint="eastAsia"/>
+          <w:rFonts w:hint="eastAsia" w:ascii="Arial Unicode MS" w:hAnsi="Arial Unicode MS" w:cs="Arial Unicode MS" w:eastAsia="Arial Unicode MS"/>
         </w:rPr>
         <w:t xml:space="preserve">人（欢迎产品、设计、算法、系统、内容任意组合，无需量子计算学术背景）</w:t>
       </w:r>
@@ -139,7 +162,7 @@
       </w:pPr>
       <w:r>
         <w:rPr>
-          <w:rFonts w:hint="eastAsia"/>
+          <w:rFonts w:hint="eastAsia" w:ascii="Arial Unicode MS" w:hAnsi="Arial Unicode MS" w:cs="Arial Unicode MS" w:eastAsia="Arial Unicode MS"/>
         </w:rPr>
         <w:t xml:space="preserve">一、赛事愿景：为什么这至关重要？</w:t>
       </w:r>
@@ -153,13 +176,13 @@
       </w:pPr>
       <w:r>
         <w:rPr>
-          <w:rFonts w:hint="eastAsia"/>
+          <w:rFonts w:hint="eastAsia" w:ascii="Arial Unicode MS" w:hAnsi="Arial Unicode MS" w:cs="Arial Unicode MS" w:eastAsia="Arial Unicode MS"/>
         </w:rPr>
         <w:t xml:space="preserve">量子计算被公认为下一代算力革命的引擎，但今天的量子科技世界却面临着</w:t>
       </w:r>
       <w:r>
         <w:rPr>
-          <w:rFonts w:hint="eastAsia"/>
+          <w:rFonts w:hint="eastAsia" w:ascii="Arial Unicode MS" w:hAnsi="Arial Unicode MS" w:cs="Arial Unicode MS" w:eastAsia="Arial Unicode MS"/>
           <w:b/>
           <w:bCs/>
         </w:rPr>
@@ -167,7 +190,7 @@
       </w:r>
       <w:r>
         <w:rPr>
-          <w:rFonts w:hint="eastAsia"/>
+          <w:rFonts w:hint="eastAsia" w:ascii="Arial Unicode MS" w:hAnsi="Arial Unicode MS" w:cs="Arial Unicode MS" w:eastAsia="Arial Unicode MS"/>
         </w:rPr>
         <w:t xml:space="preserve">的困境。</w:t>
       </w:r>
@@ -178,7 +201,7 @@
       </w:pPr>
       <w:r>
         <w:rPr>
-          <w:rFonts w:hint="eastAsia"/>
+          <w:rFonts w:hint="eastAsia" w:ascii="Arial Unicode MS" w:hAnsi="Arial Unicode MS" w:cs="Arial Unicode MS" w:eastAsia="Arial Unicode MS"/>
         </w:rPr>
         <w:t xml:space="preserve">每一个量子云平台都在筑起自己的”黑话高墙”：本源量子采用</w:t>
       </w:r>
@@ -196,7 +219,7 @@
       </w:r>
       <w:r>
         <w:rPr>
-          <w:rFonts w:hint="eastAsia"/>
+          <w:rFonts w:hint="eastAsia" w:ascii="Arial Unicode MS" w:hAnsi="Arial Unicode MS" w:cs="Arial Unicode MS" w:eastAsia="Arial Unicode MS"/>
         </w:rPr>
         <w:t xml:space="preserve">指令集；国盾/天衍采用</w:t>
       </w:r>
@@ -211,7 +234,7 @@
       </w:r>
       <w:r>
         <w:rPr>
-          <w:rFonts w:hint="eastAsia"/>
+          <w:rFonts w:hint="eastAsia" w:ascii="Arial Unicode MS" w:hAnsi="Arial Unicode MS" w:cs="Arial Unicode MS" w:eastAsia="Arial Unicode MS"/>
         </w:rPr>
         <w:t xml:space="preserve">；量旋科技、AWS</w:t>
       </w:r>
@@ -220,7 +243,7 @@
       </w:r>
       <w:r>
         <w:rPr>
-          <w:rFonts w:hint="eastAsia"/>
+          <w:rFonts w:hint="eastAsia" w:ascii="Arial Unicode MS" w:hAnsi="Arial Unicode MS" w:cs="Arial Unicode MS" w:eastAsia="Arial Unicode MS"/>
         </w:rPr>
         <w:t xml:space="preserve">等又各有其专属的</w:t>
       </w:r>
@@ -229,7 +252,7 @@
       </w:r>
       <w:r>
         <w:rPr>
-          <w:rFonts w:hint="eastAsia"/>
+          <w:rFonts w:hint="eastAsia" w:ascii="Arial Unicode MS" w:hAnsi="Arial Unicode MS" w:cs="Arial Unicode MS" w:eastAsia="Arial Unicode MS"/>
         </w:rPr>
         <w:t xml:space="preserve">和底层方言。这导致大量有独特问题意识、却无科班硬核背景的群体（尤其是女性及跨界创造者）被默认排除在外。</w:t>
       </w:r>
@@ -240,7 +263,7 @@
       </w:pPr>
       <w:r>
         <w:rPr>
-          <w:rFonts w:hint="eastAsia"/>
+          <w:rFonts w:hint="eastAsia" w:ascii="Arial Unicode MS" w:hAnsi="Arial Unicode MS" w:cs="Arial Unicode MS" w:eastAsia="Arial Unicode MS"/>
           <w:b/>
           <w:bCs/>
         </w:rPr>
@@ -253,13 +276,13 @@
       </w:pPr>
       <w:r>
         <w:rPr>
-          <w:rFonts w:hint="eastAsia"/>
+          <w:rFonts w:hint="eastAsia" w:ascii="Arial Unicode MS" w:hAnsi="Arial Unicode MS" w:cs="Arial Unicode MS" w:eastAsia="Arial Unicode MS"/>
         </w:rPr>
         <w:t xml:space="preserve">本赛题的内核是</w:t>
       </w:r>
       <w:r>
         <w:rPr>
-          <w:rFonts w:hint="eastAsia"/>
+          <w:rFonts w:hint="eastAsia" w:ascii="Arial Unicode MS" w:hAnsi="Arial Unicode MS" w:cs="Arial Unicode MS" w:eastAsia="Arial Unicode MS"/>
           <w:b/>
           <w:bCs/>
         </w:rPr>
@@ -267,13 +290,13 @@
       </w:r>
       <w:r>
         <w:rPr>
-          <w:rFonts w:hint="eastAsia"/>
+          <w:rFonts w:hint="eastAsia" w:ascii="Arial Unicode MS" w:hAnsi="Arial Unicode MS" w:cs="Arial Unicode MS" w:eastAsia="Arial Unicode MS"/>
         </w:rPr>
         <w:t xml:space="preserve">：你需要构建一个开放、统一、人人可接入的</w:t>
       </w:r>
       <w:r>
         <w:rPr>
-          <w:rFonts w:hint="eastAsia"/>
+          <w:rFonts w:hint="eastAsia" w:ascii="Arial Unicode MS" w:hAnsi="Arial Unicode MS" w:cs="Arial Unicode MS" w:eastAsia="Arial Unicode MS"/>
           <w:b/>
           <w:bCs/>
         </w:rPr>
@@ -295,13 +318,13 @@
       </w:r>
       <w:r>
         <w:rPr>
-          <w:rFonts w:hint="eastAsia"/>
+          <w:rFonts w:hint="eastAsia" w:ascii="Arial Unicode MS" w:hAnsi="Arial Unicode MS" w:cs="Arial Unicode MS" w:eastAsia="Arial Unicode MS"/>
         </w:rPr>
         <w:t xml:space="preserve">，并为其配备一个</w:t>
       </w:r>
       <w:r>
         <w:rPr>
-          <w:rFonts w:hint="eastAsia"/>
+          <w:rFonts w:hint="eastAsia" w:ascii="Arial Unicode MS" w:hAnsi="Arial Unicode MS" w:cs="Arial Unicode MS" w:eastAsia="Arial Unicode MS"/>
           <w:b/>
           <w:bCs/>
         </w:rPr>
@@ -309,7 +332,7 @@
       </w:r>
       <w:r>
         <w:rPr>
-          <w:rFonts w:hint="eastAsia"/>
+          <w:rFonts w:hint="eastAsia" w:ascii="Arial Unicode MS" w:hAnsi="Arial Unicode MS" w:cs="Arial Unicode MS" w:eastAsia="Arial Unicode MS"/>
           <w:b/>
           <w:bCs/>
         </w:rPr>
@@ -324,7 +347,7 @@
       </w:r>
       <w:r>
         <w:rPr>
-          <w:rFonts w:hint="eastAsia"/>
+          <w:rFonts w:hint="eastAsia" w:ascii="Arial Unicode MS" w:hAnsi="Arial Unicode MS" w:cs="Arial Unicode MS" w:eastAsia="Arial Unicode MS"/>
         </w:rPr>
         <w:t xml:space="preserve">。让任何人都能用直觉与自然语言驱动真实的量子计算机。</w:t>
       </w:r>
@@ -335,7 +358,7 @@
       </w:pPr>
       <w:r>
         <w:rPr>
-          <w:rFonts w:hint="eastAsia"/>
+          <w:rFonts w:hint="eastAsia" w:ascii="Arial Unicode MS" w:hAnsi="Arial Unicode MS" w:cs="Arial Unicode MS" w:eastAsia="Arial Unicode MS"/>
         </w:rPr>
         <w:t xml:space="preserve">你要回答的终极问题是：</w:t>
       </w:r>
@@ -350,7 +373,7 @@
       </w:r>
       <w:r>
         <w:rPr>
-          <w:rFonts w:hint="eastAsia"/>
+          <w:rFonts w:hint="eastAsia" w:ascii="Arial Unicode MS" w:hAnsi="Arial Unicode MS" w:cs="Arial Unicode MS" w:eastAsia="Arial Unicode MS"/>
           <w:b/>
           <w:bCs/>
         </w:rPr>
@@ -372,7 +395,7 @@
       </w:pPr>
       <w:r>
         <w:rPr>
-          <w:rFonts w:hint="eastAsia"/>
+          <w:rFonts w:hint="eastAsia" w:ascii="Arial Unicode MS" w:hAnsi="Arial Unicode MS" w:cs="Arial Unicode MS" w:eastAsia="Arial Unicode MS"/>
         </w:rPr>
         <w:t xml:space="preserve">二、系统架构流转</w:t>
       </w:r>
@@ -386,7 +409,7 @@
       </w:pPr>
       <w:r>
         <w:rPr>
-          <w:rFonts w:hint="eastAsia"/>
+          <w:rFonts w:hint="eastAsia" w:ascii="Arial Unicode MS" w:hAnsi="Arial Unicode MS" w:cs="Arial Unicode MS" w:eastAsia="Arial Unicode MS"/>
         </w:rPr>
         <w:t xml:space="preserve">下图展示了</w:t>
       </w:r>
@@ -395,7 +418,7 @@
       </w:r>
       <w:r>
         <w:rPr>
-          <w:rFonts w:hint="eastAsia"/>
+          <w:rFonts w:hint="eastAsia" w:ascii="Arial Unicode MS" w:hAnsi="Arial Unicode MS" w:cs="Arial Unicode MS" w:eastAsia="Arial Unicode MS"/>
         </w:rPr>
         <w:t xml:space="preserve">系统的完整数据与控制流：</w:t>
       </w:r>
@@ -407,8 +430,22 @@
       <w:r>
         <w:rPr>
           <w:rStyle w:val="VerbatimChar"/>
-        </w:rPr>
-        <w:t xml:space="preserve">graph TD</w:t>
+          <w:rFonts w:hint="eastAsia" w:ascii="Arial Unicode MS" w:hAnsi="Arial Unicode MS" w:cs="Arial Unicode MS" w:eastAsia="Arial Unicode MS"/>
+        </w:rPr>
+        <w:t xml:space="preserve">用户自然语言</w:t>
+      </w:r>
+      <w:r>
+        <w:rPr>
+          <w:rStyle w:val="VerbatimChar"/>
+        </w:rPr>
+        <w:t xml:space="preserve"> / </w:t>
+      </w:r>
+      <w:r>
+        <w:rPr>
+          <w:rStyle w:val="VerbatimChar"/>
+          <w:rFonts w:hint="eastAsia" w:ascii="Arial Unicode MS" w:hAnsi="Arial Unicode MS" w:cs="Arial Unicode MS" w:eastAsia="Arial Unicode MS"/>
+        </w:rPr>
+        <w:t xml:space="preserve">意图</w:t>
       </w:r>
       <w:r>
         <w:br/>
@@ -417,14 +454,102 @@
         <w:rPr>
           <w:rStyle w:val="VerbatimChar"/>
         </w:rPr>
-        <w:t xml:space="preserve">    </w:t>
-      </w:r>
-      <w:r>
-        <w:rPr>
-          <w:rStyle w:val="VerbatimChar"/>
-          <w:rFonts w:hint="eastAsia"/>
-        </w:rPr>
-        <w:t xml:space="preserve">A[用户自然语言</w:t>
+        <w:t xml:space="preserve">    ↓  </w:t>
+      </w:r>
+      <w:r>
+        <w:rPr>
+          <w:rStyle w:val="VerbatimChar"/>
+          <w:rFonts w:hint="eastAsia" w:ascii="Arial Unicode MS" w:hAnsi="Arial Unicode MS" w:cs="Arial Unicode MS" w:eastAsia="Arial Unicode MS"/>
+        </w:rPr>
+        <w:t xml:space="preserve">L2：智能体解析与纠错</w:t>
+      </w:r>
+      <w:r>
+        <w:br/>
+      </w:r>
+      <w:r>
+        <w:rPr>
+          <w:rStyle w:val="VerbatimChar"/>
+          <w:rFonts w:hint="eastAsia" w:ascii="Arial Unicode MS" w:hAnsi="Arial Unicode MS" w:cs="Arial Unicode MS" w:eastAsia="Arial Unicode MS"/>
+        </w:rPr>
+        <w:t xml:space="preserve">标准</w:t>
+      </w:r>
+      <w:r>
+        <w:rPr>
+          <w:rStyle w:val="VerbatimChar"/>
+        </w:rPr>
+        <w:t xml:space="preserve"> OpenQASM 2.0 </w:t>
+      </w:r>
+      <w:r>
+        <w:rPr>
+          <w:rStyle w:val="VerbatimChar"/>
+          <w:rFonts w:hint="eastAsia" w:ascii="Arial Unicode MS" w:hAnsi="Arial Unicode MS" w:cs="Arial Unicode MS" w:eastAsia="Arial Unicode MS"/>
+        </w:rPr>
+        <w:t xml:space="preserve">电路</w:t>
+      </w:r>
+      <w:r>
+        <w:br/>
+      </w:r>
+      <w:r>
+        <w:rPr>
+          <w:rStyle w:val="VerbatimChar"/>
+        </w:rPr>
+        <w:t xml:space="preserve">    ↓  </w:t>
+      </w:r>
+      <w:r>
+        <w:rPr>
+          <w:rStyle w:val="VerbatimChar"/>
+          <w:rFonts w:hint="eastAsia" w:ascii="Arial Unicode MS" w:hAnsi="Arial Unicode MS" w:cs="Arial Unicode MS" w:eastAsia="Arial Unicode MS"/>
+        </w:rPr>
+        <w:t xml:space="preserve">L1：统一中间层</w:t>
+      </w:r>
+      <w:r>
+        <w:rPr>
+          <w:rStyle w:val="VerbatimChar"/>
+        </w:rPr>
+        <w:t xml:space="preserve"> Transpiler · </w:t>
+      </w:r>
+      <w:r>
+        <w:rPr>
+          <w:rStyle w:val="VerbatimChar"/>
+          <w:rFonts w:hint="eastAsia" w:ascii="Arial Unicode MS" w:hAnsi="Arial Unicode MS" w:cs="Arial Unicode MS" w:eastAsia="Arial Unicode MS"/>
+        </w:rPr>
+        <w:t xml:space="preserve">转译路由</w:t>
+      </w:r>
+      <w:r>
+        <w:br/>
+      </w:r>
+      <w:r>
+        <w:rPr>
+          <w:rStyle w:val="VerbatimChar"/>
+          <w:rFonts w:hint="eastAsia" w:ascii="Arial Unicode MS" w:hAnsi="Arial Unicode MS" w:cs="Arial Unicode MS" w:eastAsia="Arial Unicode MS"/>
+        </w:rPr>
+        <w:t xml:space="preserve">量旋</w:t>
+      </w:r>
+      <w:r>
+        <w:rPr>
+          <w:rStyle w:val="VerbatimChar"/>
+        </w:rPr>
+        <w:t xml:space="preserve"> </w:t>
+      </w:r>
+      <w:r>
+        <w:rPr>
+          <w:rStyle w:val="VerbatimChar"/>
+          <w:rFonts w:hint="eastAsia" w:ascii="Arial Unicode MS" w:hAnsi="Arial Unicode MS" w:cs="Arial Unicode MS" w:eastAsia="Arial Unicode MS"/>
+        </w:rPr>
+        <w:t xml:space="preserve">SpinQit（Taurus</w:t>
+      </w:r>
+      <w:r>
+        <w:rPr>
+          <w:rStyle w:val="VerbatimChar"/>
+        </w:rPr>
+        <w:t xml:space="preserve"> </w:t>
+      </w:r>
+      <w:r>
+        <w:rPr>
+          <w:rStyle w:val="VerbatimChar"/>
+          <w:rFonts w:hint="eastAsia" w:ascii="Arial Unicode MS" w:hAnsi="Arial Unicode MS" w:cs="Arial Unicode MS" w:eastAsia="Arial Unicode MS"/>
+        </w:rPr>
+        <w:t xml:space="preserve">模拟器</w:t>
       </w:r>
       <w:r>
         <w:rPr>
@@ -435,48 +560,9 @@
       <w:r>
         <w:rPr>
           <w:rStyle w:val="VerbatimChar"/>
-          <w:rFonts w:hint="eastAsia"/>
-        </w:rPr>
-        <w:t xml:space="preserve">意图]</w:t>
-      </w:r>
-      <w:r>
-        <w:rPr>
-          <w:rStyle w:val="VerbatimChar"/>
-        </w:rPr>
-        <w:t xml:space="preserve"> --&gt;|L2: </w:t>
-      </w:r>
-      <w:r>
-        <w:rPr>
-          <w:rStyle w:val="VerbatimChar"/>
-          <w:rFonts w:hint="eastAsia"/>
-        </w:rPr>
-        <w:t xml:space="preserve">智能体解析与纠错|</w:t>
-      </w:r>
-      <w:r>
-        <w:rPr>
-          <w:rStyle w:val="VerbatimChar"/>
-        </w:rPr>
-        <w:t xml:space="preserve"> </w:t>
-      </w:r>
-      <w:r>
-        <w:rPr>
-          <w:rStyle w:val="VerbatimChar"/>
-          <w:rFonts w:hint="eastAsia"/>
-        </w:rPr>
-        <w:t xml:space="preserve">B(标准</w:t>
-      </w:r>
-      <w:r>
-        <w:rPr>
-          <w:rStyle w:val="VerbatimChar"/>
-        </w:rPr>
-        <w:t xml:space="preserve"> OpenQASM 2.0 </w:t>
-      </w:r>
-      <w:r>
-        <w:rPr>
-          <w:rStyle w:val="VerbatimChar"/>
-          <w:rFonts w:hint="eastAsia"/>
-        </w:rPr>
-        <w:t xml:space="preserve">电路)</w:t>
+          <w:rFonts w:hint="eastAsia" w:ascii="Arial Unicode MS" w:hAnsi="Arial Unicode MS" w:cs="Arial Unicode MS" w:eastAsia="Arial Unicode MS"/>
+        </w:rPr>
+        <w:t xml:space="preserve">超导真机）</w:t>
       </w:r>
       <w:r>
         <w:br/>
@@ -484,28 +570,35 @@
       <w:r>
         <w:rPr>
           <w:rStyle w:val="VerbatimChar"/>
-        </w:rPr>
-        <w:t xml:space="preserve">    B --&gt;|L1: </w:t>
-      </w:r>
-      <w:r>
-        <w:rPr>
-          <w:rStyle w:val="VerbatimChar"/>
-          <w:rFonts w:hint="eastAsia"/>
-        </w:rPr>
-        <w:t xml:space="preserve">统一中间层</w:t>
-      </w:r>
-      <w:r>
-        <w:rPr>
-          <w:rStyle w:val="VerbatimChar"/>
-        </w:rPr>
-        <w:t xml:space="preserve"> Transpiler| </w:t>
-      </w:r>
-      <w:r>
-        <w:rPr>
-          <w:rStyle w:val="VerbatimChar"/>
-          <w:rFonts w:hint="eastAsia"/>
-        </w:rPr>
-        <w:t xml:space="preserve">C{转译路由}</w:t>
+          <w:rFonts w:hint="eastAsia" w:ascii="Arial Unicode MS" w:hAnsi="Arial Unicode MS" w:cs="Arial Unicode MS" w:eastAsia="Arial Unicode MS"/>
+        </w:rPr>
+        <w:t xml:space="preserve">本源</w:t>
+      </w:r>
+      <w:r>
+        <w:rPr>
+          <w:rStyle w:val="VerbatimChar"/>
+        </w:rPr>
+        <w:t xml:space="preserve"> </w:t>
+      </w:r>
+      <w:r>
+        <w:rPr>
+          <w:rStyle w:val="VerbatimChar"/>
+          <w:rFonts w:hint="eastAsia" w:ascii="Arial Unicode MS" w:hAnsi="Arial Unicode MS" w:cs="Arial Unicode MS" w:eastAsia="Arial Unicode MS"/>
+        </w:rPr>
+        <w:t xml:space="preserve">OriginIR（本地模拟器</w:t>
+      </w:r>
+      <w:r>
+        <w:rPr>
+          <w:rStyle w:val="VerbatimChar"/>
+        </w:rPr>
+        <w:t xml:space="preserve"> / </w:t>
+      </w:r>
+      <w:r>
+        <w:rPr>
+          <w:rStyle w:val="VerbatimChar"/>
+          <w:rFonts w:hint="eastAsia" w:ascii="Arial Unicode MS" w:hAnsi="Arial Unicode MS" w:cs="Arial Unicode MS" w:eastAsia="Arial Unicode MS"/>
+        </w:rPr>
+        <w:t xml:space="preserve">悟空真机）</w:t>
       </w:r>
       <w:r>
         <w:br/>
@@ -514,27 +607,27 @@
         <w:rPr>
           <w:rStyle w:val="VerbatimChar"/>
         </w:rPr>
-        <w:t xml:space="preserve">    C --&gt;|Target: spinq| </w:t>
-      </w:r>
-      <w:r>
-        <w:rPr>
-          <w:rStyle w:val="VerbatimChar"/>
-          <w:rFonts w:hint="eastAsia"/>
-        </w:rPr>
-        <w:t xml:space="preserve">D[量旋</w:t>
-      </w:r>
-      <w:r>
-        <w:rPr>
-          <w:rStyle w:val="VerbatimChar"/>
-        </w:rPr>
-        <w:t xml:space="preserve"> SpinQit / Taurus </w:t>
-      </w:r>
-      <w:r>
-        <w:rPr>
-          <w:rStyle w:val="VerbatimChar"/>
-          <w:rFonts w:hint="eastAsia"/>
-        </w:rPr>
-        <w:t xml:space="preserve">格式]</w:t>
+        <w:t xml:space="preserve">AWS </w:t>
+      </w:r>
+      <w:r>
+        <w:rPr>
+          <w:rStyle w:val="VerbatimChar"/>
+          <w:rFonts w:hint="eastAsia" w:ascii="Arial Unicode MS" w:hAnsi="Arial Unicode MS" w:cs="Arial Unicode MS" w:eastAsia="Arial Unicode MS"/>
+        </w:rPr>
+        <w:t xml:space="preserve">Braket（LocalSimulator</w:t>
+      </w:r>
+      <w:r>
+        <w:rPr>
+          <w:rStyle w:val="VerbatimChar"/>
+        </w:rPr>
+        <w:t xml:space="preserve"> / </w:t>
+      </w:r>
+      <w:r>
+        <w:rPr>
+          <w:rStyle w:val="VerbatimChar"/>
+          <w:rFonts w:hint="eastAsia" w:ascii="Arial Unicode MS" w:hAnsi="Arial Unicode MS" w:cs="Arial Unicode MS" w:eastAsia="Arial Unicode MS"/>
+        </w:rPr>
+        <w:t xml:space="preserve">云端）</w:t>
       </w:r>
       <w:r>
         <w:br/>
@@ -543,27 +636,14 @@
         <w:rPr>
           <w:rStyle w:val="VerbatimChar"/>
         </w:rPr>
-        <w:t xml:space="preserve">    C --&gt;|Target: originq| </w:t>
-      </w:r>
-      <w:r>
-        <w:rPr>
-          <w:rStyle w:val="VerbatimChar"/>
-          <w:rFonts w:hint="eastAsia"/>
-        </w:rPr>
-        <w:t xml:space="preserve">E[本源</w:t>
-      </w:r>
-      <w:r>
-        <w:rPr>
-          <w:rStyle w:val="VerbatimChar"/>
-        </w:rPr>
-        <w:t xml:space="preserve"> OriginIR / QPanda </w:t>
-      </w:r>
-      <w:r>
-        <w:rPr>
-          <w:rStyle w:val="VerbatimChar"/>
-          <w:rFonts w:hint="eastAsia"/>
-        </w:rPr>
-        <w:t xml:space="preserve">格式]</w:t>
+        <w:t xml:space="preserve">    ↓  </w:t>
+      </w:r>
+      <w:r>
+        <w:rPr>
+          <w:rStyle w:val="VerbatimChar"/>
+          <w:rFonts w:hint="eastAsia" w:ascii="Arial Unicode MS" w:hAnsi="Arial Unicode MS" w:cs="Arial Unicode MS" w:eastAsia="Arial Unicode MS"/>
+        </w:rPr>
+        <w:t xml:space="preserve">结果标准规范化</w:t>
       </w:r>
       <w:r>
         <w:br/>
@@ -571,15 +651,22 @@
       <w:r>
         <w:rPr>
           <w:rStyle w:val="VerbatimChar"/>
-        </w:rPr>
-        <w:t xml:space="preserve">    C --&gt;|Target: braket| F[AWS Braket OpenQASM 3.0 / SDK </w:t>
-      </w:r>
-      <w:r>
-        <w:rPr>
-          <w:rStyle w:val="VerbatimChar"/>
-          <w:rFonts w:hint="eastAsia"/>
-        </w:rPr>
-        <w:t xml:space="preserve">格式]</w:t>
+          <w:rFonts w:hint="eastAsia" w:ascii="Arial Unicode MS" w:hAnsi="Arial Unicode MS" w:cs="Arial Unicode MS" w:eastAsia="Arial Unicode MS"/>
+        </w:rPr>
+        <w:t xml:space="preserve">统一</w:t>
+      </w:r>
+      <w:r>
+        <w:rPr>
+          <w:rStyle w:val="VerbatimChar"/>
+        </w:rPr>
+        <w:t xml:space="preserve"> JSON Schema </w:t>
+      </w:r>
+      <w:r>
+        <w:rPr>
+          <w:rStyle w:val="VerbatimChar"/>
+          <w:rFonts w:hint="eastAsia" w:ascii="Arial Unicode MS" w:hAnsi="Arial Unicode MS" w:cs="Arial Unicode MS" w:eastAsia="Arial Unicode MS"/>
+        </w:rPr>
+        <w:t xml:space="preserve">结果</w:t>
       </w:r>
       <w:r>
         <w:br/>
@@ -590,220 +677,48 @@
       <w:r>
         <w:rPr>
           <w:rStyle w:val="VerbatimChar"/>
-        </w:rPr>
-        <w:t xml:space="preserve">    D </w:t>
-      </w:r>
-      <w:r>
-        <w:rPr>
-          <w:rStyle w:val="VerbatimChar"/>
-          <w:rFonts w:hint="eastAsia"/>
-        </w:rPr>
-        <w:t xml:space="preserve">--&gt;|运行|</w:t>
-      </w:r>
-      <w:r>
-        <w:rPr>
-          <w:rStyle w:val="VerbatimChar"/>
-        </w:rPr>
-        <w:t xml:space="preserve"> </w:t>
-      </w:r>
-      <w:r>
-        <w:rPr>
-          <w:rStyle w:val="VerbatimChar"/>
-          <w:rFonts w:hint="eastAsia"/>
-        </w:rPr>
-        <w:t xml:space="preserve">G[量旋超导真机/模拟器]</w:t>
-      </w:r>
-      <w:r>
-        <w:br/>
-      </w:r>
-      <w:r>
-        <w:rPr>
-          <w:rStyle w:val="VerbatimChar"/>
-        </w:rPr>
-        <w:t xml:space="preserve">    E </w:t>
-      </w:r>
-      <w:r>
-        <w:rPr>
-          <w:rStyle w:val="VerbatimChar"/>
-          <w:rFonts w:hint="eastAsia"/>
-        </w:rPr>
-        <w:t xml:space="preserve">--&gt;|运行|</w:t>
-      </w:r>
-      <w:r>
-        <w:rPr>
-          <w:rStyle w:val="VerbatimChar"/>
-        </w:rPr>
-        <w:t xml:space="preserve"> </w:t>
-      </w:r>
-      <w:r>
-        <w:rPr>
-          <w:rStyle w:val="VerbatimChar"/>
-          <w:rFonts w:hint="eastAsia"/>
-        </w:rPr>
-        <w:t xml:space="preserve">H[本源悟空真机/模拟器]</w:t>
-      </w:r>
-      <w:r>
-        <w:br/>
-      </w:r>
-      <w:r>
-        <w:rPr>
-          <w:rStyle w:val="VerbatimChar"/>
-        </w:rPr>
-        <w:t xml:space="preserve">    F </w:t>
-      </w:r>
-      <w:r>
-        <w:rPr>
-          <w:rStyle w:val="VerbatimChar"/>
-          <w:rFonts w:hint="eastAsia"/>
-        </w:rPr>
-        <w:t xml:space="preserve">--&gt;|运行|</w:t>
-      </w:r>
-      <w:r>
-        <w:rPr>
-          <w:rStyle w:val="VerbatimChar"/>
-        </w:rPr>
-        <w:t xml:space="preserve"> I[AWS Braket </w:t>
-      </w:r>
-      <w:r>
-        <w:rPr>
-          <w:rStyle w:val="VerbatimChar"/>
-          <w:rFonts w:hint="eastAsia"/>
-        </w:rPr>
-        <w:t xml:space="preserve">模拟器/云端真机]</w:t>
-      </w:r>
-      <w:r>
-        <w:br/>
-      </w:r>
-      <w:r>
-        <w:br/>
-      </w:r>
-      <w:r>
-        <w:rPr>
-          <w:rStyle w:val="VerbatimChar"/>
-        </w:rPr>
-        <w:t xml:space="preserve">    G </w:t>
-      </w:r>
-      <w:r>
-        <w:rPr>
-          <w:rStyle w:val="VerbatimChar"/>
-          <w:rFonts w:hint="eastAsia"/>
-        </w:rPr>
-        <w:t xml:space="preserve">--&gt;|结果标准规范化|</w:t>
-      </w:r>
-      <w:r>
-        <w:rPr>
-          <w:rStyle w:val="VerbatimChar"/>
-        </w:rPr>
-        <w:t xml:space="preserve"> </w:t>
-      </w:r>
-      <w:r>
-        <w:rPr>
-          <w:rStyle w:val="VerbatimChar"/>
-          <w:rFonts w:hint="eastAsia"/>
-        </w:rPr>
-        <w:t xml:space="preserve">J[统一</w:t>
-      </w:r>
-      <w:r>
-        <w:rPr>
-          <w:rStyle w:val="VerbatimChar"/>
-        </w:rPr>
-        <w:t xml:space="preserve"> JSON Schema </w:t>
-      </w:r>
-      <w:r>
-        <w:rPr>
-          <w:rStyle w:val="VerbatimChar"/>
-          <w:rFonts w:hint="eastAsia"/>
-        </w:rPr>
-        <w:t xml:space="preserve">结果]</w:t>
-      </w:r>
-      <w:r>
-        <w:br/>
-      </w:r>
-      <w:r>
-        <w:rPr>
-          <w:rStyle w:val="VerbatimChar"/>
-        </w:rPr>
-        <w:t xml:space="preserve">    H </w:t>
-      </w:r>
-      <w:r>
-        <w:rPr>
-          <w:rStyle w:val="VerbatimChar"/>
-          <w:rFonts w:hint="eastAsia"/>
-        </w:rPr>
-        <w:t xml:space="preserve">--&gt;|结果标准规范化|</w:t>
-      </w:r>
-      <w:r>
-        <w:rPr>
-          <w:rStyle w:val="VerbatimChar"/>
-        </w:rPr>
-        <w:t xml:space="preserve"> J</w:t>
-      </w:r>
-      <w:r>
-        <w:br/>
-      </w:r>
-      <w:r>
-        <w:rPr>
-          <w:rStyle w:val="VerbatimChar"/>
-        </w:rPr>
-        <w:t xml:space="preserve">    I </w:t>
-      </w:r>
-      <w:r>
-        <w:rPr>
-          <w:rStyle w:val="VerbatimChar"/>
-          <w:rFonts w:hint="eastAsia"/>
-        </w:rPr>
-        <w:t xml:space="preserve">--&gt;|结果标准规范化|</w:t>
-      </w:r>
-      <w:r>
-        <w:rPr>
-          <w:rStyle w:val="VerbatimChar"/>
-        </w:rPr>
-        <w:t xml:space="preserve"> J</w:t>
-      </w:r>
-      <w:r>
-        <w:br/>
-      </w:r>
-      <w:r>
-        <w:br/>
-      </w:r>
-      <w:r>
-        <w:rPr>
-          <w:rStyle w:val="VerbatimChar"/>
-        </w:rPr>
-        <w:t xml:space="preserve">    K[L3: </w:t>
-      </w:r>
-      <w:r>
-        <w:rPr>
-          <w:rStyle w:val="VerbatimChar"/>
-          <w:rFonts w:hint="eastAsia"/>
-        </w:rPr>
-        <w:t xml:space="preserve">混合编程]</w:t>
-      </w:r>
-      <w:r>
-        <w:rPr>
-          <w:rStyle w:val="VerbatimChar"/>
-        </w:rPr>
-        <w:t xml:space="preserve"> -.-&gt;|Hybrid-QASM </w:t>
-      </w:r>
-      <w:r>
-        <w:rPr>
-          <w:rStyle w:val="VerbatimChar"/>
-          <w:rFonts w:hint="eastAsia"/>
-        </w:rPr>
-        <w:t xml:space="preserve">经典控制块|</w:t>
-      </w:r>
-      <w:r>
-        <w:rPr>
-          <w:rStyle w:val="VerbatimChar"/>
-        </w:rPr>
-        <w:t xml:space="preserve"> L[RISC-V </w:t>
-      </w:r>
-      <w:r>
-        <w:rPr>
-          <w:rStyle w:val="VerbatimChar"/>
-          <w:rFonts w:hint="eastAsia"/>
-        </w:rPr>
-        <w:t xml:space="preserve">编译与经典控制流执行]</w:t>
+          <w:rFonts w:hint="eastAsia" w:ascii="Arial Unicode MS" w:hAnsi="Arial Unicode MS" w:cs="Arial Unicode MS" w:eastAsia="Arial Unicode MS"/>
+        </w:rPr>
+        <w:t xml:space="preserve">侧线挑战：L3</w:t>
+      </w:r>
+      <w:r>
+        <w:rPr>
+          <w:rStyle w:val="VerbatimChar"/>
+        </w:rPr>
+        <w:t xml:space="preserve"> </w:t>
+      </w:r>
+      <w:r>
+        <w:rPr>
+          <w:rStyle w:val="VerbatimChar"/>
+          <w:rFonts w:hint="eastAsia" w:ascii="Arial Unicode MS" w:hAnsi="Arial Unicode MS" w:cs="Arial Unicode MS" w:eastAsia="Arial Unicode MS"/>
+        </w:rPr>
+        <w:t xml:space="preserve">混合编程</w:t>
+      </w:r>
+      <w:r>
+        <w:rPr>
+          <w:rStyle w:val="VerbatimChar"/>
+        </w:rPr>
+        <w:t xml:space="preserve"> —— Hybrid-QASM </w:t>
+      </w:r>
+      <w:r>
+        <w:rPr>
+          <w:rStyle w:val="VerbatimChar"/>
+          <w:rFonts w:hint="eastAsia" w:ascii="Arial Unicode MS" w:hAnsi="Arial Unicode MS" w:cs="Arial Unicode MS" w:eastAsia="Arial Unicode MS"/>
+        </w:rPr>
+        <w:t xml:space="preserve">经典控制块</w:t>
+      </w:r>
+      <w:r>
+        <w:rPr>
+          <w:rStyle w:val="VerbatimChar"/>
+        </w:rPr>
+        <w:t xml:space="preserve"> → RISC-V </w:t>
+      </w:r>
+      <w:r>
+        <w:rPr>
+          <w:rStyle w:val="VerbatimChar"/>
+          <w:rFonts w:hint="eastAsia" w:ascii="Arial Unicode MS" w:hAnsi="Arial Unicode MS" w:cs="Arial Unicode MS" w:eastAsia="Arial Unicode MS"/>
+        </w:rPr>
+        <w:t xml:space="preserve">编译与经典控制流执行</w:t>
       </w:r>
     </w:p>
     <w:p>
@@ -821,7 +736,7 @@
       </w:pPr>
       <w:r>
         <w:rPr>
-          <w:rFonts w:hint="eastAsia"/>
+          <w:rFonts w:hint="eastAsia" w:ascii="Arial Unicode MS" w:hAnsi="Arial Unicode MS" w:cs="Arial Unicode MS" w:eastAsia="Arial Unicode MS"/>
         </w:rPr>
         <w:t xml:space="preserve">三、任务设计</w:t>
       </w:r>
@@ -835,7 +750,7 @@
       </w:pPr>
       <w:r>
         <w:rPr>
-          <w:rFonts w:hint="eastAsia"/>
+          <w:rFonts w:hint="eastAsia" w:ascii="Arial Unicode MS" w:hAnsi="Arial Unicode MS" w:cs="Arial Unicode MS" w:eastAsia="Arial Unicode MS"/>
         </w:rPr>
         <w:t xml:space="preserve">本题设计了三个递进的</w:t>
       </w:r>
@@ -844,13 +759,13 @@
       </w:r>
       <w:r>
         <w:rPr>
-          <w:rFonts w:hint="eastAsia"/>
+          <w:rFonts w:hint="eastAsia" w:ascii="Arial Unicode MS" w:hAnsi="Arial Unicode MS" w:cs="Arial Unicode MS" w:eastAsia="Arial Unicode MS"/>
         </w:rPr>
         <w:t xml:space="preserve">Level，选手不需要全部做完，</w:t>
       </w:r>
       <w:r>
         <w:rPr>
-          <w:rFonts w:hint="eastAsia"/>
+          <w:rFonts w:hint="eastAsia" w:ascii="Arial Unicode MS" w:hAnsi="Arial Unicode MS" w:cs="Arial Unicode MS" w:eastAsia="Arial Unicode MS"/>
           <w:b/>
           <w:bCs/>
         </w:rPr>
@@ -865,7 +780,7 @@
       </w:r>
       <w:r>
         <w:rPr>
-          <w:rFonts w:hint="eastAsia"/>
+          <w:rFonts w:hint="eastAsia" w:ascii="Arial Unicode MS" w:hAnsi="Arial Unicode MS" w:cs="Arial Unicode MS" w:eastAsia="Arial Unicode MS"/>
           <w:b/>
           <w:bCs/>
         </w:rPr>
@@ -873,7 +788,7 @@
       </w:r>
       <w:r>
         <w:rPr>
-          <w:rFonts w:hint="eastAsia"/>
+          <w:rFonts w:hint="eastAsia" w:ascii="Arial Unicode MS" w:hAnsi="Arial Unicode MS" w:cs="Arial Unicode MS" w:eastAsia="Arial Unicode MS"/>
         </w:rPr>
         <w:t xml:space="preserve">，L2/L3</w:t>
       </w:r>
@@ -882,7 +797,7 @@
       </w:r>
       <w:r>
         <w:rPr>
-          <w:rFonts w:hint="eastAsia"/>
+          <w:rFonts w:hint="eastAsia" w:ascii="Arial Unicode MS" w:hAnsi="Arial Unicode MS" w:cs="Arial Unicode MS" w:eastAsia="Arial Unicode MS"/>
         </w:rPr>
         <w:t xml:space="preserve">为加分和提分空间。</w:t>
       </w:r>
@@ -899,7 +814,7 @@
       </w:r>
       <w:r>
         <w:rPr>
-          <w:rFonts w:hint="eastAsia"/>
+          <w:rFonts w:hint="eastAsia" w:ascii="Arial Unicode MS" w:hAnsi="Arial Unicode MS" w:cs="Arial Unicode MS" w:eastAsia="Arial Unicode MS"/>
           <w:b/>
           <w:bCs/>
         </w:rPr>
@@ -913,7 +828,7 @@
       </w:r>
       <w:r>
         <w:rPr>
-          <w:rFonts w:hint="eastAsia"/>
+          <w:rFonts w:hint="eastAsia" w:ascii="Arial Unicode MS" w:hAnsi="Arial Unicode MS" w:cs="Arial Unicode MS" w:eastAsia="Arial Unicode MS"/>
         </w:rPr>
         <w:t xml:space="preserve">内附《QUANTUM</w:t>
       </w:r>
@@ -922,7 +837,7 @@
       </w:r>
       <w:r>
         <w:rPr>
-          <w:rFonts w:hint="eastAsia"/>
+          <w:rFonts w:hint="eastAsia" w:ascii="Arial Unicode MS" w:hAnsi="Arial Unicode MS" w:cs="Arial Unicode MS" w:eastAsia="Arial Unicode MS"/>
         </w:rPr>
         <w:t xml:space="preserve">分钟速成手册：本题让你造的是”翻译器”，不是让你学物理——手册覆盖解题所需的全部概念，剩下的都是你熟悉的软件工程。</w:t>
       </w:r>
@@ -934,7 +849,7 @@
       </w:pPr>
       <w:r>
         <w:rPr>
-          <w:rFonts w:hint="eastAsia"/>
+          <w:rFonts w:hint="eastAsia" w:ascii="Arial Unicode MS" w:hAnsi="Arial Unicode MS" w:cs="Arial Unicode MS" w:eastAsia="Arial Unicode MS"/>
         </w:rPr>
         <w:t xml:space="preserve">L1｜通用中间层（核心任务，45</w:t>
       </w:r>
@@ -943,7 +858,7 @@
       </w:r>
       <w:r>
         <w:rPr>
-          <w:rFonts w:hint="eastAsia"/>
+          <w:rFonts w:hint="eastAsia" w:ascii="Arial Unicode MS" w:hAnsi="Arial Unicode MS" w:cs="Arial Unicode MS" w:eastAsia="Arial Unicode MS"/>
         </w:rPr>
         <w:t xml:space="preserve">分）</w:t>
       </w:r>
@@ -954,7 +869,7 @@
       </w:pPr>
       <w:r>
         <w:rPr>
-          <w:rFonts w:hint="eastAsia"/>
+          <w:rFonts w:hint="eastAsia" w:ascii="Arial Unicode MS" w:hAnsi="Arial Unicode MS" w:cs="Arial Unicode MS" w:eastAsia="Arial Unicode MS"/>
         </w:rPr>
         <w:t xml:space="preserve">构建转译与执行引擎。输入标准的</w:t>
       </w:r>
@@ -973,7 +888,7 @@
       </w:r>
       <w:r>
         <w:rPr>
-          <w:rFonts w:hint="eastAsia"/>
+          <w:rFonts w:hint="eastAsia" w:ascii="Arial Unicode MS" w:hAnsi="Arial Unicode MS" w:cs="Arial Unicode MS" w:eastAsia="Arial Unicode MS"/>
         </w:rPr>
         <w:t xml:space="preserve">电路，将其正确转译并驱动至以下后端：</w:t>
       </w:r>
@@ -988,7 +903,7 @@
       </w:pPr>
       <w:r>
         <w:rPr>
-          <w:rFonts w:hint="eastAsia"/>
+          <w:rFonts w:hint="eastAsia" w:ascii="Arial Unicode MS" w:hAnsi="Arial Unicode MS" w:cs="Arial Unicode MS" w:eastAsia="Arial Unicode MS"/>
           <w:b/>
           <w:bCs/>
         </w:rPr>
@@ -1003,7 +918,7 @@
       </w:r>
       <w:r>
         <w:rPr>
-          <w:rFonts w:hint="eastAsia"/>
+          <w:rFonts w:hint="eastAsia" w:ascii="Arial Unicode MS" w:hAnsi="Arial Unicode MS" w:cs="Arial Unicode MS" w:eastAsia="Arial Unicode MS"/>
         </w:rPr>
         <w:t xml:space="preserve">：运行于</w:t>
       </w:r>
@@ -1012,7 +927,7 @@
       </w:r>
       <w:r>
         <w:rPr>
-          <w:rFonts w:hint="eastAsia"/>
+          <w:rFonts w:hint="eastAsia" w:ascii="Arial Unicode MS" w:hAnsi="Arial Unicode MS" w:cs="Arial Unicode MS" w:eastAsia="Arial Unicode MS"/>
         </w:rPr>
         <w:t xml:space="preserve">模拟器或超导真机。</w:t>
       </w:r>
@@ -1027,7 +942,7 @@
       </w:pPr>
       <w:r>
         <w:rPr>
-          <w:rFonts w:hint="eastAsia"/>
+          <w:rFonts w:hint="eastAsia" w:ascii="Arial Unicode MS" w:hAnsi="Arial Unicode MS" w:cs="Arial Unicode MS" w:eastAsia="Arial Unicode MS"/>
           <w:b/>
           <w:bCs/>
         </w:rPr>
@@ -1042,7 +957,7 @@
       </w:r>
       <w:r>
         <w:rPr>
-          <w:rFonts w:hint="eastAsia"/>
+          <w:rFonts w:hint="eastAsia" w:ascii="Arial Unicode MS" w:hAnsi="Arial Unicode MS" w:cs="Arial Unicode MS" w:eastAsia="Arial Unicode MS"/>
         </w:rPr>
         <w:t xml:space="preserve">：将</w:t>
       </w:r>
@@ -1051,7 +966,7 @@
       </w:r>
       <w:r>
         <w:rPr>
-          <w:rFonts w:hint="eastAsia"/>
+          <w:rFonts w:hint="eastAsia" w:ascii="Arial Unicode MS" w:hAnsi="Arial Unicode MS" w:cs="Arial Unicode MS" w:eastAsia="Arial Unicode MS"/>
         </w:rPr>
         <w:t xml:space="preserve">翻译为</w:t>
       </w:r>
@@ -1066,7 +981,7 @@
       </w:r>
       <w:r>
         <w:rPr>
-          <w:rFonts w:hint="eastAsia"/>
+          <w:rFonts w:hint="eastAsia" w:ascii="Arial Unicode MS" w:hAnsi="Arial Unicode MS" w:cs="Arial Unicode MS" w:eastAsia="Arial Unicode MS"/>
         </w:rPr>
         <w:t xml:space="preserve">，在本地模拟器或悟空真机运行。</w:t>
       </w:r>
@@ -1088,7 +1003,7 @@
       </w:r>
       <w:r>
         <w:rPr>
-          <w:rFonts w:hint="eastAsia"/>
+          <w:rFonts w:hint="eastAsia" w:ascii="Arial Unicode MS" w:hAnsi="Arial Unicode MS" w:cs="Arial Unicode MS" w:eastAsia="Arial Unicode MS"/>
         </w:rPr>
         <w:t xml:space="preserve">：支持运行于</w:t>
       </w:r>
@@ -1106,7 +1021,7 @@
       </w:r>
       <w:r>
         <w:rPr>
-          <w:rFonts w:hint="eastAsia"/>
+          <w:rFonts w:hint="eastAsia" w:ascii="Arial Unicode MS" w:hAnsi="Arial Unicode MS" w:cs="Arial Unicode MS" w:eastAsia="Arial Unicode MS"/>
         </w:rPr>
         <w:t xml:space="preserve">模拟器（免费、无需海外账号）或</w:t>
       </w:r>
@@ -1115,7 +1030,7 @@
       </w:r>
       <w:r>
         <w:rPr>
-          <w:rFonts w:hint="eastAsia"/>
+          <w:rFonts w:hint="eastAsia" w:ascii="Arial Unicode MS" w:hAnsi="Arial Unicode MS" w:cs="Arial Unicode MS" w:eastAsia="Arial Unicode MS"/>
         </w:rPr>
         <w:t xml:space="preserve">云端。</w:t>
       </w:r>
@@ -1126,7 +1041,7 @@
       </w:pPr>
       <w:r>
         <w:rPr>
-          <w:rFonts w:hint="eastAsia"/>
+          <w:rFonts w:hint="eastAsia" w:ascii="Arial Unicode MS" w:hAnsi="Arial Unicode MS" w:cs="Arial Unicode MS" w:eastAsia="Arial Unicode MS"/>
           <w:b/>
           <w:bCs/>
         </w:rPr>
@@ -1134,7 +1049,7 @@
       </w:r>
       <w:r>
         <w:rPr>
-          <w:rFonts w:hint="eastAsia"/>
+          <w:rFonts w:hint="eastAsia" w:ascii="Arial Unicode MS" w:hAnsi="Arial Unicode MS" w:cs="Arial Unicode MS" w:eastAsia="Arial Unicode MS"/>
         </w:rPr>
         <w:t xml:space="preserve">：全部评测电路——公开、隐藏、评测日变体——只会使用以下</w:t>
       </w:r>
@@ -1150,7 +1065,7 @@
       </w:r>
       <w:r>
         <w:rPr>
-          <w:rFonts w:hint="eastAsia"/>
+          <w:rFonts w:hint="eastAsia" w:ascii="Arial Unicode MS" w:hAnsi="Arial Unicode MS" w:cs="Arial Unicode MS" w:eastAsia="Arial Unicode MS"/>
           <w:b/>
           <w:bCs/>
         </w:rPr>
@@ -1165,7 +1080,7 @@
       </w:r>
       <w:r>
         <w:rPr>
-          <w:rFonts w:hint="eastAsia"/>
+          <w:rFonts w:hint="eastAsia" w:ascii="Arial Unicode MS" w:hAnsi="Arial Unicode MS" w:cs="Arial Unicode MS" w:eastAsia="Arial Unicode MS"/>
           <w:b/>
           <w:bCs/>
         </w:rPr>
@@ -1173,7 +1088,7 @@
       </w:r>
       <w:r>
         <w:rPr>
-          <w:rFonts w:hint="eastAsia"/>
+          <w:rFonts w:hint="eastAsia" w:ascii="Arial Unicode MS" w:hAnsi="Arial Unicode MS" w:cs="Arial Unicode MS" w:eastAsia="Arial Unicode MS"/>
         </w:rPr>
         <w:t xml:space="preserve">，不会出现白名单之外的门：</w:t>
       </w:r>
@@ -1200,7 +1115,7 @@
             </w:pPr>
             <w:r>
               <w:rPr>
-                <w:rFonts w:hint="eastAsia"/>
+                <w:rFonts w:hint="eastAsia" w:ascii="Arial Unicode MS" w:hAnsi="Arial Unicode MS" w:cs="Arial Unicode MS" w:eastAsia="Arial Unicode MS"/>
               </w:rPr>
               <w:t xml:space="preserve">类别</w:t>
             </w:r>
@@ -1214,7 +1129,7 @@
             </w:pPr>
             <w:r>
               <w:rPr>
-                <w:rFonts w:hint="eastAsia"/>
+                <w:rFonts w:hint="eastAsia" w:ascii="Arial Unicode MS" w:hAnsi="Arial Unicode MS" w:cs="Arial Unicode MS" w:eastAsia="Arial Unicode MS"/>
               </w:rPr>
               <w:t xml:space="preserve">门</w:t>
             </w:r>
@@ -1230,7 +1145,7 @@
             </w:pPr>
             <w:r>
               <w:rPr>
-                <w:rFonts w:hint="eastAsia"/>
+                <w:rFonts w:hint="eastAsia" w:ascii="Arial Unicode MS" w:hAnsi="Arial Unicode MS" w:cs="Arial Unicode MS" w:eastAsia="Arial Unicode MS"/>
               </w:rPr>
               <w:t xml:space="preserve">单比特（无参）</w:t>
             </w:r>
@@ -1260,7 +1175,7 @@
             </w:pPr>
             <w:r>
               <w:rPr>
-                <w:rFonts w:hint="eastAsia"/>
+                <w:rFonts w:hint="eastAsia" w:ascii="Arial Unicode MS" w:hAnsi="Arial Unicode MS" w:cs="Arial Unicode MS" w:eastAsia="Arial Unicode MS"/>
               </w:rPr>
               <w:t xml:space="preserve">单比特（含参）</w:t>
             </w:r>
@@ -1290,7 +1205,7 @@
             </w:pPr>
             <w:r>
               <w:rPr>
-                <w:rFonts w:hint="eastAsia"/>
+                <w:rFonts w:hint="eastAsia" w:ascii="Arial Unicode MS" w:hAnsi="Arial Unicode MS" w:cs="Arial Unicode MS" w:eastAsia="Arial Unicode MS"/>
               </w:rPr>
               <w:t xml:space="preserve">两比特</w:t>
             </w:r>
@@ -1320,7 +1235,7 @@
             </w:pPr>
             <w:r>
               <w:rPr>
-                <w:rFonts w:hint="eastAsia"/>
+                <w:rFonts w:hint="eastAsia" w:ascii="Arial Unicode MS" w:hAnsi="Arial Unicode MS" w:cs="Arial Unicode MS" w:eastAsia="Arial Unicode MS"/>
               </w:rPr>
               <w:t xml:space="preserve">三比特</w:t>
             </w:r>
@@ -1348,7 +1263,7 @@
       </w:pPr>
       <w:r>
         <w:rPr>
-          <w:rFonts w:hint="eastAsia"/>
+          <w:rFonts w:hint="eastAsia" w:ascii="Arial Unicode MS" w:hAnsi="Arial Unicode MS" w:cs="Arial Unicode MS" w:eastAsia="Arial Unicode MS"/>
         </w:rPr>
         <w:t xml:space="preserve">逐个确认三家</w:t>
       </w:r>
@@ -1357,7 +1272,7 @@
       </w:r>
       <w:r>
         <w:rPr>
-          <w:rFonts w:hint="eastAsia"/>
+          <w:rFonts w:hint="eastAsia" w:ascii="Arial Unicode MS" w:hAnsi="Arial Unicode MS" w:cs="Arial Unicode MS" w:eastAsia="Arial Unicode MS"/>
         </w:rPr>
         <w:t xml:space="preserve">对这</w:t>
       </w:r>
@@ -1366,7 +1281,7 @@
       </w:r>
       <w:r>
         <w:rPr>
-          <w:rFonts w:hint="eastAsia"/>
+          <w:rFonts w:hint="eastAsia" w:ascii="Arial Unicode MS" w:hAnsi="Arial Unicode MS" w:cs="Arial Unicode MS" w:eastAsia="Arial Unicode MS"/>
         </w:rPr>
         <w:t xml:space="preserve">个门的支持，就是</w:t>
       </w:r>
@@ -1375,7 +1290,7 @@
       </w:r>
       <w:r>
         <w:rPr>
-          <w:rFonts w:hint="eastAsia"/>
+          <w:rFonts w:hint="eastAsia" w:ascii="Arial Unicode MS" w:hAnsi="Arial Unicode MS" w:cs="Arial Unicode MS" w:eastAsia="Arial Unicode MS"/>
         </w:rPr>
         <w:t xml:space="preserve">的完整工作量清单。若某后端不支持个别门，Starter</w:t>
       </w:r>
@@ -1384,7 +1299,7 @@
       </w:r>
       <w:r>
         <w:rPr>
-          <w:rFonts w:hint="eastAsia"/>
+          <w:rFonts w:hint="eastAsia" w:ascii="Arial Unicode MS" w:hAnsi="Arial Unicode MS" w:cs="Arial Unicode MS" w:eastAsia="Arial Unicode MS"/>
         </w:rPr>
         <w:t xml:space="preserve">的</w:t>
       </w:r>
@@ -1402,7 +1317,7 @@
       </w:r>
       <w:r>
         <w:rPr>
-          <w:rFonts w:hint="eastAsia"/>
+          <w:rFonts w:hint="eastAsia" w:ascii="Arial Unicode MS" w:hAnsi="Arial Unicode MS" w:cs="Arial Unicode MS" w:eastAsia="Arial Unicode MS"/>
         </w:rPr>
         <w:t xml:space="preserve">提供可直接照抄的等价分解（已经官方参考模拟器数值验证）。</w:t>
       </w:r>
@@ -1413,7 +1328,7 @@
       </w:pPr>
       <w:r>
         <w:rPr>
-          <w:rFonts w:hint="eastAsia"/>
+          <w:rFonts w:hint="eastAsia" w:ascii="Arial Unicode MS" w:hAnsi="Arial Unicode MS" w:cs="Arial Unicode MS" w:eastAsia="Arial Unicode MS"/>
           <w:b/>
           <w:bCs/>
         </w:rPr>
@@ -1421,7 +1336,7 @@
       </w:r>
       <w:r>
         <w:rPr>
-          <w:rFonts w:hint="eastAsia"/>
+          <w:rFonts w:hint="eastAsia" w:ascii="Arial Unicode MS" w:hAnsi="Arial Unicode MS" w:cs="Arial Unicode MS" w:eastAsia="Arial Unicode MS"/>
         </w:rPr>
         <w:t xml:space="preserve">：同一套中间层在</w:t>
       </w:r>
@@ -1437,7 +1352,7 @@
       </w:r>
       <w:r>
         <w:rPr>
-          <w:rFonts w:hint="eastAsia"/>
+          <w:rFonts w:hint="eastAsia" w:ascii="Arial Unicode MS" w:hAnsi="Arial Unicode MS" w:cs="Arial Unicode MS" w:eastAsia="Arial Unicode MS"/>
           <w:b/>
           <w:bCs/>
         </w:rPr>
@@ -1445,7 +1360,7 @@
       </w:r>
       <w:r>
         <w:rPr>
-          <w:rFonts w:hint="eastAsia"/>
+          <w:rFonts w:hint="eastAsia" w:ascii="Arial Unicode MS" w:hAnsi="Arial Unicode MS" w:cs="Arial Unicode MS" w:eastAsia="Arial Unicode MS"/>
         </w:rPr>
         <w:t xml:space="preserve">跑通全部公开电路。不涉及真机账号与排队，纯本地可完成。</w:t>
       </w:r>
@@ -1454,7 +1369,7 @@
       </w:r>
       <w:r>
         <w:rPr>
-          <w:rFonts w:hint="eastAsia"/>
+          <w:rFonts w:hint="eastAsia" w:ascii="Arial Unicode MS" w:hAnsi="Arial Unicode MS" w:cs="Arial Unicode MS" w:eastAsia="Arial Unicode MS"/>
           <w:b/>
           <w:bCs/>
         </w:rPr>
@@ -1462,7 +1377,7 @@
       </w:r>
       <w:r>
         <w:rPr>
-          <w:rFonts w:hint="eastAsia"/>
+          <w:rFonts w:hint="eastAsia" w:ascii="Arial Unicode MS" w:hAnsi="Arial Unicode MS" w:cs="Arial Unicode MS" w:eastAsia="Arial Unicode MS"/>
         </w:rPr>
         <w:t xml:space="preserve">：三平台统一适配</w:t>
       </w:r>
@@ -1471,7 +1386,7 @@
       </w:r>
       <w:r>
         <w:rPr>
-          <w:rFonts w:hint="eastAsia"/>
+          <w:rFonts w:hint="eastAsia" w:ascii="Arial Unicode MS" w:hAnsi="Arial Unicode MS" w:cs="Arial Unicode MS" w:eastAsia="Arial Unicode MS"/>
         </w:rPr>
         <w:t xml:space="preserve">全部</w:t>
       </w:r>
@@ -1480,7 +1395,7 @@
       </w:r>
       <w:r>
         <w:rPr>
-          <w:rFonts w:hint="eastAsia"/>
+          <w:rFonts w:hint="eastAsia" w:ascii="Arial Unicode MS" w:hAnsi="Arial Unicode MS" w:cs="Arial Unicode MS" w:eastAsia="Arial Unicode MS"/>
         </w:rPr>
         <w:t xml:space="preserve">个电路保真度达标</w:t>
       </w:r>
@@ -1489,7 +1404,7 @@
       </w:r>
       <w:r>
         <w:rPr>
-          <w:rFonts w:hint="eastAsia"/>
+          <w:rFonts w:hint="eastAsia" w:ascii="Arial Unicode MS" w:hAnsi="Arial Unicode MS" w:cs="Arial Unicode MS" w:eastAsia="Arial Unicode MS"/>
         </w:rPr>
         <w:t xml:space="preserve">至少</w:t>
       </w:r>
@@ -1498,7 +1413,7 @@
       </w:r>
       <w:r>
         <w:rPr>
-          <w:rFonts w:hint="eastAsia"/>
+          <w:rFonts w:hint="eastAsia" w:ascii="Arial Unicode MS" w:hAnsi="Arial Unicode MS" w:cs="Arial Unicode MS" w:eastAsia="Arial Unicode MS"/>
         </w:rPr>
         <w:t xml:space="preserve">个平台的真机证据（三套硬编码分支不算”通用”，评委会审查架构）。</w:t>
       </w:r>
@@ -1507,7 +1422,7 @@
       </w:r>
       <w:r>
         <w:rPr>
-          <w:rFonts w:hint="eastAsia"/>
+          <w:rFonts w:hint="eastAsia" w:ascii="Arial Unicode MS" w:hAnsi="Arial Unicode MS" w:cs="Arial Unicode MS" w:eastAsia="Arial Unicode MS"/>
           <w:b/>
           <w:bCs/>
         </w:rPr>
@@ -1515,13 +1430,13 @@
       </w:r>
       <w:r>
         <w:rPr>
-          <w:rFonts w:hint="eastAsia"/>
+          <w:rFonts w:hint="eastAsia" w:ascii="Arial Unicode MS" w:hAnsi="Arial Unicode MS" w:cs="Arial Unicode MS" w:eastAsia="Arial Unicode MS"/>
         </w:rPr>
         <w:t xml:space="preserve">：真机接入是</w:t>
       </w:r>
       <w:r>
         <w:rPr>
-          <w:rFonts w:hint="eastAsia"/>
+          <w:rFonts w:hint="eastAsia" w:ascii="Arial Unicode MS" w:hAnsi="Arial Unicode MS" w:cs="Arial Unicode MS" w:eastAsia="Arial Unicode MS"/>
           <w:b/>
           <w:bCs/>
         </w:rPr>
@@ -1529,7 +1444,7 @@
       </w:r>
       <w:r>
         <w:rPr>
-          <w:rFonts w:hint="eastAsia"/>
+          <w:rFonts w:hint="eastAsia" w:ascii="Arial Unicode MS" w:hAnsi="Arial Unicode MS" w:cs="Arial Unicode MS" w:eastAsia="Arial Unicode MS"/>
         </w:rPr>
         <w:t xml:space="preserve">——排队、审批等外部因素不会把任何队伍挡在评奖之外，但”第一次指挥真实量子计算机”值得你去拿这</w:t>
       </w:r>
@@ -1538,7 +1453,7 @@
       </w:r>
       <w:r>
         <w:rPr>
-          <w:rFonts w:hint="eastAsia"/>
+          <w:rFonts w:hint="eastAsia" w:ascii="Arial Unicode MS" w:hAnsi="Arial Unicode MS" w:cs="Arial Unicode MS" w:eastAsia="Arial Unicode MS"/>
         </w:rPr>
         <w:t xml:space="preserve">分。</w:t>
       </w:r>
@@ -1551,7 +1466,7 @@
       </w:pPr>
       <w:r>
         <w:rPr>
-          <w:rFonts w:hint="eastAsia"/>
+          <w:rFonts w:hint="eastAsia" w:ascii="Arial Unicode MS" w:hAnsi="Arial Unicode MS" w:cs="Arial Unicode MS" w:eastAsia="Arial Unicode MS"/>
         </w:rPr>
         <w:t xml:space="preserve">L2｜说人话的智能体（AI</w:t>
       </w:r>
@@ -1560,7 +1475,7 @@
       </w:r>
       <w:r>
         <w:rPr>
-          <w:rFonts w:hint="eastAsia"/>
+          <w:rFonts w:hint="eastAsia" w:ascii="Arial Unicode MS" w:hAnsi="Arial Unicode MS" w:cs="Arial Unicode MS" w:eastAsia="Arial Unicode MS"/>
         </w:rPr>
         <w:t xml:space="preserve">加分项，30</w:t>
       </w:r>
@@ -1569,7 +1484,7 @@
       </w:r>
       <w:r>
         <w:rPr>
-          <w:rFonts w:hint="eastAsia"/>
+          <w:rFonts w:hint="eastAsia" w:ascii="Arial Unicode MS" w:hAnsi="Arial Unicode MS" w:cs="Arial Unicode MS" w:eastAsia="Arial Unicode MS"/>
         </w:rPr>
         <w:t xml:space="preserve">分）</w:t>
       </w:r>
@@ -1580,7 +1495,7 @@
       </w:pPr>
       <w:r>
         <w:rPr>
-          <w:rFonts w:hint="eastAsia"/>
+          <w:rFonts w:hint="eastAsia" w:ascii="Arial Unicode MS" w:hAnsi="Arial Unicode MS" w:cs="Arial Unicode MS" w:eastAsia="Arial Unicode MS"/>
           <w:b/>
           <w:bCs/>
         </w:rPr>
@@ -1588,7 +1503,7 @@
       </w:r>
       <w:r>
         <w:rPr>
-          <w:rFonts w:hint="eastAsia"/>
+          <w:rFonts w:hint="eastAsia" w:ascii="Arial Unicode MS" w:hAnsi="Arial Unicode MS" w:cs="Arial Unicode MS" w:eastAsia="Arial Unicode MS"/>
         </w:rPr>
         <w:t xml:space="preserve">，是为跨界团队设计的主场：核心是</w:t>
       </w:r>
@@ -1597,7 +1512,7 @@
       </w:r>
       <w:r>
         <w:rPr>
-          <w:rFonts w:hint="eastAsia"/>
+          <w:rFonts w:hint="eastAsia" w:ascii="Arial Unicode MS" w:hAnsi="Arial Unicode MS" w:cs="Arial Unicode MS" w:eastAsia="Arial Unicode MS"/>
         </w:rPr>
         <w:t xml:space="preserve">工程——prompt</w:t>
       </w:r>
@@ -1606,7 +1521,7 @@
       </w:r>
       <w:r>
         <w:rPr>
-          <w:rFonts w:hint="eastAsia"/>
+          <w:rFonts w:hint="eastAsia" w:ascii="Arial Unicode MS" w:hAnsi="Arial Unicode MS" w:cs="Arial Unicode MS" w:eastAsia="Arial Unicode MS"/>
         </w:rPr>
         <w:t xml:space="preserve">设计、工具调用，以及”生成</w:t>
       </w:r>
@@ -1615,7 +1530,7 @@
       </w:r>
       <w:r>
         <w:rPr>
-          <w:rFonts w:hint="eastAsia"/>
+          <w:rFonts w:hint="eastAsia" w:ascii="Arial Unicode MS" w:hAnsi="Arial Unicode MS" w:cs="Arial Unicode MS" w:eastAsia="Arial Unicode MS"/>
         </w:rPr>
         <w:t xml:space="preserve">用自己的</w:t>
       </w:r>
@@ -1624,7 +1539,7 @@
       </w:r>
       <w:r>
         <w:rPr>
-          <w:rFonts w:hint="eastAsia"/>
+          <w:rFonts w:hint="eastAsia" w:ascii="Arial Unicode MS" w:hAnsi="Arial Unicode MS" w:cs="Arial Unicode MS" w:eastAsia="Arial Unicode MS"/>
         </w:rPr>
         <w:t xml:space="preserve">跑一遍自验</w:t>
       </w:r>
@@ -1633,7 +1548,7 @@
       </w:r>
       <w:r>
         <w:rPr>
-          <w:rFonts w:hint="eastAsia"/>
+          <w:rFonts w:hint="eastAsia" w:ascii="Arial Unicode MS" w:hAnsi="Arial Unicode MS" w:cs="Arial Unicode MS" w:eastAsia="Arial Unicode MS"/>
         </w:rPr>
         <w:t xml:space="preserve">不对就重试”的闭环。有</w:t>
       </w:r>
@@ -1642,7 +1557,7 @@
       </w:r>
       <w:r>
         <w:rPr>
-          <w:rFonts w:hint="eastAsia"/>
+          <w:rFonts w:hint="eastAsia" w:ascii="Arial Unicode MS" w:hAnsi="Arial Unicode MS" w:cs="Arial Unicode MS" w:eastAsia="Arial Unicode MS"/>
         </w:rPr>
         <w:t xml:space="preserve">应用经验的产品团队在这一级没有任何劣势。</w:t>
       </w:r>
@@ -1653,7 +1568,7 @@
       </w:pPr>
       <w:r>
         <w:rPr>
-          <w:rFonts w:hint="eastAsia"/>
+          <w:rFonts w:hint="eastAsia" w:ascii="Arial Unicode MS" w:hAnsi="Arial Unicode MS" w:cs="Arial Unicode MS" w:eastAsia="Arial Unicode MS"/>
         </w:rPr>
         <w:t xml:space="preserve">构建辅助前端的</w:t>
       </w:r>
@@ -1662,7 +1577,7 @@
       </w:r>
       <w:r>
         <w:rPr>
-          <w:rFonts w:hint="eastAsia"/>
+          <w:rFonts w:hint="eastAsia" w:ascii="Arial Unicode MS" w:hAnsi="Arial Unicode MS" w:cs="Arial Unicode MS" w:eastAsia="Arial Unicode MS"/>
         </w:rPr>
         <w:t xml:space="preserve">Agent，降低非技术人员的门槛：</w:t>
       </w:r>
@@ -1677,7 +1592,7 @@
       </w:pPr>
       <w:r>
         <w:rPr>
-          <w:rFonts w:hint="eastAsia"/>
+          <w:rFonts w:hint="eastAsia" w:ascii="Arial Unicode MS" w:hAnsi="Arial Unicode MS" w:cs="Arial Unicode MS" w:eastAsia="Arial Unicode MS"/>
           <w:b/>
           <w:bCs/>
         </w:rPr>
@@ -1685,7 +1600,7 @@
       </w:r>
       <w:r>
         <w:rPr>
-          <w:rFonts w:hint="eastAsia"/>
+          <w:rFonts w:hint="eastAsia" w:ascii="Arial Unicode MS" w:hAnsi="Arial Unicode MS" w:cs="Arial Unicode MS" w:eastAsia="Arial Unicode MS"/>
         </w:rPr>
         <w:t xml:space="preserve">：根据意图表述自动写出正确的</w:t>
       </w:r>
@@ -1694,7 +1609,7 @@
       </w:r>
       <w:r>
         <w:rPr>
-          <w:rFonts w:hint="eastAsia"/>
+          <w:rFonts w:hint="eastAsia" w:ascii="Arial Unicode MS" w:hAnsi="Arial Unicode MS" w:cs="Arial Unicode MS" w:eastAsia="Arial Unicode MS"/>
         </w:rPr>
         <w:t xml:space="preserve">代码。</w:t>
       </w:r>
@@ -1709,7 +1624,7 @@
       </w:pPr>
       <w:r>
         <w:rPr>
-          <w:rFonts w:hint="eastAsia"/>
+          <w:rFonts w:hint="eastAsia" w:ascii="Arial Unicode MS" w:hAnsi="Arial Unicode MS" w:cs="Arial Unicode MS" w:eastAsia="Arial Unicode MS"/>
           <w:b/>
           <w:bCs/>
         </w:rPr>
@@ -1717,13 +1632,13 @@
       </w:r>
       <w:r>
         <w:rPr>
-          <w:rFonts w:hint="eastAsia"/>
+          <w:rFonts w:hint="eastAsia" w:ascii="Arial Unicode MS" w:hAnsi="Arial Unicode MS" w:cs="Arial Unicode MS" w:eastAsia="Arial Unicode MS"/>
         </w:rPr>
         <w:t xml:space="preserve">：识别语法/语义错误，在</w:t>
       </w:r>
       <w:r>
         <w:rPr>
-          <w:rFonts w:hint="eastAsia"/>
+          <w:rFonts w:hint="eastAsia" w:ascii="Arial Unicode MS" w:hAnsi="Arial Unicode MS" w:cs="Arial Unicode MS" w:eastAsia="Arial Unicode MS"/>
           <w:b/>
           <w:bCs/>
         </w:rPr>
@@ -1731,7 +1646,7 @@
       </w:r>
       <w:r>
         <w:rPr>
-          <w:rFonts w:hint="eastAsia"/>
+          <w:rFonts w:hint="eastAsia" w:ascii="Arial Unicode MS" w:hAnsi="Arial Unicode MS" w:cs="Arial Unicode MS" w:eastAsia="Arial Unicode MS"/>
         </w:rPr>
         <w:t xml:space="preserve">的前提下修复电路。</w:t>
       </w:r>
@@ -1746,7 +1661,7 @@
       </w:pPr>
       <w:r>
         <w:rPr>
-          <w:rFonts w:hint="eastAsia"/>
+          <w:rFonts w:hint="eastAsia" w:ascii="Arial Unicode MS" w:hAnsi="Arial Unicode MS" w:cs="Arial Unicode MS" w:eastAsia="Arial Unicode MS"/>
           <w:b/>
           <w:bCs/>
         </w:rPr>
@@ -1754,7 +1669,7 @@
       </w:r>
       <w:r>
         <w:rPr>
-          <w:rFonts w:hint="eastAsia"/>
+          <w:rFonts w:hint="eastAsia" w:ascii="Arial Unicode MS" w:hAnsi="Arial Unicode MS" w:cs="Arial Unicode MS" w:eastAsia="Arial Unicode MS"/>
         </w:rPr>
         <w:t xml:space="preserve">：根据比特数、拓扑结构、排队与成本约束推荐后端。</w:t>
       </w:r>
@@ -1765,7 +1680,7 @@
       </w:pPr>
       <w:r>
         <w:rPr>
-          <w:rFonts w:hint="eastAsia"/>
+          <w:rFonts w:hint="eastAsia" w:ascii="Arial Unicode MS" w:hAnsi="Arial Unicode MS" w:cs="Arial Unicode MS" w:eastAsia="Arial Unicode MS"/>
           <w:b/>
           <w:bCs/>
         </w:rPr>
@@ -1773,7 +1688,7 @@
       </w:r>
       <w:r>
         <w:rPr>
-          <w:rFonts w:hint="eastAsia"/>
+          <w:rFonts w:hint="eastAsia" w:ascii="Arial Unicode MS" w:hAnsi="Arial Unicode MS" w:cs="Arial Unicode MS" w:eastAsia="Arial Unicode MS"/>
         </w:rPr>
         <w:t xml:space="preserve">：Agent</w:t>
       </w:r>
@@ -1782,7 +1697,7 @@
       </w:r>
       <w:r>
         <w:rPr>
-          <w:rFonts w:hint="eastAsia"/>
+          <w:rFonts w:hint="eastAsia" w:ascii="Arial Unicode MS" w:hAnsi="Arial Unicode MS" w:cs="Arial Unicode MS" w:eastAsia="Arial Unicode MS"/>
         </w:rPr>
         <w:t xml:space="preserve">必须接入真实的</w:t>
       </w:r>
@@ -1791,7 +1706,7 @@
       </w:r>
       <w:r>
         <w:rPr>
-          <w:rFonts w:hint="eastAsia"/>
+          <w:rFonts w:hint="eastAsia" w:ascii="Arial Unicode MS" w:hAnsi="Arial Unicode MS" w:cs="Arial Unicode MS" w:eastAsia="Arial Unicode MS"/>
         </w:rPr>
         <w:t xml:space="preserve">推理（自备</w:t>
       </w:r>
@@ -1800,13 +1715,13 @@
       </w:r>
       <w:r>
         <w:rPr>
-          <w:rFonts w:hint="eastAsia"/>
+          <w:rFonts w:hint="eastAsia" w:ascii="Arial Unicode MS" w:hAnsi="Arial Unicode MS" w:cs="Arial Unicode MS" w:eastAsia="Arial Unicode MS"/>
         </w:rPr>
         <w:t xml:space="preserve">API）。评测使用</w:t>
       </w:r>
       <w:r>
         <w:rPr>
-          <w:rFonts w:hint="eastAsia"/>
+          <w:rFonts w:hint="eastAsia" w:ascii="Arial Unicode MS" w:hAnsi="Arial Unicode MS" w:cs="Arial Unicode MS" w:eastAsia="Arial Unicode MS"/>
           <w:b/>
           <w:bCs/>
         </w:rPr>
@@ -1821,7 +1736,7 @@
       </w:r>
       <w:r>
         <w:rPr>
-          <w:rFonts w:hint="eastAsia"/>
+          <w:rFonts w:hint="eastAsia" w:ascii="Arial Unicode MS" w:hAnsi="Arial Unicode MS" w:cs="Arial Unicode MS" w:eastAsia="Arial Unicode MS"/>
           <w:b/>
           <w:bCs/>
         </w:rPr>
@@ -1829,7 +1744,7 @@
       </w:r>
       <w:r>
         <w:rPr>
-          <w:rFonts w:hint="eastAsia"/>
+          <w:rFonts w:hint="eastAsia" w:ascii="Arial Unicode MS" w:hAnsi="Arial Unicode MS" w:cs="Arial Unicode MS" w:eastAsia="Arial Unicode MS"/>
         </w:rPr>
         <w:t xml:space="preserve">，靠关键词匹配硬编码应答无法通过（见第六节反作弊条款）。</w:t>
       </w:r>
@@ -1842,7 +1757,7 @@
       </w:pPr>
       <w:r>
         <w:rPr>
-          <w:rFonts w:hint="eastAsia"/>
+          <w:rFonts w:hint="eastAsia" w:ascii="Arial Unicode MS" w:hAnsi="Arial Unicode MS" w:cs="Arial Unicode MS" w:eastAsia="Arial Unicode MS"/>
         </w:rPr>
         <w:t xml:space="preserve">L3｜Hybrid-QASM</w:t>
       </w:r>
@@ -1851,7 +1766,7 @@
       </w:r>
       <w:r>
         <w:rPr>
-          <w:rFonts w:hint="eastAsia"/>
+          <w:rFonts w:hint="eastAsia" w:ascii="Arial Unicode MS" w:hAnsi="Arial Unicode MS" w:cs="Arial Unicode MS" w:eastAsia="Arial Unicode MS"/>
         </w:rPr>
         <w:t xml:space="preserve">混合编译（硬核系统挑战，15</w:t>
       </w:r>
@@ -1860,7 +1775,7 @@
       </w:r>
       <w:r>
         <w:rPr>
-          <w:rFonts w:hint="eastAsia"/>
+          <w:rFonts w:hint="eastAsia" w:ascii="Arial Unicode MS" w:hAnsi="Arial Unicode MS" w:cs="Arial Unicode MS" w:eastAsia="Arial Unicode MS"/>
         </w:rPr>
         <w:t xml:space="preserve">分）</w:t>
       </w:r>
@@ -1871,7 +1786,7 @@
       </w:pPr>
       <w:r>
         <w:rPr>
-          <w:rFonts w:hint="eastAsia"/>
+          <w:rFonts w:hint="eastAsia" w:ascii="Arial Unicode MS" w:hAnsi="Arial Unicode MS" w:cs="Arial Unicode MS" w:eastAsia="Arial Unicode MS"/>
         </w:rPr>
         <w:t xml:space="preserve">实现经典-量子混合程序编译。输入一段</w:t>
       </w:r>
@@ -1887,7 +1802,7 @@
       </w:r>
       <w:r>
         <w:rPr>
-          <w:rFonts w:hint="eastAsia"/>
+          <w:rFonts w:hint="eastAsia" w:ascii="Arial Unicode MS" w:hAnsi="Arial Unicode MS" w:cs="Arial Unicode MS" w:eastAsia="Arial Unicode MS"/>
         </w:rPr>
         <w:t xml:space="preserve">（语法定义见下），你的编译器需要输出两部分：</w:t>
       </w:r>
@@ -1902,7 +1817,7 @@
       </w:pPr>
       <w:r>
         <w:rPr>
-          <w:rFonts w:hint="eastAsia"/>
+          <w:rFonts w:hint="eastAsia" w:ascii="Arial Unicode MS" w:hAnsi="Arial Unicode MS" w:cs="Arial Unicode MS" w:eastAsia="Arial Unicode MS"/>
           <w:b/>
           <w:bCs/>
         </w:rPr>
@@ -1910,7 +1825,7 @@
       </w:r>
       <w:r>
         <w:rPr>
-          <w:rFonts w:hint="eastAsia"/>
+          <w:rFonts w:hint="eastAsia" w:ascii="Arial Unicode MS" w:hAnsi="Arial Unicode MS" w:cs="Arial Unicode MS" w:eastAsia="Arial Unicode MS"/>
         </w:rPr>
         <w:t xml:space="preserve">：剥离出的纯量子门/测量指令列表；</w:t>
       </w:r>
@@ -1932,7 +1847,7 @@
       </w:r>
       <w:r>
         <w:rPr>
-          <w:rFonts w:hint="eastAsia"/>
+          <w:rFonts w:hint="eastAsia" w:ascii="Arial Unicode MS" w:hAnsi="Arial Unicode MS" w:cs="Arial Unicode MS" w:eastAsia="Arial Unicode MS"/>
           <w:b/>
           <w:bCs/>
         </w:rPr>
@@ -1940,7 +1855,7 @@
       </w:r>
       <w:r>
         <w:rPr>
-          <w:rFonts w:hint="eastAsia"/>
+          <w:rFonts w:hint="eastAsia" w:ascii="Arial Unicode MS" w:hAnsi="Arial Unicode MS" w:cs="Arial Unicode MS" w:eastAsia="Arial Unicode MS"/>
         </w:rPr>
         <w:t xml:space="preserve">：实现经典控制逻辑，可在官方提供的</w:t>
       </w:r>
@@ -1960,7 +1875,7 @@
       </w:r>
       <w:r>
         <w:rPr>
-          <w:rFonts w:hint="eastAsia"/>
+          <w:rFonts w:hint="eastAsia" w:ascii="Arial Unicode MS" w:hAnsi="Arial Unicode MS" w:cs="Arial Unicode MS" w:eastAsia="Arial Unicode MS"/>
         </w:rPr>
         <w:t xml:space="preserve">轻量模拟器中运行（支持</w:t>
       </w:r>
@@ -1978,7 +1893,7 @@
       </w:r>
       <w:r>
         <w:rPr>
-          <w:rFonts w:hint="eastAsia"/>
+          <w:rFonts w:hint="eastAsia" w:ascii="Arial Unicode MS" w:hAnsi="Arial Unicode MS" w:cs="Arial Unicode MS" w:eastAsia="Arial Unicode MS"/>
         </w:rPr>
         <w:t xml:space="preserve">指令子集，无需搭建</w:t>
       </w:r>
@@ -1987,7 +1902,7 @@
       </w:r>
       <w:r>
         <w:rPr>
-          <w:rFonts w:hint="eastAsia"/>
+          <w:rFonts w:hint="eastAsia" w:ascii="Arial Unicode MS" w:hAnsi="Arial Unicode MS" w:cs="Arial Unicode MS" w:eastAsia="Arial Unicode MS"/>
         </w:rPr>
         <w:t xml:space="preserve">QEMU）。</w:t>
       </w:r>
@@ -2005,7 +1920,7 @@
       </w:r>
       <w:r>
         <w:rPr>
-          <w:rFonts w:hint="eastAsia"/>
+          <w:rFonts w:hint="eastAsia" w:ascii="Arial Unicode MS" w:hAnsi="Arial Unicode MS" w:cs="Arial Unicode MS" w:eastAsia="Arial Unicode MS"/>
           <w:b/>
           <w:bCs/>
         </w:rPr>
@@ -2013,7 +1928,7 @@
       </w:r>
       <w:r>
         <w:rPr>
-          <w:rFonts w:hint="eastAsia"/>
+          <w:rFonts w:hint="eastAsia" w:ascii="Arial Unicode MS" w:hAnsi="Arial Unicode MS" w:cs="Arial Unicode MS" w:eastAsia="Arial Unicode MS"/>
         </w:rPr>
         <w:t xml:space="preserve">（在</w:t>
       </w:r>
@@ -2022,7 +1937,7 @@
       </w:r>
       <w:r>
         <w:rPr>
-          <w:rFonts w:hint="eastAsia"/>
+          <w:rFonts w:hint="eastAsia" w:ascii="Arial Unicode MS" w:hAnsi="Arial Unicode MS" w:cs="Arial Unicode MS" w:eastAsia="Arial Unicode MS"/>
         </w:rPr>
         <w:t xml:space="preserve">基础上扩展一个经典逻辑块，机器可解析，不用自然语言注释描述语义）：</w:t>
       </w:r>
@@ -2094,7 +2009,7 @@
       <w:r>
         <w:rPr>
           <w:rStyle w:val="VerbatimChar"/>
-          <w:rFonts w:hint="eastAsia"/>
+          <w:rFonts w:hint="eastAsia" w:ascii="Arial Unicode MS" w:hAnsi="Arial Unicode MS" w:cs="Arial Unicode MS" w:eastAsia="Arial Unicode MS"/>
         </w:rPr>
         <w:t xml:space="preserve">经典控制块：测量结果</w:t>
       </w:r>
@@ -2107,7 +2022,7 @@
       <w:r>
         <w:rPr>
           <w:rStyle w:val="VerbatimChar"/>
-          <w:rFonts w:hint="eastAsia"/>
+          <w:rFonts w:hint="eastAsia" w:ascii="Arial Unicode MS" w:hAnsi="Arial Unicode MS" w:cs="Arial Unicode MS" w:eastAsia="Arial Unicode MS"/>
         </w:rPr>
         <w:t xml:space="preserve">由评测系统注入</w:t>
       </w:r>
@@ -2120,7 +2035,7 @@
       <w:r>
         <w:rPr>
           <w:rStyle w:val="VerbatimChar"/>
-          <w:rFonts w:hint="eastAsia"/>
+          <w:rFonts w:hint="eastAsia" w:ascii="Arial Unicode MS" w:hAnsi="Arial Unicode MS" w:cs="Arial Unicode MS" w:eastAsia="Arial Unicode MS"/>
         </w:rPr>
         <w:t xml:space="preserve">寄存器</w:t>
       </w:r>
@@ -2145,7 +2060,7 @@
       <w:r>
         <w:rPr>
           <w:rStyle w:val="VerbatimChar"/>
-          <w:rFonts w:hint="eastAsia"/>
+          <w:rFonts w:hint="eastAsia" w:ascii="Arial Unicode MS" w:hAnsi="Arial Unicode MS" w:cs="Arial Unicode MS" w:eastAsia="Arial Unicode MS"/>
         </w:rPr>
         <w:t xml:space="preserve">映射到</w:t>
       </w:r>
@@ -2158,7 +2073,7 @@
       <w:r>
         <w:rPr>
           <w:rStyle w:val="VerbatimChar"/>
-          <w:rFonts w:hint="eastAsia"/>
+          <w:rFonts w:hint="eastAsia" w:ascii="Arial Unicode MS" w:hAnsi="Arial Unicode MS" w:cs="Arial Unicode MS" w:eastAsia="Arial Unicode MS"/>
         </w:rPr>
         <w:t xml:space="preserve">通用寄存器</w:t>
       </w:r>
@@ -2223,7 +2138,7 @@
       </w:pPr>
       <w:r>
         <w:rPr>
-          <w:rFonts w:hint="eastAsia"/>
+          <w:rFonts w:hint="eastAsia" w:ascii="Arial Unicode MS" w:hAnsi="Arial Unicode MS" w:cs="Arial Unicode MS" w:eastAsia="Arial Unicode MS"/>
         </w:rPr>
         <w:t xml:space="preserve">经典块的迷你文法：整数字面量、寄存器变量</w:t>
       </w:r>
@@ -2238,7 +2153,7 @@
       </w:r>
       <w:r>
         <w:rPr>
-          <w:rFonts w:hint="eastAsia"/>
+          <w:rFonts w:hint="eastAsia" w:ascii="Arial Unicode MS" w:hAnsi="Arial Unicode MS" w:cs="Arial Unicode MS" w:eastAsia="Arial Unicode MS"/>
         </w:rPr>
         <w:t xml:space="preserve">、运算符</w:t>
       </w:r>
@@ -2265,7 +2180,7 @@
       </w:r>
       <w:r>
         <w:rPr>
-          <w:rFonts w:hint="eastAsia"/>
+          <w:rFonts w:hint="eastAsia" w:ascii="Arial Unicode MS" w:hAnsi="Arial Unicode MS" w:cs="Arial Unicode MS" w:eastAsia="Arial Unicode MS"/>
         </w:rPr>
         <w:t xml:space="preserve">与顺序赋值。测量位</w:t>
       </w:r>
@@ -2283,7 +2198,7 @@
       </w:r>
       <w:r>
         <w:rPr>
-          <w:rFonts w:hint="eastAsia"/>
+          <w:rFonts w:hint="eastAsia" w:ascii="Arial Unicode MS" w:hAnsi="Arial Unicode MS" w:cs="Arial Unicode MS" w:eastAsia="Arial Unicode MS"/>
         </w:rPr>
         <w:t xml:space="preserve">依次映射到</w:t>
       </w:r>
@@ -2298,13 +2213,13 @@
       </w:r>
       <w:r>
         <w:rPr>
-          <w:rFonts w:hint="eastAsia"/>
+          <w:rFonts w:hint="eastAsia" w:ascii="Arial Unicode MS" w:hAnsi="Arial Unicode MS" w:cs="Arial Unicode MS" w:eastAsia="Arial Unicode MS"/>
         </w:rPr>
         <w:t xml:space="preserve">。评测将</w:t>
       </w:r>
       <w:r>
         <w:rPr>
-          <w:rFonts w:hint="eastAsia"/>
+          <w:rFonts w:hint="eastAsia" w:ascii="Arial Unicode MS" w:hAnsi="Arial Unicode MS" w:cs="Arial Unicode MS" w:eastAsia="Arial Unicode MS"/>
           <w:b/>
           <w:bCs/>
         </w:rPr>
@@ -2312,7 +2227,7 @@
       </w:r>
       <w:r>
         <w:rPr>
-          <w:rFonts w:hint="eastAsia"/>
+          <w:rFonts w:hint="eastAsia" w:ascii="Arial Unicode MS" w:hAnsi="Arial Unicode MS" w:cs="Arial Unicode MS" w:eastAsia="Arial Unicode MS"/>
         </w:rPr>
         <w:t xml:space="preserve">符合该文法的用例并注入不同测量值，验证寄存器终态</w:t>
       </w:r>
@@ -2321,7 +2236,7 @@
       </w:r>
       <w:r>
         <w:rPr>
-          <w:rFonts w:hint="eastAsia"/>
+          <w:rFonts w:hint="eastAsia" w:ascii="Arial Unicode MS" w:hAnsi="Arial Unicode MS" w:cs="Arial Unicode MS" w:eastAsia="Arial Unicode MS"/>
         </w:rPr>
         <w:t xml:space="preserve">正确——所以必须实现真正的解析与编译，硬编码样例输出无法通过。</w:t>
       </w:r>
@@ -2342,7 +2257,7 @@
       </w:pPr>
       <w:r>
         <w:rPr>
-          <w:rFonts w:hint="eastAsia"/>
+          <w:rFonts w:hint="eastAsia" w:ascii="Arial Unicode MS" w:hAnsi="Arial Unicode MS" w:cs="Arial Unicode MS" w:eastAsia="Arial Unicode MS"/>
         </w:rPr>
         <w:t xml:space="preserve">四、提交契约</w:t>
       </w:r>
@@ -2356,7 +2271,7 @@
       </w:pPr>
       <w:r>
         <w:rPr>
-          <w:rFonts w:hint="eastAsia"/>
+          <w:rFonts w:hint="eastAsia" w:ascii="Arial Unicode MS" w:hAnsi="Arial Unicode MS" w:cs="Arial Unicode MS" w:eastAsia="Arial Unicode MS"/>
         </w:rPr>
         <w:t xml:space="preserve">提交一个</w:t>
       </w:r>
@@ -2365,9 +2280,27 @@
       </w:r>
       <w:r>
         <w:rPr>
-          <w:rFonts w:hint="eastAsia"/>
-        </w:rPr>
-        <w:t xml:space="preserve">仓库，根目录提供</w:t>
+          <w:rFonts w:hint="eastAsia" w:ascii="Arial Unicode MS" w:hAnsi="Arial Unicode MS" w:cs="Arial Unicode MS" w:eastAsia="Arial Unicode MS"/>
+        </w:rPr>
+        <w:t xml:space="preserve">仓库，根目录必须提供</w:t>
+      </w:r>
+      <w:r>
+        <w:t xml:space="preserve"> </w:t>
+      </w:r>
+      <w:r>
+        <w:rPr>
+          <w:rStyle w:val="VerbatimChar"/>
+        </w:rPr>
+        <w:t xml:space="preserve">submission.yaml</w:t>
+      </w:r>
+      <w:r>
+        <w:t xml:space="preserve"> </w:t>
+      </w:r>
+      <w:r>
+        <w:rPr>
+          <w:rFonts w:hint="eastAsia" w:ascii="Arial Unicode MS" w:hAnsi="Arial Unicode MS" w:cs="Arial Unicode MS" w:eastAsia="Arial Unicode MS"/>
+        </w:rPr>
+        <w:t xml:space="preserve">与</w:t>
       </w:r>
       <w:r>
         <w:t xml:space="preserve"> </w:t>
@@ -2379,22 +2312,49 @@
         <w:t xml:space="preserve">adapter.py</w:t>
       </w:r>
       <w:r>
-        <w:t xml:space="preserve"> </w:t>
-      </w:r>
-      <w:r>
-        <w:rPr>
-          <w:rFonts w:hint="eastAsia"/>
-        </w:rPr>
-        <w:t xml:space="preserve">并实现以下接口（非</w:t>
+        <w:t xml:space="preserve">。</w:t>
+      </w:r>
+      <w:r>
+        <w:rPr>
+          <w:rStyle w:val="VerbatimChar"/>
+        </w:rPr>
+        <w:t xml:space="preserve">submission.yaml</w:t>
+      </w:r>
+      <w:r>
+        <w:t xml:space="preserve"> </w:t>
+      </w:r>
+      <w:r>
+        <w:rPr>
+          <w:rFonts w:hint="eastAsia" w:ascii="Arial Unicode MS" w:hAnsi="Arial Unicode MS" w:cs="Arial Unicode MS" w:eastAsia="Arial Unicode MS"/>
+        </w:rPr>
+        <w:t xml:space="preserve">声明</w:t>
+      </w:r>
+      <w:r>
+        <w:t xml:space="preserve"> Starter Kit </w:t>
+      </w:r>
+      <w:r>
+        <w:rPr>
+          <w:rFonts w:hint="eastAsia" w:ascii="Arial Unicode MS" w:hAnsi="Arial Unicode MS" w:cs="Arial Unicode MS" w:eastAsia="Arial Unicode MS"/>
+        </w:rPr>
+        <w:t xml:space="preserve">版本、参赛</w:t>
+      </w:r>
+      <w:r>
+        <w:t xml:space="preserve"> </w:t>
+      </w:r>
+      <w:r>
+        <w:rPr>
+          <w:rFonts w:hint="eastAsia" w:ascii="Arial Unicode MS" w:hAnsi="Arial Unicode MS" w:cs="Arial Unicode MS" w:eastAsia="Arial Unicode MS"/>
+        </w:rPr>
+        <w:t xml:space="preserve">Level、运行时与网络需求；非</w:t>
       </w:r>
       <w:r>
         <w:t xml:space="preserve"> Python </w:t>
       </w:r>
       <w:r>
         <w:rPr>
-          <w:rFonts w:hint="eastAsia"/>
-        </w:rPr>
-        <w:t xml:space="preserve">技术栈的队伍可在</w:t>
+          <w:rFonts w:hint="eastAsia" w:ascii="Arial Unicode MS" w:hAnsi="Arial Unicode MS" w:cs="Arial Unicode MS" w:eastAsia="Arial Unicode MS"/>
+        </w:rPr>
+        <w:t xml:space="preserve">技术栈可在</w:t>
       </w:r>
       <w:r>
         <w:t xml:space="preserve"> </w:t>
@@ -2410,7 +2370,7 @@
       </w:r>
       <w:r>
         <w:rPr>
-          <w:rFonts w:hint="eastAsia"/>
+          <w:rFonts w:hint="eastAsia" w:ascii="Arial Unicode MS" w:hAnsi="Arial Unicode MS" w:cs="Arial Unicode MS" w:eastAsia="Arial Unicode MS"/>
         </w:rPr>
         <w:t xml:space="preserve">中通过</w:t>
       </w:r>
@@ -2428,7 +2388,7 @@
       </w:r>
       <w:r>
         <w:rPr>
-          <w:rFonts w:hint="eastAsia"/>
+          <w:rFonts w:hint="eastAsia" w:ascii="Arial Unicode MS" w:hAnsi="Arial Unicode MS" w:cs="Arial Unicode MS" w:eastAsia="Arial Unicode MS"/>
         </w:rPr>
         <w:t xml:space="preserve">调用自己的</w:t>
       </w:r>
@@ -2437,9 +2397,48 @@
       </w:r>
       <w:r>
         <w:rPr>
-          <w:rFonts w:hint="eastAsia"/>
-        </w:rPr>
-        <w:t xml:space="preserve">CLI/二进制，评测只认接口行为）：</w:t>
+          <w:rFonts w:hint="eastAsia" w:ascii="Arial Unicode MS" w:hAnsi="Arial Unicode MS" w:cs="Arial Unicode MS" w:eastAsia="Arial Unicode MS"/>
+        </w:rPr>
+        <w:t xml:space="preserve">CLI/二进制。评测只认固定接口行为，不限制内部技术栈。</w:t>
+      </w:r>
+    </w:p>
+    <w:p>
+      <w:pPr>
+        <w:pStyle w:val="BodyText"/>
+      </w:pPr>
+      <w:r>
+        <w:t xml:space="preserve">Starter Kit </w:t>
+      </w:r>
+      <w:r>
+        <w:rPr>
+          <w:rFonts w:hint="eastAsia" w:ascii="Arial Unicode MS" w:hAnsi="Arial Unicode MS" w:cs="Arial Unicode MS" w:eastAsia="Arial Unicode MS"/>
+        </w:rPr>
+        <w:t xml:space="preserve">合同版本为</w:t>
+      </w:r>
+      <w:r>
+        <w:t xml:space="preserve"> </w:t>
+      </w:r>
+      <w:r>
+        <w:rPr>
+          <w:b/>
+          <w:bCs/>
+        </w:rPr>
+        <w:t xml:space="preserve">v1.0</w:t>
+      </w:r>
+      <w:r>
+        <w:rPr>
+          <w:rFonts w:hint="eastAsia" w:ascii="Arial Unicode MS" w:hAnsi="Arial Unicode MS" w:cs="Arial Unicode MS" w:eastAsia="Arial Unicode MS"/>
+        </w:rPr>
+        <w:t xml:space="preserve">。开赛后，v1.x</w:t>
+      </w:r>
+      <w:r>
+        <w:t xml:space="preserve"> </w:t>
+      </w:r>
+      <w:r>
+        <w:rPr>
+          <w:rFonts w:hint="eastAsia" w:ascii="Arial Unicode MS" w:hAnsi="Arial Unicode MS" w:cs="Arial Unicode MS" w:eastAsia="Arial Unicode MS"/>
+        </w:rPr>
+        <w:t xml:space="preserve">只做向后兼容的文档、诊断与公开测试更新；任何破坏性接口变更必须发布新合同版本，并保留旧版评测通道。</w:t>
       </w:r>
     </w:p>
     <w:p>
@@ -2771,7 +2770,96 @@
       </w:pPr>
       <w:r>
         <w:rPr>
-          <w:rFonts w:hint="eastAsia"/>
+          <w:rStyle w:val="VerbatimChar"/>
+        </w:rPr>
+        <w:t xml:space="preserve">transpile()</w:t>
+      </w:r>
+      <w:r>
+        <w:t xml:space="preserve"> </w:t>
+      </w:r>
+      <w:r>
+        <w:rPr>
+          <w:rFonts w:hint="eastAsia" w:ascii="Arial Unicode MS" w:hAnsi="Arial Unicode MS" w:cs="Arial Unicode MS" w:eastAsia="Arial Unicode MS"/>
+        </w:rPr>
+        <w:t xml:space="preserve">返回值必须符合</w:t>
+      </w:r>
+      <w:r>
+        <w:t xml:space="preserve"> Starter Kit </w:t>
+      </w:r>
+      <w:r>
+        <w:rPr>
+          <w:rFonts w:hint="eastAsia" w:ascii="Arial Unicode MS" w:hAnsi="Arial Unicode MS" w:cs="Arial Unicode MS" w:eastAsia="Arial Unicode MS"/>
+        </w:rPr>
+        <w:t xml:space="preserve">的</w:t>
+      </w:r>
+      <w:r>
+        <w:t xml:space="preserve"> </w:t>
+      </w:r>
+      <w:r>
+        <w:rPr>
+          <w:rStyle w:val="VerbatimChar"/>
+        </w:rPr>
+        <w:t xml:space="preserve">target_ir_contract.md</w:t>
+      </w:r>
+      <w:r>
+        <w:rPr>
+          <w:rFonts w:hint="eastAsia" w:ascii="Arial Unicode MS" w:hAnsi="Arial Unicode MS" w:cs="Arial Unicode MS" w:eastAsia="Arial Unicode MS"/>
+        </w:rPr>
+        <w:t xml:space="preserve">：SpinQ</w:t>
+      </w:r>
+      <w:r>
+        <w:t xml:space="preserve"> </w:t>
+      </w:r>
+      <w:r>
+        <w:rPr>
+          <w:rFonts w:hint="eastAsia" w:ascii="Arial Unicode MS" w:hAnsi="Arial Unicode MS" w:cs="Arial Unicode MS" w:eastAsia="Arial Unicode MS"/>
+        </w:rPr>
+        <w:t xml:space="preserve">使用</w:t>
+      </w:r>
+      <w:r>
+        <w:t xml:space="preserve"> OpenQASM 2.0、Braket </w:t>
+      </w:r>
+      <w:r>
+        <w:rPr>
+          <w:rFonts w:hint="eastAsia" w:ascii="Arial Unicode MS" w:hAnsi="Arial Unicode MS" w:cs="Arial Unicode MS" w:eastAsia="Arial Unicode MS"/>
+        </w:rPr>
+        <w:t xml:space="preserve">使用</w:t>
+      </w:r>
+      <w:r>
+        <w:t xml:space="preserve"> OpenQASM 3、OriginQ </w:t>
+      </w:r>
+      <w:r>
+        <w:rPr>
+          <w:rFonts w:hint="eastAsia" w:ascii="Arial Unicode MS" w:hAnsi="Arial Unicode MS" w:cs="Arial Unicode MS" w:eastAsia="Arial Unicode MS"/>
+        </w:rPr>
+        <w:t xml:space="preserve">使用规范</w:t>
+      </w:r>
+      <w:r>
+        <w:t xml:space="preserve"> OriginIR </w:t>
+      </w:r>
+      <w:r>
+        <w:rPr>
+          <w:rFonts w:hint="eastAsia" w:ascii="Arial Unicode MS" w:hAnsi="Arial Unicode MS" w:cs="Arial Unicode MS" w:eastAsia="Arial Unicode MS"/>
+        </w:rPr>
+        <w:t xml:space="preserve">子集。正式评测会由组织方解析并模拟目标</w:t>
+      </w:r>
+      <w:r>
+        <w:t xml:space="preserve"> </w:t>
+      </w:r>
+      <w:r>
+        <w:rPr>
+          <w:rFonts w:hint="eastAsia" w:ascii="Arial Unicode MS" w:hAnsi="Arial Unicode MS" w:cs="Arial Unicode MS" w:eastAsia="Arial Unicode MS"/>
+        </w:rPr>
+        <w:t xml:space="preserve">IR；非空占位字符串不构成有效转译。</w:t>
+      </w:r>
+    </w:p>
+    <w:p>
+      <w:pPr>
+        <w:pStyle w:val="BodyText"/>
+      </w:pPr>
+      <w:r>
+        <w:rPr>
+          <w:rFonts w:hint="eastAsia" w:ascii="Arial Unicode MS" w:hAnsi="Arial Unicode MS" w:cs="Arial Unicode MS" w:eastAsia="Arial Unicode MS"/>
           <w:b/>
           <w:bCs/>
         </w:rPr>
@@ -2786,7 +2874,7 @@
       </w:r>
       <w:r>
         <w:rPr>
-          <w:rFonts w:hint="eastAsia"/>
+          <w:rFonts w:hint="eastAsia" w:ascii="Arial Unicode MS" w:hAnsi="Arial Unicode MS" w:cs="Arial Unicode MS" w:eastAsia="Arial Unicode MS"/>
           <w:b/>
           <w:bCs/>
         </w:rPr>
@@ -2809,7 +2897,7 @@
       </w:r>
       <w:r>
         <w:rPr>
-          <w:rFonts w:hint="eastAsia"/>
+          <w:rFonts w:hint="eastAsia" w:ascii="Arial Unicode MS" w:hAnsi="Arial Unicode MS" w:cs="Arial Unicode MS" w:eastAsia="Arial Unicode MS"/>
           <w:b/>
           <w:bCs/>
         </w:rPr>
@@ -3242,7 +3330,7 @@
       </w:r>
       <w:r>
         <w:rPr>
-          <w:rFonts w:hint="eastAsia"/>
+          <w:rFonts w:hint="eastAsia" w:ascii="Arial Unicode MS" w:hAnsi="Arial Unicode MS" w:cs="Arial Unicode MS" w:eastAsia="Arial Unicode MS"/>
           <w:b/>
           <w:bCs/>
         </w:rPr>
@@ -3250,7 +3338,7 @@
       </w:r>
       <w:r>
         <w:rPr>
-          <w:rFonts w:hint="eastAsia"/>
+          <w:rFonts w:hint="eastAsia" w:ascii="Arial Unicode MS" w:hAnsi="Arial Unicode MS" w:cs="Arial Unicode MS" w:eastAsia="Arial Unicode MS"/>
         </w:rPr>
         <w:t xml:space="preserve">：</w:t>
       </w:r>
@@ -3265,7 +3353,7 @@
       </w:r>
       <w:r>
         <w:rPr>
-          <w:rFonts w:hint="eastAsia"/>
+          <w:rFonts w:hint="eastAsia" w:ascii="Arial Unicode MS" w:hAnsi="Arial Unicode MS" w:cs="Arial Unicode MS" w:eastAsia="Arial Unicode MS"/>
         </w:rPr>
         <w:t xml:space="preserve">的</w:t>
       </w:r>
@@ -3274,13 +3362,13 @@
       </w:r>
       <w:r>
         <w:rPr>
-          <w:rFonts w:hint="eastAsia"/>
+          <w:rFonts w:hint="eastAsia" w:ascii="Arial Unicode MS" w:hAnsi="Arial Unicode MS" w:cs="Arial Unicode MS" w:eastAsia="Arial Unicode MS"/>
         </w:rPr>
         <w:t xml:space="preserve">是经典寄存器位串，</w:t>
       </w:r>
       <w:r>
         <w:rPr>
-          <w:rFonts w:hint="eastAsia"/>
+          <w:rFonts w:hint="eastAsia" w:ascii="Arial Unicode MS" w:hAnsi="Arial Unicode MS" w:cs="Arial Unicode MS" w:eastAsia="Arial Unicode MS"/>
           <w:b/>
           <w:bCs/>
         </w:rPr>
@@ -3303,7 +3391,7 @@
       </w:r>
       <w:r>
         <w:rPr>
-          <w:rFonts w:hint="eastAsia"/>
+          <w:rFonts w:hint="eastAsia" w:ascii="Arial Unicode MS" w:hAnsi="Arial Unicode MS" w:cs="Arial Unicode MS" w:eastAsia="Arial Unicode MS"/>
         </w:rPr>
         <w:t xml:space="preserve">（即</w:t>
       </w:r>
@@ -3321,7 +3409,7 @@
       </w:r>
       <w:r>
         <w:rPr>
-          <w:rFonts w:hint="eastAsia"/>
+          <w:rFonts w:hint="eastAsia" w:ascii="Arial Unicode MS" w:hAnsi="Arial Unicode MS" w:cs="Arial Unicode MS" w:eastAsia="Arial Unicode MS"/>
         </w:rPr>
         <w:t xml:space="preserve">，与</w:t>
       </w:r>
@@ -3330,7 +3418,7 @@
       </w:r>
       <w:r>
         <w:rPr>
-          <w:rFonts w:hint="eastAsia"/>
+          <w:rFonts w:hint="eastAsia" w:ascii="Arial Unicode MS" w:hAnsi="Arial Unicode MS" w:cs="Arial Unicode MS" w:eastAsia="Arial Unicode MS"/>
         </w:rPr>
         <w:t xml:space="preserve">约定一致），</w:t>
       </w:r>
@@ -3345,7 +3433,7 @@
       </w:r>
       <w:r>
         <w:rPr>
-          <w:rFonts w:hint="eastAsia"/>
+          <w:rFonts w:hint="eastAsia" w:ascii="Arial Unicode MS" w:hAnsi="Arial Unicode MS" w:cs="Arial Unicode MS" w:eastAsia="Arial Unicode MS"/>
         </w:rPr>
         <w:t xml:space="preserve">固定填</w:t>
       </w:r>
@@ -3360,9 +3448,64 @@
       </w:r>
       <w:r>
         <w:rPr>
-          <w:rFonts w:hint="eastAsia"/>
+          <w:rFonts w:hint="eastAsia" w:ascii="Arial Unicode MS" w:hAnsi="Arial Unicode MS" w:cs="Arial Unicode MS" w:eastAsia="Arial Unicode MS"/>
         </w:rPr>
         <w:t xml:space="preserve">。跨平台位序差异必须在中间层内归一化——这正是”通用”的一部分。</w:t>
+      </w:r>
+    </w:p>
+    <w:p>
+      <w:pPr>
+        <w:pStyle w:val="BodyText"/>
+      </w:pPr>
+      <w:r>
+        <w:rPr>
+          <w:rFonts w:hint="eastAsia" w:ascii="Arial Unicode MS" w:hAnsi="Arial Unicode MS" w:cs="Arial Unicode MS" w:eastAsia="Arial Unicode MS"/>
+          <w:b/>
+          <w:bCs/>
+        </w:rPr>
+        <w:t xml:space="preserve">可复现性要求</w:t>
+      </w:r>
+      <w:r>
+        <w:rPr>
+          <w:rFonts w:hint="eastAsia" w:ascii="Arial Unicode MS" w:hAnsi="Arial Unicode MS" w:cs="Arial Unicode MS" w:eastAsia="Arial Unicode MS"/>
+        </w:rPr>
+        <w:t xml:space="preserve">：第三方依赖必须精确锁定版本；正式评测以提交截止时记录的</w:t>
+      </w:r>
+      <w:r>
+        <w:t xml:space="preserve"> commit SHA </w:t>
+      </w:r>
+      <w:r>
+        <w:rPr>
+          <w:rFonts w:hint="eastAsia" w:ascii="Arial Unicode MS" w:hAnsi="Arial Unicode MS" w:cs="Arial Unicode MS" w:eastAsia="Arial Unicode MS"/>
+        </w:rPr>
+        <w:t xml:space="preserve">为准，在固定</w:t>
+      </w:r>
+      <w:r>
+        <w:t xml:space="preserve"> Linux </w:t>
+      </w:r>
+      <w:r>
+        <w:rPr>
+          <w:rFonts w:hint="eastAsia" w:ascii="Arial Unicode MS" w:hAnsi="Arial Unicode MS" w:cs="Arial Unicode MS" w:eastAsia="Arial Unicode MS"/>
+        </w:rPr>
+        <w:t xml:space="preserve">容器内构建。公开</w:t>
+      </w:r>
+      <w:r>
+        <w:t xml:space="preserve"> </w:t>
+      </w:r>
+      <w:r>
+        <w:rPr>
+          <w:rStyle w:val="VerbatimChar"/>
+        </w:rPr>
+        <w:t xml:space="preserve">evaluator.py</w:t>
+      </w:r>
+      <w:r>
+        <w:t xml:space="preserve"> </w:t>
+      </w:r>
+      <w:r>
+        <w:rPr>
+          <w:rFonts w:hint="eastAsia" w:ascii="Arial Unicode MS" w:hAnsi="Arial Unicode MS" w:cs="Arial Unicode MS" w:eastAsia="Arial Unicode MS"/>
+        </w:rPr>
+        <w:t xml:space="preserve">只用于契约自测，其输出不是正式分数。</w:t>
       </w:r>
     </w:p>
     <w:p>
@@ -3380,7 +3523,7 @@
       </w:pPr>
       <w:r>
         <w:rPr>
-          <w:rFonts w:hint="eastAsia"/>
+          <w:rFonts w:hint="eastAsia" w:ascii="Arial Unicode MS" w:hAnsi="Arial Unicode MS" w:cs="Arial Unicode MS" w:eastAsia="Arial Unicode MS"/>
         </w:rPr>
         <w:t xml:space="preserve">五、评测与判定标准</w:t>
       </w:r>
@@ -3395,7 +3538,7 @@
       </w:r>
       <w:r>
         <w:rPr>
-          <w:rFonts w:hint="eastAsia"/>
+          <w:rFonts w:hint="eastAsia" w:ascii="Arial Unicode MS" w:hAnsi="Arial Unicode MS" w:cs="Arial Unicode MS" w:eastAsia="Arial Unicode MS"/>
         </w:rPr>
         <w:t xml:space="preserve">判定（45</w:t>
       </w:r>
@@ -3404,7 +3547,7 @@
       </w:r>
       <w:r>
         <w:rPr>
-          <w:rFonts w:hint="eastAsia"/>
+          <w:rFonts w:hint="eastAsia" w:ascii="Arial Unicode MS" w:hAnsi="Arial Unicode MS" w:cs="Arial Unicode MS" w:eastAsia="Arial Unicode MS"/>
         </w:rPr>
         <w:t xml:space="preserve">分）：语义等价与真机校验</w:t>
       </w:r>
@@ -3419,7 +3562,7 @@
       </w:pPr>
       <w:r>
         <w:rPr>
-          <w:rFonts w:hint="eastAsia"/>
+          <w:rFonts w:hint="eastAsia" w:ascii="Arial Unicode MS" w:hAnsi="Arial Unicode MS" w:cs="Arial Unicode MS" w:eastAsia="Arial Unicode MS"/>
           <w:b/>
           <w:bCs/>
         </w:rPr>
@@ -3434,7 +3577,7 @@
       </w:r>
       <w:r>
         <w:rPr>
-          <w:rFonts w:hint="eastAsia"/>
+          <w:rFonts w:hint="eastAsia" w:ascii="Arial Unicode MS" w:hAnsi="Arial Unicode MS" w:cs="Arial Unicode MS" w:eastAsia="Arial Unicode MS"/>
           <w:b/>
           <w:bCs/>
         </w:rPr>
@@ -3442,7 +3585,7 @@
       </w:r>
       <w:r>
         <w:rPr>
-          <w:rFonts w:hint="eastAsia"/>
+          <w:rFonts w:hint="eastAsia" w:ascii="Arial Unicode MS" w:hAnsi="Arial Unicode MS" w:cs="Arial Unicode MS" w:eastAsia="Arial Unicode MS"/>
         </w:rPr>
         <w:t xml:space="preserve">：官方测试电路集共</w:t>
       </w:r>
@@ -3451,7 +3594,7 @@
       </w:r>
       <w:r>
         <w:rPr>
-          <w:rFonts w:hint="eastAsia"/>
+          <w:rFonts w:hint="eastAsia" w:ascii="Arial Unicode MS" w:hAnsi="Arial Unicode MS" w:cs="Arial Unicode MS" w:eastAsia="Arial Unicode MS"/>
         </w:rPr>
         <w:t xml:space="preserve">个——</w:t>
       </w:r>
@@ -3508,7 +3651,7 @@
       </w:r>
       <w:r>
         <w:rPr>
-          <w:rFonts w:hint="eastAsia"/>
+          <w:rFonts w:hint="eastAsia" w:ascii="Arial Unicode MS" w:hAnsi="Arial Unicode MS" w:cs="Arial Unicode MS" w:eastAsia="Arial Unicode MS"/>
         </w:rPr>
         <w:t xml:space="preserve">，全部使用第三节的</w:t>
       </w:r>
@@ -3517,7 +3660,7 @@
       </w:r>
       <w:r>
         <w:rPr>
-          <w:rFonts w:hint="eastAsia"/>
+          <w:rFonts w:hint="eastAsia" w:ascii="Arial Unicode MS" w:hAnsi="Arial Unicode MS" w:cs="Arial Unicode MS" w:eastAsia="Arial Unicode MS"/>
         </w:rPr>
         <w:t xml:space="preserve">门白名单。其中</w:t>
       </w:r>
@@ -3533,7 +3676,7 @@
       </w:r>
       <w:r>
         <w:rPr>
-          <w:rFonts w:hint="eastAsia"/>
+          <w:rFonts w:hint="eastAsia" w:ascii="Arial Unicode MS" w:hAnsi="Arial Unicode MS" w:cs="Arial Unicode MS" w:eastAsia="Arial Unicode MS"/>
           <w:b/>
           <w:bCs/>
         </w:rPr>
@@ -3548,7 +3691,7 @@
       </w:r>
       <w:r>
         <w:rPr>
-          <w:rFonts w:hint="eastAsia"/>
+          <w:rFonts w:hint="eastAsia" w:ascii="Arial Unicode MS" w:hAnsi="Arial Unicode MS" w:cs="Arial Unicode MS" w:eastAsia="Arial Unicode MS"/>
           <w:b/>
           <w:bCs/>
         </w:rPr>
@@ -3563,30 +3706,39 @@
       </w:r>
       <w:r>
         <w:rPr>
-          <w:rFonts w:hint="eastAsia"/>
-          <w:b/>
-          <w:bCs/>
-        </w:rPr>
-        <w:t xml:space="preserve">公开供自测，其余为隐藏电路</w:t>
-      </w:r>
-      <w:r>
-        <w:rPr>
-          <w:rFonts w:hint="eastAsia"/>
-        </w:rPr>
-        <w:t xml:space="preserve">，评测时以同等文法随机参数生成。</w:t>
-      </w:r>
-      <w:r>
-        <w:t xml:space="preserve"> </w:t>
-      </w:r>
-      <w:r>
-        <w:rPr>
-          <w:rFonts w:hint="eastAsia"/>
+          <w:rFonts w:hint="eastAsia" w:ascii="Arial Unicode MS" w:hAnsi="Arial Unicode MS" w:cs="Arial Unicode MS" w:eastAsia="Arial Unicode MS"/>
+          <w:b/>
+          <w:bCs/>
+        </w:rPr>
+        <w:t xml:space="preserve">公开供自测，其余由组织方评测器在内存中按私有种子生成</w:t>
+      </w:r>
+      <w:r>
+        <w:rPr>
+          <w:rFonts w:hint="eastAsia" w:ascii="Arial Unicode MS" w:hAnsi="Arial Unicode MS" w:cs="Arial Unicode MS" w:eastAsia="Arial Unicode MS"/>
+        </w:rPr>
+        <w:t xml:space="preserve">。每个</w:t>
+      </w:r>
+      <w:r>
+        <w:t xml:space="preserve"> case </w:t>
+      </w:r>
+      <w:r>
+        <w:rPr>
+          <w:rFonts w:hint="eastAsia" w:ascii="Arial Unicode MS" w:hAnsi="Arial Unicode MS" w:cs="Arial Unicode MS" w:eastAsia="Arial Unicode MS"/>
+        </w:rPr>
+        <w:t xml:space="preserve">在隔离子进程中执行，选手进程只收到当前输入，不会获得理想分布文件。</w:t>
+      </w:r>
+      <w:r>
+        <w:t xml:space="preserve"> </w:t>
+      </w:r>
+      <w:r>
+        <w:rPr>
+          <w:rFonts w:hint="eastAsia" w:ascii="Arial Unicode MS" w:hAnsi="Arial Unicode MS" w:cs="Arial Unicode MS" w:eastAsia="Arial Unicode MS"/>
         </w:rPr>
         <w:t xml:space="preserve">选手转译后的电路在</w:t>
       </w:r>
       <w:r>
         <w:rPr>
-          <w:rFonts w:hint="eastAsia"/>
+          <w:rFonts w:hint="eastAsia" w:ascii="Arial Unicode MS" w:hAnsi="Arial Unicode MS" w:cs="Arial Unicode MS" w:eastAsia="Arial Unicode MS"/>
           <w:b/>
           <w:bCs/>
         </w:rPr>
@@ -3594,7 +3746,7 @@
       </w:r>
       <w:r>
         <w:rPr>
-          <w:rFonts w:hint="eastAsia"/>
+          <w:rFonts w:hint="eastAsia" w:ascii="Arial Unicode MS" w:hAnsi="Arial Unicode MS" w:cs="Arial Unicode MS" w:eastAsia="Arial Unicode MS"/>
         </w:rPr>
         <w:t xml:space="preserve">上以</w:t>
       </w:r>
@@ -3613,7 +3765,7 @@
       </w:r>
       <w:r>
         <w:rPr>
-          <w:rFonts w:hint="eastAsia"/>
+          <w:rFonts w:hint="eastAsia" w:ascii="Arial Unicode MS" w:hAnsi="Arial Unicode MS" w:cs="Arial Unicode MS" w:eastAsia="Arial Unicode MS"/>
         </w:rPr>
         <w:t xml:space="preserve">采样，得到分布</w:t>
       </w:r>
@@ -3627,7 +3779,7 @@
       </m:oMath>
       <w:r>
         <w:rPr>
-          <w:rFonts w:hint="eastAsia"/>
+          <w:rFonts w:hint="eastAsia" w:ascii="Arial Unicode MS" w:hAnsi="Arial Unicode MS" w:cs="Arial Unicode MS" w:eastAsia="Arial Unicode MS"/>
         </w:rPr>
         <w:t xml:space="preserve">，与理想分布</w:t>
       </w:r>
@@ -3644,7 +3796,7 @@
       </w:r>
       <w:r>
         <w:rPr>
-          <w:rFonts w:hint="eastAsia"/>
+          <w:rFonts w:hint="eastAsia" w:ascii="Arial Unicode MS" w:hAnsi="Arial Unicode MS" w:cs="Arial Unicode MS" w:eastAsia="Arial Unicode MS"/>
         </w:rPr>
         <w:t xml:space="preserve">计算</w:t>
       </w:r>
@@ -3653,7 +3805,7 @@
       </w:r>
       <w:r>
         <w:rPr>
-          <w:rFonts w:hint="eastAsia"/>
+          <w:rFonts w:hint="eastAsia" w:ascii="Arial Unicode MS" w:hAnsi="Arial Unicode MS" w:cs="Arial Unicode MS" w:eastAsia="Arial Unicode MS"/>
         </w:rPr>
         <w:t xml:space="preserve">保真度：</w:t>
       </w:r>
@@ -3887,7 +4039,7 @@
       </w:pPr>
       <w:r>
         <w:rPr>
-          <w:rFonts w:hint="eastAsia"/>
+          <w:rFonts w:hint="eastAsia" w:ascii="Arial Unicode MS" w:hAnsi="Arial Unicode MS" w:cs="Arial Unicode MS" w:eastAsia="Arial Unicode MS"/>
           <w:b/>
           <w:bCs/>
         </w:rPr>
@@ -3902,7 +4054,7 @@
       </w:r>
       <w:r>
         <w:rPr>
-          <w:rFonts w:hint="eastAsia"/>
+          <w:rFonts w:hint="eastAsia" w:ascii="Arial Unicode MS" w:hAnsi="Arial Unicode MS" w:cs="Arial Unicode MS" w:eastAsia="Arial Unicode MS"/>
         </w:rPr>
         <w:t xml:space="preserve">。（该阈值已为</w:t>
       </w:r>
@@ -3911,7 +4063,7 @@
       </w:r>
       <w:r>
         <w:rPr>
-          <w:rFonts w:hint="eastAsia"/>
+          <w:rFonts w:hint="eastAsia" w:ascii="Arial Unicode MS" w:hAnsi="Arial Unicode MS" w:cs="Arial Unicode MS" w:eastAsia="Arial Unicode MS"/>
         </w:rPr>
         <w:t xml:space="preserve">的统计涨落留出余量：完美实现的期望保真度约</w:t>
       </w:r>
@@ -3920,7 +4072,7 @@
       </w:r>
       <w:r>
         <w:rPr>
-          <w:rFonts w:hint="eastAsia"/>
+          <w:rFonts w:hint="eastAsia" w:ascii="Arial Unicode MS" w:hAnsi="Arial Unicode MS" w:cs="Arial Unicode MS" w:eastAsia="Arial Unicode MS"/>
         </w:rPr>
         <w:t xml:space="preserve">0.99+，而任何门级转译错误都会使保真度骤降至</w:t>
       </w:r>
@@ -3929,7 +4081,7 @@
       </w:r>
       <w:r>
         <w:rPr>
-          <w:rFonts w:hint="eastAsia"/>
+          <w:rFonts w:hint="eastAsia" w:ascii="Arial Unicode MS" w:hAnsi="Arial Unicode MS" w:cs="Arial Unicode MS" w:eastAsia="Arial Unicode MS"/>
         </w:rPr>
         <w:t xml:space="preserve">以下，区分度充分。）</w:t>
       </w:r>
@@ -3944,7 +4096,7 @@
       </w:pPr>
       <w:r>
         <w:rPr>
-          <w:rFonts w:hint="eastAsia"/>
+          <w:rFonts w:hint="eastAsia" w:ascii="Arial Unicode MS" w:hAnsi="Arial Unicode MS" w:cs="Arial Unicode MS" w:eastAsia="Arial Unicode MS"/>
           <w:b/>
           <w:bCs/>
         </w:rPr>
@@ -3959,7 +4111,7 @@
       </w:r>
       <w:r>
         <w:rPr>
-          <w:rFonts w:hint="eastAsia"/>
+          <w:rFonts w:hint="eastAsia" w:ascii="Arial Unicode MS" w:hAnsi="Arial Unicode MS" w:cs="Arial Unicode MS" w:eastAsia="Arial Unicode MS"/>
           <w:b/>
           <w:bCs/>
         </w:rPr>
@@ -3967,7 +4119,7 @@
       </w:r>
       <w:r>
         <w:rPr>
-          <w:rFonts w:hint="eastAsia"/>
+          <w:rFonts w:hint="eastAsia" w:ascii="Arial Unicode MS" w:hAnsi="Arial Unicode MS" w:cs="Arial Unicode MS" w:eastAsia="Arial Unicode MS"/>
         </w:rPr>
         <w:t xml:space="preserve">：提交各平台真机返回的原始</w:t>
       </w:r>
@@ -3982,7 +4134,7 @@
       </w:r>
       <w:r>
         <w:rPr>
-          <w:rFonts w:hint="eastAsia"/>
+          <w:rFonts w:hint="eastAsia" w:ascii="Arial Unicode MS" w:hAnsi="Arial Unicode MS" w:cs="Arial Unicode MS" w:eastAsia="Arial Unicode MS"/>
         </w:rPr>
         <w:t xml:space="preserve">，评测组核验：</w:t>
       </w:r>
@@ -4000,7 +4152,7 @@
       </w:r>
       <w:r>
         <w:rPr>
-          <w:rFonts w:hint="eastAsia"/>
+          <w:rFonts w:hint="eastAsia" w:ascii="Arial Unicode MS" w:hAnsi="Arial Unicode MS" w:cs="Arial Unicode MS" w:eastAsia="Arial Unicode MS"/>
         </w:rPr>
         <w:t xml:space="preserve">合法且字段完整；</w:t>
       </w:r>
@@ -4024,7 +4176,7 @@
       </w:r>
       <w:r>
         <w:rPr>
-          <w:rFonts w:hint="eastAsia"/>
+          <w:rFonts w:hint="eastAsia" w:ascii="Arial Unicode MS" w:hAnsi="Arial Unicode MS" w:cs="Arial Unicode MS" w:eastAsia="Arial Unicode MS"/>
         </w:rPr>
         <w:t xml:space="preserve">的</w:t>
       </w:r>
@@ -4040,7 +4192,7 @@
       </w:r>
       <w:r>
         <w:rPr>
-          <w:rFonts w:hint="eastAsia"/>
+          <w:rFonts w:hint="eastAsia" w:ascii="Arial Unicode MS" w:hAnsi="Arial Unicode MS" w:cs="Arial Unicode MS" w:eastAsia="Arial Unicode MS"/>
           <w:b/>
           <w:bCs/>
         </w:rPr>
@@ -4048,7 +4200,7 @@
       </w:r>
       <w:r>
         <w:rPr>
-          <w:rFonts w:hint="eastAsia"/>
+          <w:rFonts w:hint="eastAsia" w:ascii="Arial Unicode MS" w:hAnsi="Arial Unicode MS" w:cs="Arial Unicode MS" w:eastAsia="Arial Unicode MS"/>
         </w:rPr>
         <w:t xml:space="preserve">与理想分布一致（真机允许噪声，只查主峰命中）；</w:t>
       </w:r>
@@ -4072,7 +4224,7 @@
       </w:r>
       <w:r>
         <w:rPr>
-          <w:rFonts w:hint="eastAsia"/>
+          <w:rFonts w:hint="eastAsia" w:ascii="Arial Unicode MS" w:hAnsi="Arial Unicode MS" w:cs="Arial Unicode MS" w:eastAsia="Arial Unicode MS"/>
         </w:rPr>
         <w:t xml:space="preserve">可在对应平台控制台溯源、</w:t>
       </w:r>
@@ -4087,13 +4239,13 @@
       </w:r>
       <w:r>
         <w:rPr>
-          <w:rFonts w:hint="eastAsia"/>
+          <w:rFonts w:hint="eastAsia" w:ascii="Arial Unicode MS" w:hAnsi="Arial Unicode MS" w:cs="Arial Unicode MS" w:eastAsia="Arial Unicode MS"/>
         </w:rPr>
         <w:t xml:space="preserve">落在赛程窗口内。</w:t>
       </w:r>
       <w:r>
         <w:rPr>
-          <w:rFonts w:hint="eastAsia"/>
+          <w:rFonts w:hint="eastAsia" w:ascii="Arial Unicode MS" w:hAnsi="Arial Unicode MS" w:cs="Arial Unicode MS" w:eastAsia="Arial Unicode MS"/>
           <w:b/>
           <w:bCs/>
         </w:rPr>
@@ -4108,7 +4260,7 @@
       </w:r>
       <w:r>
         <w:rPr>
-          <w:rFonts w:hint="eastAsia"/>
+          <w:rFonts w:hint="eastAsia" w:ascii="Arial Unicode MS" w:hAnsi="Arial Unicode MS" w:cs="Arial Unicode MS" w:eastAsia="Arial Unicode MS"/>
         </w:rPr>
         <w:t xml:space="preserve">，无法溯源的记录按无效处理。</w:t>
       </w:r>
@@ -4126,7 +4278,7 @@
       </w:r>
       <w:r>
         <w:rPr>
-          <w:rFonts w:hint="eastAsia"/>
+          <w:rFonts w:hint="eastAsia" w:ascii="Arial Unicode MS" w:hAnsi="Arial Unicode MS" w:cs="Arial Unicode MS" w:eastAsia="Arial Unicode MS"/>
           <w:b/>
           <w:bCs/>
         </w:rPr>
@@ -4134,7 +4286,7 @@
       </w:r>
       <w:r>
         <w:rPr>
-          <w:rFonts w:hint="eastAsia"/>
+          <w:rFonts w:hint="eastAsia" w:ascii="Arial Unicode MS" w:hAnsi="Arial Unicode MS" w:cs="Arial Unicode MS" w:eastAsia="Arial Unicode MS"/>
         </w:rPr>
         <w:t xml:space="preserve">（每一档都是新手可企及的”下一步”）：</w:t>
       </w:r>
@@ -4162,7 +4314,7 @@
             </w:pPr>
             <w:r>
               <w:rPr>
-                <w:rFonts w:hint="eastAsia"/>
+                <w:rFonts w:hint="eastAsia" w:ascii="Arial Unicode MS" w:hAnsi="Arial Unicode MS" w:cs="Arial Unicode MS" w:eastAsia="Arial Unicode MS"/>
               </w:rPr>
               <w:t xml:space="preserve">档位</w:t>
             </w:r>
@@ -4176,7 +4328,7 @@
             </w:pPr>
             <w:r>
               <w:rPr>
-                <w:rFonts w:hint="eastAsia"/>
+                <w:rFonts w:hint="eastAsia" w:ascii="Arial Unicode MS" w:hAnsi="Arial Unicode MS" w:cs="Arial Unicode MS" w:eastAsia="Arial Unicode MS"/>
               </w:rPr>
               <w:t xml:space="preserve">条件</w:t>
             </w:r>
@@ -4191,7 +4343,7 @@
             </w:pPr>
             <w:r>
               <w:rPr>
-                <w:rFonts w:hint="eastAsia"/>
+                <w:rFonts w:hint="eastAsia" w:ascii="Arial Unicode MS" w:hAnsi="Arial Unicode MS" w:cs="Arial Unicode MS" w:eastAsia="Arial Unicode MS"/>
               </w:rPr>
               <w:t xml:space="preserve">分值</w:t>
             </w:r>
@@ -4207,7 +4359,7 @@
             </w:pPr>
             <w:r>
               <w:rPr>
-                <w:rFonts w:hint="eastAsia"/>
+                <w:rFonts w:hint="eastAsia" w:ascii="Arial Unicode MS" w:hAnsi="Arial Unicode MS" w:cs="Arial Unicode MS" w:eastAsia="Arial Unicode MS"/>
               </w:rPr>
               <w:t xml:space="preserve">入门（评奖资格线）</w:t>
             </w:r>
@@ -4221,7 +4373,7 @@
             </w:pPr>
             <w:r>
               <w:rPr>
-                <w:rFonts w:hint="eastAsia"/>
+                <w:rFonts w:hint="eastAsia" w:ascii="Arial Unicode MS" w:hAnsi="Arial Unicode MS" w:cs="Arial Unicode MS" w:eastAsia="Arial Unicode MS"/>
               </w:rPr>
               <w:t xml:space="preserve">同一中间层在</w:t>
             </w:r>
@@ -4230,7 +4382,7 @@
             </w:r>
             <w:r>
               <w:rPr>
-                <w:rFonts w:hint="eastAsia"/>
+                <w:rFonts w:hint="eastAsia" w:ascii="Arial Unicode MS" w:hAnsi="Arial Unicode MS" w:cs="Arial Unicode MS" w:eastAsia="Arial Unicode MS"/>
               </w:rPr>
               <w:t xml:space="preserve">个模拟器后端跑通公开电路</w:t>
             </w:r>
@@ -4258,7 +4410,7 @@
             </w:pPr>
             <w:r>
               <w:rPr>
-                <w:rFonts w:hint="eastAsia"/>
+                <w:rFonts w:hint="eastAsia" w:ascii="Arial Unicode MS" w:hAnsi="Arial Unicode MS" w:cs="Arial Unicode MS" w:eastAsia="Arial Unicode MS"/>
               </w:rPr>
               <w:t xml:space="preserve">进阶</w:t>
             </w:r>
@@ -4272,7 +4424,7 @@
             </w:pPr>
             <w:r>
               <w:rPr>
-                <w:rFonts w:hint="eastAsia"/>
+                <w:rFonts w:hint="eastAsia" w:ascii="Arial Unicode MS" w:hAnsi="Arial Unicode MS" w:cs="Arial Unicode MS" w:eastAsia="Arial Unicode MS"/>
               </w:rPr>
               <w:t xml:space="preserve">第三个平台打通</w:t>
             </w:r>
@@ -4281,7 +4433,7 @@
             </w:r>
             <w:r>
               <w:rPr>
-                <w:rFonts w:hint="eastAsia"/>
+                <w:rFonts w:hint="eastAsia" w:ascii="Arial Unicode MS" w:hAnsi="Arial Unicode MS" w:cs="Arial Unicode MS" w:eastAsia="Arial Unicode MS"/>
               </w:rPr>
               <w:t xml:space="preserve">隐藏电路保真度达标，按覆盖度线性计分</w:t>
             </w:r>
@@ -4296,7 +4448,7 @@
             </w:pPr>
             <w:r>
               <w:rPr>
-                <w:rFonts w:hint="eastAsia"/>
+                <w:rFonts w:hint="eastAsia" w:ascii="Arial Unicode MS" w:hAnsi="Arial Unicode MS" w:cs="Arial Unicode MS" w:eastAsia="Arial Unicode MS"/>
               </w:rPr>
               <w:t xml:space="preserve">至</w:t>
             </w:r>
@@ -4315,7 +4467,7 @@
             </w:pPr>
             <w:r>
               <w:rPr>
-                <w:rFonts w:hint="eastAsia"/>
+                <w:rFonts w:hint="eastAsia" w:ascii="Arial Unicode MS" w:hAnsi="Arial Unicode MS" w:cs="Arial Unicode MS" w:eastAsia="Arial Unicode MS"/>
               </w:rPr>
               <w:t xml:space="preserve">真机</w:t>
             </w:r>
@@ -4329,7 +4481,7 @@
             </w:pPr>
             <w:r>
               <w:rPr>
-                <w:rFonts w:hint="eastAsia"/>
+                <w:rFonts w:hint="eastAsia" w:ascii="Arial Unicode MS" w:hAnsi="Arial Unicode MS" w:cs="Arial Unicode MS" w:eastAsia="Arial Unicode MS"/>
               </w:rPr>
               <w:t xml:space="preserve">每个平台真机主峰命中</w:t>
             </w:r>
@@ -4338,7 +4490,7 @@
             </w:r>
             <w:r>
               <w:rPr>
-                <w:rFonts w:hint="eastAsia"/>
+                <w:rFonts w:hint="eastAsia" w:ascii="Arial Unicode MS" w:hAnsi="Arial Unicode MS" w:cs="Arial Unicode MS" w:eastAsia="Arial Unicode MS"/>
               </w:rPr>
               <w:t xml:space="preserve">+5（至多</w:t>
             </w:r>
@@ -4347,7 +4499,7 @@
             </w:r>
             <w:r>
               <w:rPr>
-                <w:rFonts w:hint="eastAsia"/>
+                <w:rFonts w:hint="eastAsia" w:ascii="Arial Unicode MS" w:hAnsi="Arial Unicode MS" w:cs="Arial Unicode MS" w:eastAsia="Arial Unicode MS"/>
               </w:rPr>
               <w:t xml:space="preserve">个平台）</w:t>
             </w:r>
@@ -4375,7 +4527,7 @@
             </w:pPr>
             <w:r>
               <w:rPr>
-                <w:rFonts w:hint="eastAsia"/>
+                <w:rFonts w:hint="eastAsia" w:ascii="Arial Unicode MS" w:hAnsi="Arial Unicode MS" w:cs="Arial Unicode MS" w:eastAsia="Arial Unicode MS"/>
               </w:rPr>
               <w:t xml:space="preserve">满分</w:t>
             </w:r>
@@ -4389,7 +4541,7 @@
             </w:pPr>
             <w:r>
               <w:rPr>
-                <w:rFonts w:hint="eastAsia"/>
+                <w:rFonts w:hint="eastAsia" w:ascii="Arial Unicode MS" w:hAnsi="Arial Unicode MS" w:cs="Arial Unicode MS" w:eastAsia="Arial Unicode MS"/>
               </w:rPr>
               <w:t xml:space="preserve">三平台统一适配</w:t>
             </w:r>
@@ -4398,7 +4550,7 @@
             </w:r>
             <w:r>
               <w:rPr>
-                <w:rFonts w:hint="eastAsia"/>
+                <w:rFonts w:hint="eastAsia" w:ascii="Arial Unicode MS" w:hAnsi="Arial Unicode MS" w:cs="Arial Unicode MS" w:eastAsia="Arial Unicode MS"/>
               </w:rPr>
               <w:t xml:space="preserve">电路全过</w:t>
             </w:r>
@@ -4407,7 +4559,7 @@
             </w:r>
             <w:r>
               <w:rPr>
-                <w:rFonts w:hint="eastAsia"/>
+                <w:rFonts w:hint="eastAsia" w:ascii="Arial Unicode MS" w:hAnsi="Arial Unicode MS" w:cs="Arial Unicode MS" w:eastAsia="Arial Unicode MS"/>
               </w:rPr>
               <w:t xml:space="preserve">平台真机</w:t>
             </w:r>
@@ -4442,7 +4594,7 @@
       </w:r>
       <w:r>
         <w:rPr>
-          <w:rFonts w:hint="eastAsia"/>
+          <w:rFonts w:hint="eastAsia" w:ascii="Arial Unicode MS" w:hAnsi="Arial Unicode MS" w:cs="Arial Unicode MS" w:eastAsia="Arial Unicode MS"/>
         </w:rPr>
         <w:t xml:space="preserve">判定（30</w:t>
       </w:r>
@@ -4451,7 +4603,7 @@
       </w:r>
       <w:r>
         <w:rPr>
-          <w:rFonts w:hint="eastAsia"/>
+          <w:rFonts w:hint="eastAsia" w:ascii="Arial Unicode MS" w:hAnsi="Arial Unicode MS" w:cs="Arial Unicode MS" w:eastAsia="Arial Unicode MS"/>
         </w:rPr>
         <w:t xml:space="preserve">分）：智能体客观评测与交互体验</w:t>
       </w:r>
@@ -4466,7 +4618,7 @@
       </w:pPr>
       <w:r>
         <w:rPr>
-          <w:rFonts w:hint="eastAsia"/>
+          <w:rFonts w:hint="eastAsia" w:ascii="Arial Unicode MS" w:hAnsi="Arial Unicode MS" w:cs="Arial Unicode MS" w:eastAsia="Arial Unicode MS"/>
           <w:b/>
           <w:bCs/>
         </w:rPr>
@@ -4481,7 +4633,7 @@
       </w:r>
       <w:r>
         <w:rPr>
-          <w:rFonts w:hint="eastAsia"/>
+          <w:rFonts w:hint="eastAsia" w:ascii="Arial Unicode MS" w:hAnsi="Arial Unicode MS" w:cs="Arial Unicode MS" w:eastAsia="Arial Unicode MS"/>
           <w:b/>
           <w:bCs/>
         </w:rPr>
@@ -4496,7 +4648,7 @@
       </w:r>
       <w:r>
         <w:rPr>
-          <w:rFonts w:hint="eastAsia"/>
+          <w:rFonts w:hint="eastAsia" w:ascii="Arial Unicode MS" w:hAnsi="Arial Unicode MS" w:cs="Arial Unicode MS" w:eastAsia="Arial Unicode MS"/>
           <w:b/>
           <w:bCs/>
         </w:rPr>
@@ -4504,7 +4656,7 @@
       </w:r>
       <w:r>
         <w:rPr>
-          <w:rFonts w:hint="eastAsia"/>
+          <w:rFonts w:hint="eastAsia" w:ascii="Arial Unicode MS" w:hAnsi="Arial Unicode MS" w:cs="Arial Unicode MS" w:eastAsia="Arial Unicode MS"/>
         </w:rPr>
         <w:t xml:space="preserve">：评测系统向</w:t>
       </w:r>
@@ -4522,13 +4674,13 @@
       </w:r>
       <w:r>
         <w:rPr>
-          <w:rFonts w:hint="eastAsia"/>
+          <w:rFonts w:hint="eastAsia" w:ascii="Arial Unicode MS" w:hAnsi="Arial Unicode MS" w:cs="Arial Unicode MS" w:eastAsia="Arial Unicode MS"/>
         </w:rPr>
         <w:t xml:space="preserve">注入三类任务，</w:t>
       </w:r>
       <w:r>
         <w:rPr>
-          <w:rFonts w:hint="eastAsia"/>
+          <w:rFonts w:hint="eastAsia" w:ascii="Arial Unicode MS" w:hAnsi="Arial Unicode MS" w:cs="Arial Unicode MS" w:eastAsia="Arial Unicode MS"/>
           <w:b/>
           <w:bCs/>
         </w:rPr>
@@ -4543,7 +4695,7 @@
       </w:r>
       <w:r>
         <w:rPr>
-          <w:rFonts w:hint="eastAsia"/>
+          <w:rFonts w:hint="eastAsia" w:ascii="Arial Unicode MS" w:hAnsi="Arial Unicode MS" w:cs="Arial Unicode MS" w:eastAsia="Arial Unicode MS"/>
           <w:b/>
           <w:bCs/>
         </w:rPr>
@@ -4551,7 +4703,7 @@
       </w:r>
       <w:r>
         <w:rPr>
-          <w:rFonts w:hint="eastAsia"/>
+          <w:rFonts w:hint="eastAsia" w:ascii="Arial Unicode MS" w:hAnsi="Arial Unicode MS" w:cs="Arial Unicode MS" w:eastAsia="Arial Unicode MS"/>
         </w:rPr>
         <w:t xml:space="preserve">（改写措辞、更换比特数与目标态），下面仅为示例形态：</w:t>
       </w:r>
@@ -4566,7 +4718,7 @@
       </w:pPr>
       <w:r>
         <w:rPr>
-          <w:rFonts w:hint="eastAsia"/>
+          <w:rFonts w:hint="eastAsia" w:ascii="Arial Unicode MS" w:hAnsi="Arial Unicode MS" w:cs="Arial Unicode MS" w:eastAsia="Arial Unicode MS"/>
           <w:b/>
           <w:bCs/>
         </w:rPr>
@@ -4574,13 +4726,13 @@
       </w:r>
       <w:r>
         <w:rPr>
-          <w:rFonts w:hint="eastAsia"/>
+          <w:rFonts w:hint="eastAsia" w:ascii="Arial Unicode MS" w:hAnsi="Arial Unicode MS" w:cs="Arial Unicode MS" w:eastAsia="Arial Unicode MS"/>
         </w:rPr>
         <w:t xml:space="preserve">：</w:t>
       </w:r>
       <w:r>
         <w:rPr>
-          <w:rFonts w:hint="eastAsia"/>
+          <w:rFonts w:hint="eastAsia" w:ascii="Arial Unicode MS" w:hAnsi="Arial Unicode MS" w:cs="Arial Unicode MS" w:eastAsia="Arial Unicode MS"/>
           <w:i/>
           <w:iCs/>
         </w:rPr>
@@ -4595,7 +4747,7 @@
       </w:r>
       <w:r>
         <w:rPr>
-          <w:rFonts w:hint="eastAsia"/>
+          <w:rFonts w:hint="eastAsia" w:ascii="Arial Unicode MS" w:hAnsi="Arial Unicode MS" w:cs="Arial Unicode MS" w:eastAsia="Arial Unicode MS"/>
           <w:i/>
           <w:iCs/>
         </w:rPr>
@@ -4610,7 +4762,7 @@
       </w:r>
       <w:r>
         <w:rPr>
-          <w:rFonts w:hint="eastAsia"/>
+          <w:rFonts w:hint="eastAsia" w:ascii="Arial Unicode MS" w:hAnsi="Arial Unicode MS" w:cs="Arial Unicode MS" w:eastAsia="Arial Unicode MS"/>
           <w:i/>
           <w:iCs/>
         </w:rPr>
@@ -4624,7 +4776,7 @@
       </w:r>
       <w:r>
         <w:rPr>
-          <w:rFonts w:hint="eastAsia"/>
+          <w:rFonts w:hint="eastAsia" w:ascii="Arial Unicode MS" w:hAnsi="Arial Unicode MS" w:cs="Arial Unicode MS" w:eastAsia="Arial Unicode MS"/>
         </w:rPr>
         <w:t xml:space="preserve">产物</w:t>
       </w:r>
@@ -4633,7 +4785,7 @@
       </w:r>
       <w:r>
         <w:rPr>
-          <w:rFonts w:hint="eastAsia"/>
+          <w:rFonts w:hint="eastAsia" w:ascii="Arial Unicode MS" w:hAnsi="Arial Unicode MS" w:cs="Arial Unicode MS" w:eastAsia="Arial Unicode MS"/>
         </w:rPr>
         <w:t xml:space="preserve">经无噪声模拟器验证，Fidelity</w:t>
       </w:r>
@@ -4642,7 +4794,7 @@
       </w:r>
       <w:r>
         <w:rPr>
-          <w:rFonts w:hint="eastAsia"/>
+          <w:rFonts w:hint="eastAsia" w:ascii="Arial Unicode MS" w:hAnsi="Arial Unicode MS" w:cs="Arial Unicode MS" w:eastAsia="Arial Unicode MS"/>
         </w:rPr>
         <w:t xml:space="preserve">视为通过。</w:t>
       </w:r>
@@ -4657,7 +4809,7 @@
       </w:pPr>
       <w:r>
         <w:rPr>
-          <w:rFonts w:hint="eastAsia"/>
+          <w:rFonts w:hint="eastAsia" w:ascii="Arial Unicode MS" w:hAnsi="Arial Unicode MS" w:cs="Arial Unicode MS" w:eastAsia="Arial Unicode MS"/>
           <w:b/>
           <w:bCs/>
         </w:rPr>
@@ -4665,13 +4817,13 @@
       </w:r>
       <w:r>
         <w:rPr>
-          <w:rFonts w:hint="eastAsia"/>
+          <w:rFonts w:hint="eastAsia" w:ascii="Arial Unicode MS" w:hAnsi="Arial Unicode MS" w:cs="Arial Unicode MS" w:eastAsia="Arial Unicode MS"/>
         </w:rPr>
         <w:t xml:space="preserve">：</w:t>
       </w:r>
       <w:r>
         <w:rPr>
-          <w:rFonts w:hint="eastAsia"/>
+          <w:rFonts w:hint="eastAsia" w:ascii="Arial Unicode MS" w:hAnsi="Arial Unicode MS" w:cs="Arial Unicode MS" w:eastAsia="Arial Unicode MS"/>
           <w:i/>
           <w:iCs/>
         </w:rPr>
@@ -4687,7 +4839,7 @@
       </w:r>
       <w:r>
         <w:rPr>
-          <w:rFonts w:hint="eastAsia"/>
+          <w:rFonts w:hint="eastAsia" w:ascii="Arial Unicode MS" w:hAnsi="Arial Unicode MS" w:cs="Arial Unicode MS" w:eastAsia="Arial Unicode MS"/>
           <w:i/>
           <w:iCs/>
         </w:rPr>
@@ -4701,13 +4853,13 @@
       </w:r>
       <w:r>
         <w:rPr>
-          <w:rFonts w:hint="eastAsia"/>
+          <w:rFonts w:hint="eastAsia" w:ascii="Arial Unicode MS" w:hAnsi="Arial Unicode MS" w:cs="Arial Unicode MS" w:eastAsia="Arial Unicode MS"/>
         </w:rPr>
         <w:t xml:space="preserve">中</w:t>
       </w:r>
       <w:r>
         <w:rPr>
-          <w:rFonts w:hint="eastAsia"/>
+          <w:rFonts w:hint="eastAsia" w:ascii="Arial Unicode MS" w:hAnsi="Arial Unicode MS" w:cs="Arial Unicode MS" w:eastAsia="Arial Unicode MS"/>
           <w:b/>
           <w:bCs/>
         </w:rPr>
@@ -4715,7 +4867,7 @@
       </w:r>
       <w:r>
         <w:rPr>
-          <w:rFonts w:hint="eastAsia"/>
+          <w:rFonts w:hint="eastAsia" w:ascii="Arial Unicode MS" w:hAnsi="Arial Unicode MS" w:cs="Arial Unicode MS" w:eastAsia="Arial Unicode MS"/>
         </w:rPr>
         <w:t xml:space="preserve">，修复产物必须在语义上实现该目标态并通过</w:t>
       </w:r>
@@ -4724,7 +4876,7 @@
       </w:r>
       <w:r>
         <w:rPr>
-          <w:rFonts w:hint="eastAsia"/>
+          <w:rFonts w:hint="eastAsia" w:ascii="Arial Unicode MS" w:hAnsi="Arial Unicode MS" w:cs="Arial Unicode MS" w:eastAsia="Arial Unicode MS"/>
         </w:rPr>
         <w:t xml:space="preserve">验证。</w:t>
       </w:r>
@@ -4739,7 +4891,7 @@
       </w:pPr>
       <w:r>
         <w:rPr>
-          <w:rFonts w:hint="eastAsia"/>
+          <w:rFonts w:hint="eastAsia" w:ascii="Arial Unicode MS" w:hAnsi="Arial Unicode MS" w:cs="Arial Unicode MS" w:eastAsia="Arial Unicode MS"/>
           <w:b/>
           <w:bCs/>
         </w:rPr>
@@ -4747,13 +4899,13 @@
       </w:r>
       <w:r>
         <w:rPr>
-          <w:rFonts w:hint="eastAsia"/>
+          <w:rFonts w:hint="eastAsia" w:ascii="Arial Unicode MS" w:hAnsi="Arial Unicode MS" w:cs="Arial Unicode MS" w:eastAsia="Arial Unicode MS"/>
         </w:rPr>
         <w:t xml:space="preserve">：</w:t>
       </w:r>
       <w:r>
         <w:rPr>
-          <w:rFonts w:hint="eastAsia"/>
+          <w:rFonts w:hint="eastAsia" w:ascii="Arial Unicode MS" w:hAnsi="Arial Unicode MS" w:cs="Arial Unicode MS" w:eastAsia="Arial Unicode MS"/>
           <w:i/>
           <w:iCs/>
         </w:rPr>
@@ -4768,7 +4920,7 @@
       </w:r>
       <w:r>
         <w:rPr>
-          <w:rFonts w:hint="eastAsia"/>
+          <w:rFonts w:hint="eastAsia" w:ascii="Arial Unicode MS" w:hAnsi="Arial Unicode MS" w:cs="Arial Unicode MS" w:eastAsia="Arial Unicode MS"/>
           <w:i/>
           <w:iCs/>
         </w:rPr>
@@ -4782,13 +4934,13 @@
       </w:r>
       <w:r>
         <w:rPr>
-          <w:rFonts w:hint="eastAsia"/>
+          <w:rFonts w:hint="eastAsia" w:ascii="Arial Unicode MS" w:hAnsi="Arial Unicode MS" w:cs="Arial Unicode MS" w:eastAsia="Arial Unicode MS"/>
         </w:rPr>
         <w:t xml:space="preserve">回复须包含一个</w:t>
       </w:r>
       <w:r>
         <w:rPr>
-          <w:rFonts w:hint="eastAsia"/>
+          <w:rFonts w:hint="eastAsia" w:ascii="Arial Unicode MS" w:hAnsi="Arial Unicode MS" w:cs="Arial Unicode MS" w:eastAsia="Arial Unicode MS"/>
           <w:b/>
           <w:bCs/>
         </w:rPr>
@@ -4796,7 +4948,7 @@
       </w:r>
       <w:r>
         <w:rPr>
-          <w:rFonts w:hint="eastAsia"/>
+          <w:rFonts w:hint="eastAsia" w:ascii="Arial Unicode MS" w:hAnsi="Arial Unicode MS" w:cs="Arial Unicode MS" w:eastAsia="Arial Unicode MS"/>
         </w:rPr>
         <w:t xml:space="preserve">（如</w:t>
       </w:r>
@@ -4811,7 +4963,7 @@
       </w:r>
       <w:r>
         <w:rPr>
-          <w:rFonts w:hint="eastAsia"/>
+          <w:rFonts w:hint="eastAsia" w:ascii="Arial Unicode MS" w:hAnsi="Arial Unicode MS" w:cs="Arial Unicode MS" w:eastAsia="Arial Unicode MS"/>
         </w:rPr>
         <w:t xml:space="preserve">），评测按官方《后端能力表》（比特数上限</w:t>
       </w:r>
@@ -4820,7 +4972,7 @@
       </w:r>
       <w:r>
         <w:rPr>
-          <w:rFonts w:hint="eastAsia"/>
+          <w:rFonts w:hint="eastAsia" w:ascii="Arial Unicode MS" w:hAnsi="Arial Unicode MS" w:cs="Arial Unicode MS" w:eastAsia="Arial Unicode MS"/>
         </w:rPr>
         <w:t xml:space="preserve">排队特性</w:t>
       </w:r>
@@ -4829,7 +4981,7 @@
       </w:r>
       <w:r>
         <w:rPr>
-          <w:rFonts w:hint="eastAsia"/>
+          <w:rFonts w:hint="eastAsia" w:ascii="Arial Unicode MS" w:hAnsi="Arial Unicode MS" w:cs="Arial Unicode MS" w:eastAsia="Arial Unicode MS"/>
         </w:rPr>
         <w:t xml:space="preserve">费用，见</w:t>
       </w:r>
@@ -4838,7 +4990,7 @@
       </w:r>
       <w:r>
         <w:rPr>
-          <w:rFonts w:hint="eastAsia"/>
+          <w:rFonts w:hint="eastAsia" w:ascii="Arial Unicode MS" w:hAnsi="Arial Unicode MS" w:cs="Arial Unicode MS" w:eastAsia="Arial Unicode MS"/>
         </w:rPr>
         <w:t xml:space="preserve">的</w:t>
       </w:r>
@@ -4853,7 +5005,7 @@
       </w:r>
       <w:r>
         <w:rPr>
-          <w:rFonts w:hint="eastAsia"/>
+          <w:rFonts w:hint="eastAsia" w:ascii="Arial Unicode MS" w:hAnsi="Arial Unicode MS" w:cs="Arial Unicode MS" w:eastAsia="Arial Unicode MS"/>
         </w:rPr>
         <w:t xml:space="preserve">）核对唯一正确答案集。</w:t>
       </w:r>
@@ -4868,7 +5020,7 @@
       </w:pPr>
       <w:r>
         <w:rPr>
-          <w:rFonts w:hint="eastAsia"/>
+          <w:rFonts w:hint="eastAsia" w:ascii="Arial Unicode MS" w:hAnsi="Arial Unicode MS" w:cs="Arial Unicode MS" w:eastAsia="Arial Unicode MS"/>
         </w:rPr>
         <w:t xml:space="preserve">客观分</w:t>
       </w:r>
@@ -4877,7 +5029,7 @@
       </w:r>
       <w:r>
         <w:rPr>
-          <w:rFonts w:hint="eastAsia"/>
+          <w:rFonts w:hint="eastAsia" w:ascii="Arial Unicode MS" w:hAnsi="Arial Unicode MS" w:cs="Arial Unicode MS" w:eastAsia="Arial Unicode MS"/>
         </w:rPr>
         <w:t xml:space="preserve">各变体通过率</w:t>
       </w:r>
@@ -4895,7 +5047,7 @@
       </w:pPr>
       <w:r>
         <w:rPr>
-          <w:rFonts w:hint="eastAsia"/>
+          <w:rFonts w:hint="eastAsia" w:ascii="Arial Unicode MS" w:hAnsi="Arial Unicode MS" w:cs="Arial Unicode MS" w:eastAsia="Arial Unicode MS"/>
           <w:b/>
           <w:bCs/>
         </w:rPr>
@@ -4910,7 +5062,7 @@
       </w:r>
       <w:r>
         <w:rPr>
-          <w:rFonts w:hint="eastAsia"/>
+          <w:rFonts w:hint="eastAsia" w:ascii="Arial Unicode MS" w:hAnsi="Arial Unicode MS" w:cs="Arial Unicode MS" w:eastAsia="Arial Unicode MS"/>
           <w:b/>
           <w:bCs/>
         </w:rPr>
@@ -4918,7 +5070,7 @@
       </w:r>
       <w:r>
         <w:rPr>
-          <w:rFonts w:hint="eastAsia"/>
+          <w:rFonts w:hint="eastAsia" w:ascii="Arial Unicode MS" w:hAnsi="Arial Unicode MS" w:cs="Arial Unicode MS" w:eastAsia="Arial Unicode MS"/>
         </w:rPr>
         <w:t xml:space="preserve">：评委现场测试</w:t>
       </w:r>
@@ -4927,13 +5079,13 @@
       </w:r>
       <w:r>
         <w:rPr>
-          <w:rFonts w:hint="eastAsia"/>
+          <w:rFonts w:hint="eastAsia" w:ascii="Arial Unicode MS" w:hAnsi="Arial Unicode MS" w:cs="Arial Unicode MS" w:eastAsia="Arial Unicode MS"/>
         </w:rPr>
         <w:t xml:space="preserve">面对零物理背景用户的交互友好度、容错提示与结果可视化。</w:t>
       </w:r>
       <w:r>
         <w:rPr>
-          <w:rFonts w:hint="eastAsia"/>
+          <w:rFonts w:hint="eastAsia" w:ascii="Arial Unicode MS" w:hAnsi="Arial Unicode MS" w:cs="Arial Unicode MS" w:eastAsia="Arial Unicode MS"/>
           <w:b/>
           <w:bCs/>
         </w:rPr>
@@ -4948,7 +5100,7 @@
       </w:r>
       <w:r>
         <w:rPr>
-          <w:rFonts w:hint="eastAsia"/>
+          <w:rFonts w:hint="eastAsia" w:ascii="Arial Unicode MS" w:hAnsi="Arial Unicode MS" w:cs="Arial Unicode MS" w:eastAsia="Arial Unicode MS"/>
           <w:b/>
           <w:bCs/>
         </w:rPr>
@@ -4956,7 +5108,7 @@
       </w:r>
       <w:r>
         <w:rPr>
-          <w:rFonts w:hint="eastAsia"/>
+          <w:rFonts w:hint="eastAsia" w:ascii="Arial Unicode MS" w:hAnsi="Arial Unicode MS" w:cs="Arial Unicode MS" w:eastAsia="Arial Unicode MS"/>
         </w:rPr>
         <w:t xml:space="preserve">，防止”只有故事没有工具”。</w:t>
       </w:r>
@@ -4972,7 +5124,7 @@
       </w:r>
       <w:r>
         <w:rPr>
-          <w:rFonts w:hint="eastAsia"/>
+          <w:rFonts w:hint="eastAsia" w:ascii="Arial Unicode MS" w:hAnsi="Arial Unicode MS" w:cs="Arial Unicode MS" w:eastAsia="Arial Unicode MS"/>
         </w:rPr>
         <w:t xml:space="preserve">判定（15</w:t>
       </w:r>
@@ -4981,7 +5133,7 @@
       </w:r>
       <w:r>
         <w:rPr>
-          <w:rFonts w:hint="eastAsia"/>
+          <w:rFonts w:hint="eastAsia" w:ascii="Arial Unicode MS" w:hAnsi="Arial Unicode MS" w:cs="Arial Unicode MS" w:eastAsia="Arial Unicode MS"/>
         </w:rPr>
         <w:t xml:space="preserve">分）：混合编译正确性</w:t>
       </w:r>
@@ -4996,13 +5148,13 @@
       </w:pPr>
       <w:r>
         <w:rPr>
-          <w:rFonts w:hint="eastAsia"/>
+          <w:rFonts w:hint="eastAsia" w:ascii="Arial Unicode MS" w:hAnsi="Arial Unicode MS" w:cs="Arial Unicode MS" w:eastAsia="Arial Unicode MS"/>
         </w:rPr>
         <w:t xml:space="preserve">评测系统按第三节文法</w:t>
       </w:r>
       <w:r>
         <w:rPr>
-          <w:rFonts w:hint="eastAsia"/>
+          <w:rFonts w:hint="eastAsia" w:ascii="Arial Unicode MS" w:hAnsi="Arial Unicode MS" w:cs="Arial Unicode MS" w:eastAsia="Arial Unicode MS"/>
           <w:b/>
           <w:bCs/>
         </w:rPr>
@@ -5017,7 +5169,7 @@
       </w:r>
       <w:r>
         <w:rPr>
-          <w:rFonts w:hint="eastAsia"/>
+          <w:rFonts w:hint="eastAsia" w:ascii="Arial Unicode MS" w:hAnsi="Arial Unicode MS" w:cs="Arial Unicode MS" w:eastAsia="Arial Unicode MS"/>
           <w:b/>
           <w:bCs/>
         </w:rPr>
@@ -5032,7 +5184,7 @@
       </w:r>
       <w:r>
         <w:rPr>
-          <w:rFonts w:hint="eastAsia"/>
+          <w:rFonts w:hint="eastAsia" w:ascii="Arial Unicode MS" w:hAnsi="Arial Unicode MS" w:cs="Arial Unicode MS" w:eastAsia="Arial Unicode MS"/>
           <w:b/>
           <w:bCs/>
         </w:rPr>
@@ -5040,7 +5192,7 @@
       </w:r>
       <w:r>
         <w:rPr>
-          <w:rFonts w:hint="eastAsia"/>
+          <w:rFonts w:hint="eastAsia" w:ascii="Arial Unicode MS" w:hAnsi="Arial Unicode MS" w:cs="Arial Unicode MS" w:eastAsia="Arial Unicode MS"/>
         </w:rPr>
         <w:t xml:space="preserve">（不同分支结构、不同常量、不同测量位数）。</w:t>
       </w:r>
@@ -5055,7 +5207,7 @@
       </w:pPr>
       <w:r>
         <w:rPr>
-          <w:rFonts w:hint="eastAsia"/>
+          <w:rFonts w:hint="eastAsia" w:ascii="Arial Unicode MS" w:hAnsi="Arial Unicode MS" w:cs="Arial Unicode MS" w:eastAsia="Arial Unicode MS"/>
         </w:rPr>
         <w:t xml:space="preserve">对每组用例：将</w:t>
       </w:r>
@@ -5073,7 +5225,7 @@
       </w:r>
       <w:r>
         <w:rPr>
-          <w:rFonts w:hint="eastAsia"/>
+          <w:rFonts w:hint="eastAsia" w:ascii="Arial Unicode MS" w:hAnsi="Arial Unicode MS" w:cs="Arial Unicode MS" w:eastAsia="Arial Unicode MS"/>
         </w:rPr>
         <w:t xml:space="preserve">输出的</w:t>
       </w:r>
@@ -5082,7 +5234,7 @@
       </w:r>
       <w:r>
         <w:rPr>
-          <w:rFonts w:hint="eastAsia"/>
+          <w:rFonts w:hint="eastAsia" w:ascii="Arial Unicode MS" w:hAnsi="Arial Unicode MS" w:cs="Arial Unicode MS" w:eastAsia="Arial Unicode MS"/>
         </w:rPr>
         <w:t xml:space="preserve">汇编载入官方</w:t>
       </w:r>
@@ -5097,13 +5249,13 @@
       </w:r>
       <w:r>
         <w:rPr>
-          <w:rFonts w:hint="eastAsia"/>
+          <w:rFonts w:hint="eastAsia" w:ascii="Arial Unicode MS" w:hAnsi="Arial Unicode MS" w:cs="Arial Unicode MS" w:eastAsia="Arial Unicode MS"/>
         </w:rPr>
         <w:t xml:space="preserve">，</w:t>
       </w:r>
       <w:r>
         <w:rPr>
-          <w:rFonts w:hint="eastAsia"/>
+          <w:rFonts w:hint="eastAsia" w:ascii="Arial Unicode MS" w:hAnsi="Arial Unicode MS" w:cs="Arial Unicode MS" w:eastAsia="Arial Unicode MS"/>
           <w:b/>
           <w:bCs/>
         </w:rPr>
@@ -5111,7 +5263,7 @@
       </w:r>
       <w:r>
         <w:rPr>
-          <w:rFonts w:hint="eastAsia"/>
+          <w:rFonts w:hint="eastAsia" w:ascii="Arial Unicode MS" w:hAnsi="Arial Unicode MS" w:cs="Arial Unicode MS" w:eastAsia="Arial Unicode MS"/>
         </w:rPr>
         <w:t xml:space="preserve">，逐一比对寄存器终态与参考解释器的结果；同时校验量子操作序列与原电路量子部分语义等价。</w:t>
       </w:r>
@@ -5126,7 +5278,7 @@
       </w:pPr>
       <w:r>
         <w:rPr>
-          <w:rFonts w:hint="eastAsia"/>
+          <w:rFonts w:hint="eastAsia" w:ascii="Arial Unicode MS" w:hAnsi="Arial Unicode MS" w:cs="Arial Unicode MS" w:eastAsia="Arial Unicode MS"/>
         </w:rPr>
         <w:t xml:space="preserve">全部用例、全部注入组合通过得满分；判定完全确定性、无主观分。</w:t>
       </w:r>
@@ -5142,7 +5294,7 @@
       </w:r>
       <w:r>
         <w:rPr>
-          <w:rFonts w:hint="eastAsia"/>
+          <w:rFonts w:hint="eastAsia" w:ascii="Arial Unicode MS" w:hAnsi="Arial Unicode MS" w:cs="Arial Unicode MS" w:eastAsia="Arial Unicode MS"/>
         </w:rPr>
         <w:t xml:space="preserve">工程与产品化叙事（10</w:t>
       </w:r>
@@ -5151,7 +5303,7 @@
       </w:r>
       <w:r>
         <w:rPr>
-          <w:rFonts w:hint="eastAsia"/>
+          <w:rFonts w:hint="eastAsia" w:ascii="Arial Unicode MS" w:hAnsi="Arial Unicode MS" w:cs="Arial Unicode MS" w:eastAsia="Arial Unicode MS"/>
         </w:rPr>
         <w:t xml:space="preserve">分）</w:t>
       </w:r>
@@ -5166,7 +5318,7 @@
       </w:pPr>
       <w:r>
         <w:rPr>
-          <w:rFonts w:hint="eastAsia"/>
+          <w:rFonts w:hint="eastAsia" w:ascii="Arial Unicode MS" w:hAnsi="Arial Unicode MS" w:cs="Arial Unicode MS" w:eastAsia="Arial Unicode MS"/>
         </w:rPr>
         <w:t xml:space="preserve">一键</w:t>
       </w:r>
@@ -5184,7 +5336,7 @@
       </w:r>
       <w:r>
         <w:rPr>
-          <w:rFonts w:hint="eastAsia"/>
+          <w:rFonts w:hint="eastAsia" w:ascii="Arial Unicode MS" w:hAnsi="Arial Unicode MS" w:cs="Arial Unicode MS" w:eastAsia="Arial Unicode MS"/>
         </w:rPr>
         <w:t xml:space="preserve">可复现（评委在干净环境按</w:t>
       </w:r>
@@ -5193,7 +5345,7 @@
       </w:r>
       <w:r>
         <w:rPr>
-          <w:rFonts w:hint="eastAsia"/>
+          <w:rFonts w:hint="eastAsia" w:ascii="Arial Unicode MS" w:hAnsi="Arial Unicode MS" w:cs="Arial Unicode MS" w:eastAsia="Arial Unicode MS"/>
         </w:rPr>
         <w:t xml:space="preserve">一条命令跑通）。</w:t>
       </w:r>
@@ -5208,7 +5360,7 @@
       </w:pPr>
       <w:r>
         <w:rPr>
-          <w:rFonts w:hint="eastAsia"/>
+          <w:rFonts w:hint="eastAsia" w:ascii="Arial Unicode MS" w:hAnsi="Arial Unicode MS" w:cs="Arial Unicode MS" w:eastAsia="Arial Unicode MS"/>
         </w:rPr>
         <w:t xml:space="preserve">代码质量、架构文档清晰。</w:t>
       </w:r>
@@ -5223,7 +5375,7 @@
       </w:pPr>
       <w:r>
         <w:rPr>
-          <w:rFonts w:hint="eastAsia"/>
+          <w:rFonts w:hint="eastAsia" w:ascii="Arial Unicode MS" w:hAnsi="Arial Unicode MS" w:cs="Arial Unicode MS" w:eastAsia="Arial Unicode MS"/>
           <w:b/>
           <w:bCs/>
         </w:rPr>
@@ -5231,7 +5383,7 @@
       </w:r>
       <w:r>
         <w:rPr>
-          <w:rFonts w:hint="eastAsia"/>
+          <w:rFonts w:hint="eastAsia" w:ascii="Arial Unicode MS" w:hAnsi="Arial Unicode MS" w:cs="Arial Unicode MS" w:eastAsia="Arial Unicode MS"/>
         </w:rPr>
         <w:t xml:space="preserve">：你的工具让哪一类原本进不来的人，第一次能用上量子计算？（提供</w:t>
       </w:r>
@@ -5240,7 +5392,7 @@
       </w:r>
       <w:r>
         <w:rPr>
-          <w:rFonts w:hint="eastAsia"/>
+          <w:rFonts w:hint="eastAsia" w:ascii="Arial Unicode MS" w:hAnsi="Arial Unicode MS" w:cs="Arial Unicode MS" w:eastAsia="Arial Unicode MS"/>
         </w:rPr>
         <w:t xml:space="preserve">界面、无代码引导等佐证最佳）</w:t>
       </w:r>
@@ -5256,7 +5408,7 @@
       </w:r>
       <w:r>
         <w:rPr>
-          <w:rFonts w:hint="eastAsia"/>
+          <w:rFonts w:hint="eastAsia" w:ascii="Arial Unicode MS" w:hAnsi="Arial Unicode MS" w:cs="Arial Unicode MS" w:eastAsia="Arial Unicode MS"/>
         </w:rPr>
         <w:t xml:space="preserve">额外加分（最高</w:t>
       </w:r>
@@ -5265,7 +5417,7 @@
       </w:r>
       <w:r>
         <w:rPr>
-          <w:rFonts w:hint="eastAsia"/>
+          <w:rFonts w:hint="eastAsia" w:ascii="Arial Unicode MS" w:hAnsi="Arial Unicode MS" w:cs="Arial Unicode MS" w:eastAsia="Arial Unicode MS"/>
         </w:rPr>
         <w:t xml:space="preserve">分）</w:t>
       </w:r>
@@ -5280,7 +5432,7 @@
       </w:pPr>
       <w:r>
         <w:rPr>
-          <w:rFonts w:hint="eastAsia"/>
+          <w:rFonts w:hint="eastAsia" w:ascii="Arial Unicode MS" w:hAnsi="Arial Unicode MS" w:cs="Arial Unicode MS" w:eastAsia="Arial Unicode MS"/>
           <w:b/>
           <w:bCs/>
         </w:rPr>
@@ -5295,7 +5447,7 @@
       </w:r>
       <w:r>
         <w:rPr>
-          <w:rFonts w:hint="eastAsia"/>
+          <w:rFonts w:hint="eastAsia" w:ascii="Arial Unicode MS" w:hAnsi="Arial Unicode MS" w:cs="Arial Unicode MS" w:eastAsia="Arial Unicode MS"/>
           <w:b/>
           <w:bCs/>
         </w:rPr>
@@ -5303,7 +5455,7 @@
       </w:r>
       <w:r>
         <w:rPr>
-          <w:rFonts w:hint="eastAsia"/>
+          <w:rFonts w:hint="eastAsia" w:ascii="Arial Unicode MS" w:hAnsi="Arial Unicode MS" w:cs="Arial Unicode MS" w:eastAsia="Arial Unicode MS"/>
         </w:rPr>
         <w:t xml:space="preserve">：设计</w:t>
       </w:r>
@@ -5312,7 +5464,7 @@
       </w:r>
       <w:r>
         <w:rPr>
-          <w:rFonts w:hint="eastAsia"/>
+          <w:rFonts w:hint="eastAsia" w:ascii="Arial Unicode MS" w:hAnsi="Arial Unicode MS" w:cs="Arial Unicode MS" w:eastAsia="Arial Unicode MS"/>
         </w:rPr>
         <w:t xml:space="preserve">编码量子操作，需同时提交：①</w:t>
       </w:r>
@@ -5321,7 +5473,7 @@
       </w:r>
       <w:r>
         <w:rPr>
-          <w:rFonts w:hint="eastAsia"/>
+          <w:rFonts w:hint="eastAsia" w:ascii="Arial Unicode MS" w:hAnsi="Arial Unicode MS" w:cs="Arial Unicode MS" w:eastAsia="Arial Unicode MS"/>
         </w:rPr>
         <w:t xml:space="preserve">指令编码规格文档；②</w:t>
       </w:r>
@@ -5330,7 +5482,7 @@
       </w:r>
       <w:r>
         <w:rPr>
-          <w:rFonts w:hint="eastAsia"/>
+          <w:rFonts w:hint="eastAsia" w:ascii="Arial Unicode MS" w:hAnsi="Arial Unicode MS" w:cs="Arial Unicode MS" w:eastAsia="Arial Unicode MS"/>
         </w:rPr>
         <w:t xml:space="preserve">对官方模拟器的扩展实现（fork</w:t>
       </w:r>
@@ -5348,7 +5500,7 @@
       </w:r>
       <w:r>
         <w:rPr>
-          <w:rFonts w:hint="eastAsia"/>
+          <w:rFonts w:hint="eastAsia" w:ascii="Arial Unicode MS" w:hAnsi="Arial Unicode MS" w:cs="Arial Unicode MS" w:eastAsia="Arial Unicode MS"/>
         </w:rPr>
         <w:t xml:space="preserve">增加指令支持）；③</w:t>
       </w:r>
@@ -5357,7 +5509,7 @@
       </w:r>
       <w:r>
         <w:rPr>
-          <w:rFonts w:hint="eastAsia"/>
+          <w:rFonts w:hint="eastAsia" w:ascii="Arial Unicode MS" w:hAnsi="Arial Unicode MS" w:cs="Arial Unicode MS" w:eastAsia="Arial Unicode MS"/>
         </w:rPr>
         <w:t xml:space="preserve">可运行的端到端测试。三者齐备方计分。</w:t>
       </w:r>
@@ -5372,7 +5524,7 @@
       </w:pPr>
       <w:r>
         <w:rPr>
-          <w:rFonts w:hint="eastAsia"/>
+          <w:rFonts w:hint="eastAsia" w:ascii="Arial Unicode MS" w:hAnsi="Arial Unicode MS" w:cs="Arial Unicode MS" w:eastAsia="Arial Unicode MS"/>
           <w:b/>
           <w:bCs/>
         </w:rPr>
@@ -5380,7 +5532,7 @@
       </w:r>
       <w:r>
         <w:rPr>
-          <w:rFonts w:hint="eastAsia"/>
+          <w:rFonts w:hint="eastAsia" w:ascii="Arial Unicode MS" w:hAnsi="Arial Unicode MS" w:cs="Arial Unicode MS" w:eastAsia="Arial Unicode MS"/>
         </w:rPr>
         <w:t xml:space="preserve">：评委主观评定。</w:t>
       </w:r>
@@ -5393,7 +5545,7 @@
       </w:pPr>
       <w:r>
         <w:rPr>
-          <w:rFonts w:hint="eastAsia"/>
+          <w:rFonts w:hint="eastAsia" w:ascii="Arial Unicode MS" w:hAnsi="Arial Unicode MS" w:cs="Arial Unicode MS" w:eastAsia="Arial Unicode MS"/>
         </w:rPr>
         <w:t xml:space="preserve">评分总表</w:t>
       </w:r>
@@ -5421,7 +5573,7 @@
             </w:pPr>
             <w:r>
               <w:rPr>
-                <w:rFonts w:hint="eastAsia"/>
+                <w:rFonts w:hint="eastAsia" w:ascii="Arial Unicode MS" w:hAnsi="Arial Unicode MS" w:cs="Arial Unicode MS" w:eastAsia="Arial Unicode MS"/>
               </w:rPr>
               <w:t xml:space="preserve">模块</w:t>
             </w:r>
@@ -5436,7 +5588,7 @@
             </w:pPr>
             <w:r>
               <w:rPr>
-                <w:rFonts w:hint="eastAsia"/>
+                <w:rFonts w:hint="eastAsia" w:ascii="Arial Unicode MS" w:hAnsi="Arial Unicode MS" w:cs="Arial Unicode MS" w:eastAsia="Arial Unicode MS"/>
               </w:rPr>
               <w:t xml:space="preserve">分值</w:t>
             </w:r>
@@ -5450,7 +5602,7 @@
             </w:pPr>
             <w:r>
               <w:rPr>
-                <w:rFonts w:hint="eastAsia"/>
+                <w:rFonts w:hint="eastAsia" w:ascii="Arial Unicode MS" w:hAnsi="Arial Unicode MS" w:cs="Arial Unicode MS" w:eastAsia="Arial Unicode MS"/>
               </w:rPr>
               <w:t xml:space="preserve">核心考点</w:t>
             </w:r>
@@ -5469,7 +5621,7 @@
             </w:r>
             <w:r>
               <w:rPr>
-                <w:rFonts w:hint="eastAsia"/>
+                <w:rFonts w:hint="eastAsia" w:ascii="Arial Unicode MS" w:hAnsi="Arial Unicode MS" w:cs="Arial Unicode MS" w:eastAsia="Arial Unicode MS"/>
               </w:rPr>
               <w:t xml:space="preserve">通用中间层</w:t>
             </w:r>
@@ -5495,7 +5647,7 @@
             </w:pPr>
             <w:r>
               <w:rPr>
-                <w:rFonts w:hint="eastAsia"/>
+                <w:rFonts w:hint="eastAsia" w:ascii="Arial Unicode MS" w:hAnsi="Arial Unicode MS" w:cs="Arial Unicode MS" w:eastAsia="Arial Unicode MS"/>
               </w:rPr>
               <w:t xml:space="preserve">是否真正”统一”地打通多平台</w:t>
             </w:r>
@@ -5514,7 +5666,7 @@
             </w:r>
             <w:r>
               <w:rPr>
-                <w:rFonts w:hint="eastAsia"/>
+                <w:rFonts w:hint="eastAsia" w:ascii="Arial Unicode MS" w:hAnsi="Arial Unicode MS" w:cs="Arial Unicode MS" w:eastAsia="Arial Unicode MS"/>
               </w:rPr>
               <w:t xml:space="preserve">智能体</w:t>
             </w:r>
@@ -5540,7 +5692,7 @@
             </w:pPr>
             <w:r>
               <w:rPr>
-                <w:rFonts w:hint="eastAsia"/>
+                <w:rFonts w:hint="eastAsia" w:ascii="Arial Unicode MS" w:hAnsi="Arial Unicode MS" w:cs="Arial Unicode MS" w:eastAsia="Arial Unicode MS"/>
               </w:rPr>
               <w:t xml:space="preserve">能否让不懂</w:t>
             </w:r>
@@ -5549,7 +5701,7 @@
             </w:r>
             <w:r>
               <w:rPr>
-                <w:rFonts w:hint="eastAsia"/>
+                <w:rFonts w:hint="eastAsia" w:ascii="Arial Unicode MS" w:hAnsi="Arial Unicode MS" w:cs="Arial Unicode MS" w:eastAsia="Arial Unicode MS"/>
               </w:rPr>
               <w:t xml:space="preserve">的人也能用</w:t>
             </w:r>
@@ -5568,7 +5720,7 @@
             </w:r>
             <w:r>
               <w:rPr>
-                <w:rFonts w:hint="eastAsia"/>
+                <w:rFonts w:hint="eastAsia" w:ascii="Arial Unicode MS" w:hAnsi="Arial Unicode MS" w:cs="Arial Unicode MS" w:eastAsia="Arial Unicode MS"/>
               </w:rPr>
               <w:t xml:space="preserve">混合编译</w:t>
             </w:r>
@@ -5594,7 +5746,7 @@
             </w:pPr>
             <w:r>
               <w:rPr>
-                <w:rFonts w:hint="eastAsia"/>
+                <w:rFonts w:hint="eastAsia" w:ascii="Arial Unicode MS" w:hAnsi="Arial Unicode MS" w:cs="Arial Unicode MS" w:eastAsia="Arial Unicode MS"/>
               </w:rPr>
               <w:t xml:space="preserve">量子-经典混合编译硬核能力</w:t>
             </w:r>
@@ -5610,7 +5762,7 @@
             </w:pPr>
             <w:r>
               <w:rPr>
-                <w:rFonts w:hint="eastAsia"/>
+                <w:rFonts w:hint="eastAsia" w:ascii="Arial Unicode MS" w:hAnsi="Arial Unicode MS" w:cs="Arial Unicode MS" w:eastAsia="Arial Unicode MS"/>
               </w:rPr>
               <w:t xml:space="preserve">工程与产品化</w:t>
             </w:r>
@@ -5636,7 +5788,7 @@
             </w:pPr>
             <w:r>
               <w:rPr>
-                <w:rFonts w:hint="eastAsia"/>
+                <w:rFonts w:hint="eastAsia" w:ascii="Arial Unicode MS" w:hAnsi="Arial Unicode MS" w:cs="Arial Unicode MS" w:eastAsia="Arial Unicode MS"/>
               </w:rPr>
               <w:t xml:space="preserve">可复现、可交付、有叙事</w:t>
             </w:r>
@@ -5683,7 +5835,7 @@
             </w:pPr>
             <w:r>
               <w:rPr>
-                <w:rFonts w:hint="eastAsia"/>
+                <w:rFonts w:hint="eastAsia" w:ascii="Arial Unicode MS" w:hAnsi="Arial Unicode MS" w:cs="Arial Unicode MS" w:eastAsia="Arial Unicode MS"/>
               </w:rPr>
               <w:t xml:space="preserve">极客深度与包容性设计</w:t>
             </w:r>
@@ -5699,7 +5851,7 @@
             </w:pPr>
             <w:r>
               <w:rPr>
-                <w:rFonts w:hint="eastAsia"/>
+                <w:rFonts w:hint="eastAsia" w:ascii="Arial Unicode MS" w:hAnsi="Arial Unicode MS" w:cs="Arial Unicode MS" w:eastAsia="Arial Unicode MS"/>
                 <w:b/>
                 <w:bCs/>
               </w:rPr>
@@ -5749,7 +5901,7 @@
       </w:pPr>
       <w:r>
         <w:rPr>
-          <w:rFonts w:hint="eastAsia"/>
+          <w:rFonts w:hint="eastAsia" w:ascii="Arial Unicode MS" w:hAnsi="Arial Unicode MS" w:cs="Arial Unicode MS" w:eastAsia="Arial Unicode MS"/>
         </w:rPr>
         <w:t xml:space="preserve">六、反作弊与判定诚信条款</w:t>
       </w:r>
@@ -5763,32 +5915,68 @@
       </w:r>
       <w:r>
         <w:rPr>
-          <w:rFonts w:hint="eastAsia"/>
-        </w:rPr>
-        <w:t xml:space="preserve">为降低冷启动门槛内置了</w:t>
-      </w:r>
-      <w:r>
-        <w:t xml:space="preserve"> Mock </w:t>
-      </w:r>
-      <w:r>
-        <w:rPr>
-          <w:rFonts w:hint="eastAsia"/>
-        </w:rPr>
-        <w:t xml:space="preserve">数据与示例应答，</w:t>
-      </w:r>
-      <w:r>
-        <w:rPr>
-          <w:rFonts w:hint="eastAsia"/>
-          <w:b/>
-          <w:bCs/>
-        </w:rPr>
-        <w:t xml:space="preserve">它们只用于帮助你验证接口契约，不是得分捷径</w:t>
-      </w:r>
-      <w:r>
-        <w:rPr>
-          <w:rFonts w:hint="eastAsia"/>
-        </w:rPr>
-        <w:t xml:space="preserve">：</w:t>
+          <w:rFonts w:hint="eastAsia" w:ascii="Arial Unicode MS" w:hAnsi="Arial Unicode MS" w:cs="Arial Unicode MS" w:eastAsia="Arial Unicode MS"/>
+        </w:rPr>
+        <w:t xml:space="preserve">只提供接口骨架、公开电路和公开自测，</w:t>
+      </w:r>
+      <w:r>
+        <w:rPr>
+          <w:rFonts w:hint="eastAsia" w:ascii="Arial Unicode MS" w:hAnsi="Arial Unicode MS" w:cs="Arial Unicode MS" w:eastAsia="Arial Unicode MS"/>
+          <w:b/>
+          <w:bCs/>
+        </w:rPr>
+        <w:t xml:space="preserve">不包含可得分</w:t>
+      </w:r>
+      <w:r>
+        <w:rPr>
+          <w:b/>
+          <w:bCs/>
+        </w:rPr>
+        <w:t xml:space="preserve"> </w:t>
+      </w:r>
+      <w:r>
+        <w:rPr>
+          <w:rFonts w:hint="eastAsia" w:ascii="Arial Unicode MS" w:hAnsi="Arial Unicode MS" w:cs="Arial Unicode MS" w:eastAsia="Arial Unicode MS"/>
+          <w:b/>
+          <w:bCs/>
+        </w:rPr>
+        <w:t xml:space="preserve">Mock、针对评分</w:t>
+      </w:r>
+      <w:r>
+        <w:rPr>
+          <w:b/>
+          <w:bCs/>
+        </w:rPr>
+        <w:t xml:space="preserve"> Prompt </w:t>
+      </w:r>
+      <w:r>
+        <w:rPr>
+          <w:rFonts w:hint="eastAsia" w:ascii="Arial Unicode MS" w:hAnsi="Arial Unicode MS" w:cs="Arial Unicode MS" w:eastAsia="Arial Unicode MS"/>
+          <w:b/>
+          <w:bCs/>
+        </w:rPr>
+        <w:t xml:space="preserve">的示例答案或</w:t>
+      </w:r>
+      <w:r>
+        <w:rPr>
+          <w:b/>
+          <w:bCs/>
+        </w:rPr>
+        <w:t xml:space="preserve"> L3 </w:t>
+      </w:r>
+      <w:r>
+        <w:rPr>
+          <w:rFonts w:hint="eastAsia" w:ascii="Arial Unicode MS" w:hAnsi="Arial Unicode MS" w:cs="Arial Unicode MS" w:eastAsia="Arial Unicode MS"/>
+          <w:b/>
+          <w:bCs/>
+        </w:rPr>
+        <w:t xml:space="preserve">参考实现</w:t>
+      </w:r>
+      <w:r>
+        <w:rPr>
+          <w:rFonts w:hint="eastAsia" w:ascii="Arial Unicode MS" w:hAnsi="Arial Unicode MS" w:cs="Arial Unicode MS" w:eastAsia="Arial Unicode MS"/>
+        </w:rPr>
+        <w:t xml:space="preserve">。原样提交不会获得功能分：</w:t>
       </w:r>
     </w:p>
     <w:p>
@@ -5810,7 +5998,7 @@
       </w:r>
       <w:r>
         <w:rPr>
-          <w:rFonts w:hint="eastAsia"/>
+          <w:rFonts w:hint="eastAsia" w:ascii="Arial Unicode MS" w:hAnsi="Arial Unicode MS" w:cs="Arial Unicode MS" w:eastAsia="Arial Unicode MS"/>
         </w:rPr>
         <w:t xml:space="preserve">中含</w:t>
       </w:r>
@@ -5825,7 +6013,7 @@
       </w:r>
       <w:r>
         <w:rPr>
-          <w:rFonts w:hint="eastAsia"/>
+          <w:rFonts w:hint="eastAsia" w:ascii="Arial Unicode MS" w:hAnsi="Arial Unicode MS" w:cs="Arial Unicode MS" w:eastAsia="Arial Unicode MS"/>
         </w:rPr>
         <w:t xml:space="preserve">、或</w:t>
       </w:r>
@@ -5843,13 +6031,13 @@
       </w:r>
       <w:r>
         <w:rPr>
-          <w:rFonts w:hint="eastAsia"/>
+          <w:rFonts w:hint="eastAsia" w:ascii="Arial Unicode MS" w:hAnsi="Arial Unicode MS" w:cs="Arial Unicode MS" w:eastAsia="Arial Unicode MS"/>
         </w:rPr>
         <w:t xml:space="preserve">无法在对应平台溯源的结果，</w:t>
       </w:r>
       <w:r>
         <w:rPr>
-          <w:rFonts w:hint="eastAsia"/>
+          <w:rFonts w:hint="eastAsia" w:ascii="Arial Unicode MS" w:hAnsi="Arial Unicode MS" w:cs="Arial Unicode MS" w:eastAsia="Arial Unicode MS"/>
           <w:b/>
           <w:bCs/>
         </w:rPr>
@@ -5864,7 +6052,7 @@
       </w:r>
       <w:r>
         <w:rPr>
-          <w:rFonts w:hint="eastAsia"/>
+          <w:rFonts w:hint="eastAsia" w:ascii="Arial Unicode MS" w:hAnsi="Arial Unicode MS" w:cs="Arial Unicode MS" w:eastAsia="Arial Unicode MS"/>
           <w:b/>
           <w:bCs/>
         </w:rPr>
@@ -5887,7 +6075,7 @@
       </w:r>
       <w:r>
         <w:rPr>
-          <w:rFonts w:hint="eastAsia"/>
+          <w:rFonts w:hint="eastAsia" w:ascii="Arial Unicode MS" w:hAnsi="Arial Unicode MS" w:cs="Arial Unicode MS" w:eastAsia="Arial Unicode MS"/>
         </w:rPr>
         <w:t xml:space="preserve">隐藏电路、L2</w:t>
       </w:r>
@@ -5896,7 +6084,7 @@
       </w:r>
       <w:r>
         <w:rPr>
-          <w:rFonts w:hint="eastAsia"/>
+          <w:rFonts w:hint="eastAsia" w:ascii="Arial Unicode MS" w:hAnsi="Arial Unicode MS" w:cs="Arial Unicode MS" w:eastAsia="Arial Unicode MS"/>
         </w:rPr>
         <w:t xml:space="preserve">变体、L3</w:t>
       </w:r>
@@ -5905,13 +6093,13 @@
       </w:r>
       <w:r>
         <w:rPr>
-          <w:rFonts w:hint="eastAsia"/>
+          <w:rFonts w:hint="eastAsia" w:ascii="Arial Unicode MS" w:hAnsi="Arial Unicode MS" w:cs="Arial Unicode MS" w:eastAsia="Arial Unicode MS"/>
         </w:rPr>
         <w:t xml:space="preserve">随机用例均在评测时生成，</w:t>
       </w:r>
       <w:r>
         <w:rPr>
-          <w:rFonts w:hint="eastAsia"/>
+          <w:rFonts w:hint="eastAsia" w:ascii="Arial Unicode MS" w:hAnsi="Arial Unicode MS" w:cs="Arial Unicode MS" w:eastAsia="Arial Unicode MS"/>
           <w:b/>
           <w:bCs/>
         </w:rPr>
@@ -5931,7 +6119,7 @@
       </w:pPr>
       <w:r>
         <w:rPr>
-          <w:rFonts w:hint="eastAsia"/>
+          <w:rFonts w:hint="eastAsia" w:ascii="Arial Unicode MS" w:hAnsi="Arial Unicode MS" w:cs="Arial Unicode MS" w:eastAsia="Arial Unicode MS"/>
         </w:rPr>
         <w:t xml:space="preserve">决赛答辩设代码走查环节：评委将现场替换输入复测；发现关键词匹配式伪</w:t>
       </w:r>
@@ -5940,7 +6128,7 @@
       </w:r>
       <w:r>
         <w:rPr>
-          <w:rFonts w:hint="eastAsia"/>
+          <w:rFonts w:hint="eastAsia" w:ascii="Arial Unicode MS" w:hAnsi="Arial Unicode MS" w:cs="Arial Unicode MS" w:eastAsia="Arial Unicode MS"/>
         </w:rPr>
         <w:t xml:space="preserve">Agent、打表式伪编译器，对应</w:t>
       </w:r>
@@ -5949,7 +6137,7 @@
       </w:r>
       <w:r>
         <w:rPr>
-          <w:rFonts w:hint="eastAsia"/>
+          <w:rFonts w:hint="eastAsia" w:ascii="Arial Unicode MS" w:hAnsi="Arial Unicode MS" w:cs="Arial Unicode MS" w:eastAsia="Arial Unicode MS"/>
         </w:rPr>
         <w:t xml:space="preserve">判</w:t>
       </w:r>
@@ -5958,7 +6146,7 @@
       </w:r>
       <w:r>
         <w:rPr>
-          <w:rFonts w:hint="eastAsia"/>
+          <w:rFonts w:hint="eastAsia" w:ascii="Arial Unicode MS" w:hAnsi="Arial Unicode MS" w:cs="Arial Unicode MS" w:eastAsia="Arial Unicode MS"/>
         </w:rPr>
         <w:t xml:space="preserve">分并取消该模块奖项资格。</w:t>
       </w:r>
@@ -5973,7 +6161,7 @@
       </w:pPr>
       <w:r>
         <w:rPr>
-          <w:rFonts w:hint="eastAsia"/>
+          <w:rFonts w:hint="eastAsia" w:ascii="Arial Unicode MS" w:hAnsi="Arial Unicode MS" w:cs="Arial Unicode MS" w:eastAsia="Arial Unicode MS"/>
         </w:rPr>
         <w:t xml:space="preserve">允许并鼓励使用</w:t>
       </w:r>
@@ -5982,9 +6170,78 @@
       </w:r>
       <w:r>
         <w:rPr>
-          <w:rFonts w:hint="eastAsia"/>
+          <w:rFonts w:hint="eastAsia" w:ascii="Arial Unicode MS" w:hAnsi="Arial Unicode MS" w:cs="Arial Unicode MS" w:eastAsia="Arial Unicode MS"/>
         </w:rPr>
         <w:t xml:space="preserve">辅助编程，但队伍须能现场解释系统每一部分的工作原理。</w:t>
+      </w:r>
+    </w:p>
+    <w:p>
+      <w:pPr>
+        <w:pStyle w:val="Compact"/>
+        <w:numPr>
+          <w:ilvl w:val="0"/>
+          <w:numId w:val="1012"/>
+        </w:numPr>
+      </w:pPr>
+      <w:r>
+        <w:rPr>
+          <w:rFonts w:hint="eastAsia" w:ascii="Arial Unicode MS" w:hAnsi="Arial Unicode MS" w:cs="Arial Unicode MS" w:eastAsia="Arial Unicode MS"/>
+        </w:rPr>
+        <w:t xml:space="preserve">正式评测器由组织方持有，不复制到选手仓库运行；每个</w:t>
+      </w:r>
+      <w:r>
+        <w:t xml:space="preserve"> case </w:t>
+      </w:r>
+      <w:r>
+        <w:rPr>
+          <w:rFonts w:hint="eastAsia" w:ascii="Arial Unicode MS" w:hAnsi="Arial Unicode MS" w:cs="Arial Unicode MS" w:eastAsia="Arial Unicode MS"/>
+        </w:rPr>
+        <w:t xml:space="preserve">设置</w:t>
+      </w:r>
+      <w:r>
+        <w:t xml:space="preserve"> </w:t>
+      </w:r>
+      <w:r>
+        <w:rPr>
+          <w:rFonts w:hint="eastAsia" w:ascii="Arial Unicode MS" w:hAnsi="Arial Unicode MS" w:cs="Arial Unicode MS" w:eastAsia="Arial Unicode MS"/>
+        </w:rPr>
+        <w:t xml:space="preserve">CPU、内存和超时限制，默认禁止网络。L2</w:t>
+      </w:r>
+      <w:r>
+        <w:t xml:space="preserve"> </w:t>
+      </w:r>
+      <w:r>
+        <w:rPr>
+          <w:rFonts w:hint="eastAsia" w:ascii="Arial Unicode MS" w:hAnsi="Arial Unicode MS" w:cs="Arial Unicode MS" w:eastAsia="Arial Unicode MS"/>
+        </w:rPr>
+        <w:t xml:space="preserve">若需外部</w:t>
+      </w:r>
+      <w:r>
+        <w:t xml:space="preserve"> </w:t>
+      </w:r>
+      <w:r>
+        <w:rPr>
+          <w:rFonts w:hint="eastAsia" w:ascii="Arial Unicode MS" w:hAnsi="Arial Unicode MS" w:cs="Arial Unicode MS" w:eastAsia="Arial Unicode MS"/>
+        </w:rPr>
+        <w:t xml:space="preserve">LLM，只开放</w:t>
+      </w:r>
+      <w:r>
+        <w:t xml:space="preserve"> </w:t>
+      </w:r>
+      <w:r>
+        <w:rPr>
+          <w:rStyle w:val="VerbatimChar"/>
+        </w:rPr>
+        <w:t xml:space="preserve">submission.yaml</w:t>
+      </w:r>
+      <w:r>
+        <w:t xml:space="preserve"> </w:t>
+      </w:r>
+      <w:r>
+        <w:rPr>
+          <w:rFonts w:hint="eastAsia" w:ascii="Arial Unicode MS" w:hAnsi="Arial Unicode MS" w:cs="Arial Unicode MS" w:eastAsia="Arial Unicode MS"/>
+        </w:rPr>
+        <w:t xml:space="preserve">中声明并审核通过的必要域名。</w:t>
       </w:r>
     </w:p>
     <w:p>
@@ -6002,7 +6259,7 @@
       </w:pPr>
       <w:r>
         <w:rPr>
-          <w:rFonts w:hint="eastAsia"/>
+          <w:rFonts w:hint="eastAsia" w:ascii="Arial Unicode MS" w:hAnsi="Arial Unicode MS" w:cs="Arial Unicode MS" w:eastAsia="Arial Unicode MS"/>
         </w:rPr>
         <w:t xml:space="preserve">七、平台接入</w:t>
       </w:r>
@@ -6031,7 +6288,7 @@
             </w:pPr>
             <w:r>
               <w:rPr>
-                <w:rFonts w:hint="eastAsia"/>
+                <w:rFonts w:hint="eastAsia" w:ascii="Arial Unicode MS" w:hAnsi="Arial Unicode MS" w:cs="Arial Unicode MS" w:eastAsia="Arial Unicode MS"/>
               </w:rPr>
               <w:t xml:space="preserve">平台</w:t>
             </w:r>
@@ -6045,7 +6302,7 @@
             </w:pPr>
             <w:r>
               <w:rPr>
-                <w:rFonts w:hint="eastAsia"/>
+                <w:rFonts w:hint="eastAsia" w:ascii="Arial Unicode MS" w:hAnsi="Arial Unicode MS" w:cs="Arial Unicode MS" w:eastAsia="Arial Unicode MS"/>
               </w:rPr>
               <w:t xml:space="preserve">接入方式</w:t>
             </w:r>
@@ -6059,7 +6316,7 @@
             </w:pPr>
             <w:r>
               <w:rPr>
-                <w:rFonts w:hint="eastAsia"/>
+                <w:rFonts w:hint="eastAsia" w:ascii="Arial Unicode MS" w:hAnsi="Arial Unicode MS" w:cs="Arial Unicode MS" w:eastAsia="Arial Unicode MS"/>
               </w:rPr>
               <w:t xml:space="preserve">说明</w:t>
             </w:r>
@@ -6075,7 +6332,7 @@
             </w:pPr>
             <w:r>
               <w:rPr>
-                <w:rFonts w:hint="eastAsia"/>
+                <w:rFonts w:hint="eastAsia" w:ascii="Arial Unicode MS" w:hAnsi="Arial Unicode MS" w:cs="Arial Unicode MS" w:eastAsia="Arial Unicode MS"/>
                 <w:b/>
                 <w:bCs/>
               </w:rPr>
@@ -6107,7 +6364,7 @@
             </w:r>
             <w:r>
               <w:rPr>
-                <w:rFonts w:hint="eastAsia"/>
+                <w:rFonts w:hint="eastAsia" w:ascii="Arial Unicode MS" w:hAnsi="Arial Unicode MS" w:cs="Arial Unicode MS" w:eastAsia="Arial Unicode MS"/>
               </w:rPr>
               <w:t xml:space="preserve">(或</w:t>
             </w:r>
@@ -6122,7 +6379,7 @@
             </w:r>
             <w:r>
               <w:rPr>
-                <w:rFonts w:hint="eastAsia"/>
+                <w:rFonts w:hint="eastAsia" w:ascii="Arial Unicode MS" w:hAnsi="Arial Unicode MS" w:cs="Arial Unicode MS" w:eastAsia="Arial Unicode MS"/>
               </w:rPr>
               <w:t xml:space="preserve">)，自带</w:t>
             </w:r>
@@ -6131,7 +6388,7 @@
             </w:r>
             <w:r>
               <w:rPr>
-                <w:rFonts w:hint="eastAsia"/>
+                <w:rFonts w:hint="eastAsia" w:ascii="Arial Unicode MS" w:hAnsi="Arial Unicode MS" w:cs="Arial Unicode MS" w:eastAsia="Arial Unicode MS"/>
               </w:rPr>
               <w:t xml:space="preserve">本地模拟器，可接超导真机</w:t>
             </w:r>
@@ -6145,7 +6402,7 @@
             </w:pPr>
             <w:r>
               <w:rPr>
-                <w:rFonts w:hint="eastAsia"/>
+                <w:rFonts w:hint="eastAsia" w:ascii="Arial Unicode MS" w:hAnsi="Arial Unicode MS" w:cs="Arial Unicode MS" w:eastAsia="Arial Unicode MS"/>
               </w:rPr>
               <w:t xml:space="preserve">最友好，推荐作为首个打通的真机</w:t>
             </w:r>
@@ -6161,7 +6418,7 @@
             </w:pPr>
             <w:r>
               <w:rPr>
-                <w:rFonts w:hint="eastAsia"/>
+                <w:rFonts w:hint="eastAsia" w:ascii="Arial Unicode MS" w:hAnsi="Arial Unicode MS" w:cs="Arial Unicode MS" w:eastAsia="Arial Unicode MS"/>
                 <w:b/>
                 <w:bCs/>
               </w:rPr>
@@ -6180,7 +6437,7 @@
             </w:r>
             <w:r>
               <w:rPr>
-                <w:rFonts w:hint="eastAsia"/>
+                <w:rFonts w:hint="eastAsia" w:ascii="Arial Unicode MS" w:hAnsi="Arial Unicode MS" w:cs="Arial Unicode MS" w:eastAsia="Arial Unicode MS"/>
               </w:rPr>
               <w:t xml:space="preserve">QPanda3，QASM→OriginIR，可接悟空真机</w:t>
             </w:r>
@@ -6194,7 +6451,7 @@
             </w:pPr>
             <w:r>
               <w:rPr>
-                <w:rFonts w:hint="eastAsia"/>
+                <w:rFonts w:hint="eastAsia" w:ascii="Arial Unicode MS" w:hAnsi="Arial Unicode MS" w:cs="Arial Unicode MS" w:eastAsia="Arial Unicode MS"/>
               </w:rPr>
               <w:t xml:space="preserve">需自行申请</w:t>
             </w:r>
@@ -6237,7 +6494,7 @@
             </w:r>
             <w:r>
               <w:rPr>
-                <w:rFonts w:hint="eastAsia"/>
+                <w:rFonts w:hint="eastAsia" w:ascii="Arial Unicode MS" w:hAnsi="Arial Unicode MS" w:cs="Arial Unicode MS" w:eastAsia="Arial Unicode MS"/>
               </w:rPr>
               <w:t xml:space="preserve">本地模拟器免费、无需</w:t>
             </w:r>
@@ -6246,7 +6503,7 @@
             </w:r>
             <w:r>
               <w:rPr>
-                <w:rFonts w:hint="eastAsia"/>
+                <w:rFonts w:hint="eastAsia" w:ascii="Arial Unicode MS" w:hAnsi="Arial Unicode MS" w:cs="Arial Unicode MS" w:eastAsia="Arial Unicode MS"/>
               </w:rPr>
               <w:t xml:space="preserve">账号</w:t>
             </w:r>
@@ -6260,7 +6517,7 @@
             </w:pPr>
             <w:r>
               <w:rPr>
-                <w:rFonts w:hint="eastAsia"/>
+                <w:rFonts w:hint="eastAsia" w:ascii="Arial Unicode MS" w:hAnsi="Arial Unicode MS" w:cs="Arial Unicode MS" w:eastAsia="Arial Unicode MS"/>
               </w:rPr>
               <w:t xml:space="preserve">允许以本地模拟器替代付费云端真机</w:t>
             </w:r>
@@ -6274,7 +6531,7 @@
       </w:pPr>
       <w:r>
         <w:rPr>
-          <w:rFonts w:hint="eastAsia"/>
+          <w:rFonts w:hint="eastAsia" w:ascii="Arial Unicode MS" w:hAnsi="Arial Unicode MS" w:cs="Arial Unicode MS" w:eastAsia="Arial Unicode MS"/>
           <w:b/>
           <w:bCs/>
         </w:rPr>
@@ -6282,7 +6539,7 @@
       </w:r>
       <w:r>
         <w:rPr>
-          <w:rFonts w:hint="eastAsia"/>
+          <w:rFonts w:hint="eastAsia" w:ascii="Arial Unicode MS" w:hAnsi="Arial Unicode MS" w:cs="Arial Unicode MS" w:eastAsia="Arial Unicode MS"/>
         </w:rPr>
         <w:t xml:space="preserve">：</w:t>
       </w:r>
@@ -6297,7 +6554,7 @@
       </w:pPr>
       <w:r>
         <w:rPr>
-          <w:rFonts w:hint="eastAsia"/>
+          <w:rFonts w:hint="eastAsia" w:ascii="Arial Unicode MS" w:hAnsi="Arial Unicode MS" w:cs="Arial Unicode MS" w:eastAsia="Arial Unicode MS"/>
           <w:b/>
           <w:bCs/>
         </w:rPr>
@@ -6312,7 +6569,7 @@
       </w:r>
       <w:r>
         <w:rPr>
-          <w:rFonts w:hint="eastAsia"/>
+          <w:rFonts w:hint="eastAsia" w:ascii="Arial Unicode MS" w:hAnsi="Arial Unicode MS" w:cs="Arial Unicode MS" w:eastAsia="Arial Unicode MS"/>
         </w:rPr>
         <w:t xml:space="preserve">：</w:t>
       </w:r>
@@ -6326,7 +6583,7 @@
         <w:r>
           <w:rPr>
             <w:rStyle w:val="Hyperlink"/>
-            <w:rFonts w:hint="eastAsia"/>
+            <w:rFonts w:hint="eastAsia" w:ascii="Arial Unicode MS" w:hAnsi="Arial Unicode MS" w:cs="Arial Unicode MS" w:eastAsia="Arial Unicode MS"/>
           </w:rPr>
           <w:t xml:space="preserve">官方文档</w:t>
         </w:r>
@@ -6350,7 +6607,7 @@
         <w:r>
           <w:rPr>
             <w:rStyle w:val="Hyperlink"/>
-            <w:rFonts w:hint="eastAsia"/>
+            <w:rFonts w:hint="eastAsia" w:ascii="Arial Unicode MS" w:hAnsi="Arial Unicode MS" w:cs="Arial Unicode MS" w:eastAsia="Arial Unicode MS"/>
           </w:rPr>
           <w:t xml:space="preserve">源码</w:t>
         </w:r>
@@ -6368,7 +6625,7 @@
         <w:r>
           <w:rPr>
             <w:rStyle w:val="Hyperlink"/>
-            <w:rFonts w:hint="eastAsia"/>
+            <w:rFonts w:hint="eastAsia" w:ascii="Arial Unicode MS" w:hAnsi="Arial Unicode MS" w:cs="Arial Unicode MS" w:eastAsia="Arial Unicode MS"/>
           </w:rPr>
           <w:t xml:space="preserve">产品介绍页</w:t>
         </w:r>
@@ -6384,7 +6641,7 @@
       </w:pPr>
       <w:r>
         <w:rPr>
-          <w:rFonts w:hint="eastAsia"/>
+          <w:rFonts w:hint="eastAsia" w:ascii="Arial Unicode MS" w:hAnsi="Arial Unicode MS" w:cs="Arial Unicode MS" w:eastAsia="Arial Unicode MS"/>
           <w:b/>
           <w:bCs/>
         </w:rPr>
@@ -6392,7 +6649,7 @@
       </w:r>
       <w:r>
         <w:rPr>
-          <w:rFonts w:hint="eastAsia"/>
+          <w:rFonts w:hint="eastAsia" w:ascii="Arial Unicode MS" w:hAnsi="Arial Unicode MS" w:cs="Arial Unicode MS" w:eastAsia="Arial Unicode MS"/>
         </w:rPr>
         <w:t xml:space="preserve">：</w:t>
       </w:r>
@@ -6400,7 +6657,7 @@
         <w:r>
           <w:rPr>
             <w:rStyle w:val="Hyperlink"/>
-            <w:rFonts w:hint="eastAsia"/>
+            <w:rFonts w:hint="eastAsia" w:ascii="Arial Unicode MS" w:hAnsi="Arial Unicode MS" w:cs="Arial Unicode MS" w:eastAsia="Arial Unicode MS"/>
           </w:rPr>
           <w:t xml:space="preserve">本源量子云平台</w:t>
         </w:r>
@@ -6424,7 +6681,7 @@
         <w:r>
           <w:rPr>
             <w:rStyle w:val="Hyperlink"/>
-            <w:rFonts w:hint="eastAsia"/>
+            <w:rFonts w:hint="eastAsia" w:ascii="Arial Unicode MS" w:hAnsi="Arial Unicode MS" w:cs="Arial Unicode MS" w:eastAsia="Arial Unicode MS"/>
           </w:rPr>
           <w:t xml:space="preserve">中文文档</w:t>
         </w:r>
@@ -6442,7 +6699,7 @@
         <w:r>
           <w:rPr>
             <w:rStyle w:val="Hyperlink"/>
-            <w:rFonts w:hint="eastAsia"/>
+            <w:rFonts w:hint="eastAsia" w:ascii="Arial Unicode MS" w:hAnsi="Arial Unicode MS" w:cs="Arial Unicode MS" w:eastAsia="Arial Unicode MS"/>
           </w:rPr>
           <w:t xml:space="preserve">真机服务用户手册</w:t>
         </w:r>
@@ -6465,7 +6722,7 @@
       </w:r>
       <w:r>
         <w:rPr>
-          <w:rFonts w:hint="eastAsia"/>
+          <w:rFonts w:hint="eastAsia" w:ascii="Arial Unicode MS" w:hAnsi="Arial Unicode MS" w:cs="Arial Unicode MS" w:eastAsia="Arial Unicode MS"/>
         </w:rPr>
         <w:t xml:space="preserve">：</w:t>
       </w:r>
@@ -6473,7 +6730,7 @@
         <w:r>
           <w:rPr>
             <w:rStyle w:val="Hyperlink"/>
-            <w:rFonts w:hint="eastAsia"/>
+            <w:rFonts w:hint="eastAsia" w:ascii="Arial Unicode MS" w:hAnsi="Arial Unicode MS" w:cs="Arial Unicode MS" w:eastAsia="Arial Unicode MS"/>
           </w:rPr>
           <w:t xml:space="preserve">开发者文档</w:t>
         </w:r>
@@ -6508,7 +6765,7 @@
         <w:r>
           <w:rPr>
             <w:rStyle w:val="Hyperlink"/>
-            <w:rFonts w:hint="eastAsia"/>
+            <w:rFonts w:hint="eastAsia" w:ascii="Arial Unicode MS" w:hAnsi="Arial Unicode MS" w:cs="Arial Unicode MS" w:eastAsia="Arial Unicode MS"/>
           </w:rPr>
           <w:t xml:space="preserve">官方示例库</w:t>
         </w:r>
@@ -6529,7 +6786,7 @@
       </w:pPr>
       <w:r>
         <w:rPr>
-          <w:rFonts w:hint="eastAsia"/>
+          <w:rFonts w:hint="eastAsia" w:ascii="Arial Unicode MS" w:hAnsi="Arial Unicode MS" w:cs="Arial Unicode MS" w:eastAsia="Arial Unicode MS"/>
         </w:rPr>
         <w:t xml:space="preserve">八、评委看重什么</w:t>
       </w:r>
@@ -6544,7 +6801,7 @@
       </w:pPr>
       <w:r>
         <w:rPr>
-          <w:rFonts w:hint="eastAsia"/>
+          <w:rFonts w:hint="eastAsia" w:ascii="Arial Unicode MS" w:hAnsi="Arial Unicode MS" w:cs="Arial Unicode MS" w:eastAsia="Arial Unicode MS"/>
           <w:b/>
           <w:bCs/>
         </w:rPr>
@@ -6552,7 +6809,7 @@
       </w:r>
       <w:r>
         <w:rPr>
-          <w:rFonts w:hint="eastAsia"/>
+          <w:rFonts w:hint="eastAsia" w:ascii="Arial Unicode MS" w:hAnsi="Arial Unicode MS" w:cs="Arial Unicode MS" w:eastAsia="Arial Unicode MS"/>
           <w:b/>
           <w:bCs/>
         </w:rPr>
@@ -6560,7 +6817,7 @@
       </w:r>
       <w:r>
         <w:rPr>
-          <w:rFonts w:hint="eastAsia"/>
+          <w:rFonts w:hint="eastAsia" w:ascii="Arial Unicode MS" w:hAnsi="Arial Unicode MS" w:cs="Arial Unicode MS" w:eastAsia="Arial Unicode MS"/>
         </w:rPr>
         <w:t xml:space="preserve">——是三套硬编码，还是一个真正抽象的中间层？</w:t>
       </w:r>
@@ -6575,7 +6832,7 @@
       </w:pPr>
       <w:r>
         <w:rPr>
-          <w:rFonts w:hint="eastAsia"/>
+          <w:rFonts w:hint="eastAsia" w:ascii="Arial Unicode MS" w:hAnsi="Arial Unicode MS" w:cs="Arial Unicode MS" w:eastAsia="Arial Unicode MS"/>
           <w:b/>
           <w:bCs/>
         </w:rPr>
@@ -6583,7 +6840,7 @@
       </w:r>
       <w:r>
         <w:rPr>
-          <w:rFonts w:hint="eastAsia"/>
+          <w:rFonts w:hint="eastAsia" w:ascii="Arial Unicode MS" w:hAnsi="Arial Unicode MS" w:cs="Arial Unicode MS" w:eastAsia="Arial Unicode MS"/>
         </w:rPr>
         <w:t xml:space="preserve">——一个没写过</w:t>
       </w:r>
@@ -6592,7 +6849,7 @@
       </w:r>
       <w:r>
         <w:rPr>
-          <w:rFonts w:hint="eastAsia"/>
+          <w:rFonts w:hint="eastAsia" w:ascii="Arial Unicode MS" w:hAnsi="Arial Unicode MS" w:cs="Arial Unicode MS" w:eastAsia="Arial Unicode MS"/>
         </w:rPr>
         <w:t xml:space="preserve">的人，能不能靠你的</w:t>
       </w:r>
@@ -6601,7 +6858,7 @@
       </w:r>
       <w:r>
         <w:rPr>
-          <w:rFonts w:hint="eastAsia"/>
+          <w:rFonts w:hint="eastAsia" w:ascii="Arial Unicode MS" w:hAnsi="Arial Unicode MS" w:cs="Arial Unicode MS" w:eastAsia="Arial Unicode MS"/>
         </w:rPr>
         <w:t xml:space="preserve">在</w:t>
       </w:r>
@@ -6610,7 +6867,7 @@
       </w:r>
       <w:r>
         <w:rPr>
-          <w:rFonts w:hint="eastAsia"/>
+          <w:rFonts w:hint="eastAsia" w:ascii="Arial Unicode MS" w:hAnsi="Arial Unicode MS" w:cs="Arial Unicode MS" w:eastAsia="Arial Unicode MS"/>
         </w:rPr>
         <w:t xml:space="preserve">分钟内跑出第一个量子程序？</w:t>
       </w:r>
@@ -6625,7 +6882,7 @@
       </w:pPr>
       <w:r>
         <w:rPr>
-          <w:rFonts w:hint="eastAsia"/>
+          <w:rFonts w:hint="eastAsia" w:ascii="Arial Unicode MS" w:hAnsi="Arial Unicode MS" w:cs="Arial Unicode MS" w:eastAsia="Arial Unicode MS"/>
           <w:b/>
           <w:bCs/>
         </w:rPr>
@@ -6633,7 +6890,7 @@
       </w:r>
       <w:r>
         <w:rPr>
-          <w:rFonts w:hint="eastAsia"/>
+          <w:rFonts w:hint="eastAsia" w:ascii="Arial Unicode MS" w:hAnsi="Arial Unicode MS" w:cs="Arial Unicode MS" w:eastAsia="Arial Unicode MS"/>
         </w:rPr>
         <w:t xml:space="preserve">——评委能不能一条命令跑起来？</w:t>
       </w:r>
@@ -6648,7 +6905,7 @@
       </w:pPr>
       <w:r>
         <w:rPr>
-          <w:rFonts w:hint="eastAsia"/>
+          <w:rFonts w:hint="eastAsia" w:ascii="Arial Unicode MS" w:hAnsi="Arial Unicode MS" w:cs="Arial Unicode MS" w:eastAsia="Arial Unicode MS"/>
           <w:b/>
           <w:bCs/>
         </w:rPr>
@@ -6656,7 +6913,7 @@
       </w:r>
       <w:r>
         <w:rPr>
-          <w:rFonts w:hint="eastAsia"/>
+          <w:rFonts w:hint="eastAsia" w:ascii="Arial Unicode MS" w:hAnsi="Arial Unicode MS" w:cs="Arial Unicode MS" w:eastAsia="Arial Unicode MS"/>
         </w:rPr>
         <w:t xml:space="preserve">——你是否真正想清楚了”为谁而做”。</w:t>
       </w:r>
@@ -6667,7 +6924,7 @@
       </w:pPr>
       <w:r>
         <w:rPr>
-          <w:rFonts w:hint="eastAsia"/>
+          <w:rFonts w:hint="eastAsia" w:ascii="Arial Unicode MS" w:hAnsi="Arial Unicode MS" w:cs="Arial Unicode MS" w:eastAsia="Arial Unicode MS"/>
           <w:b/>
           <w:bCs/>
         </w:rPr>
@@ -6689,7 +6946,7 @@
       </w:pPr>
       <w:r>
         <w:rPr>
-          <w:rFonts w:hint="eastAsia"/>
+          <w:rFonts w:hint="eastAsia" w:ascii="Arial Unicode MS" w:hAnsi="Arial Unicode MS" w:cs="Arial Unicode MS" w:eastAsia="Arial Unicode MS"/>
         </w:rPr>
         <w:t xml:space="preserve">九、大赛专项奖项设置</w:t>
       </w:r>
@@ -6716,7 +6973,7 @@
       </w:r>
       <w:r>
         <w:rPr>
-          <w:rFonts w:hint="eastAsia"/>
+          <w:rFonts w:hint="eastAsia" w:ascii="Arial Unicode MS" w:hAnsi="Arial Unicode MS" w:cs="Arial Unicode MS" w:eastAsia="Arial Unicode MS"/>
           <w:b/>
           <w:bCs/>
         </w:rPr>
@@ -6740,7 +6997,7 @@
       </w:pPr>
       <w:r>
         <w:rPr>
-          <w:rFonts w:hint="eastAsia"/>
+          <w:rFonts w:hint="eastAsia" w:ascii="Arial Unicode MS" w:hAnsi="Arial Unicode MS" w:cs="Arial Unicode MS" w:eastAsia="Arial Unicode MS"/>
           <w:b/>
           <w:bCs/>
         </w:rPr>
@@ -6748,7 +7005,7 @@
       </w:r>
       <w:r>
         <w:rPr>
-          <w:rFonts w:hint="eastAsia"/>
+          <w:rFonts w:hint="eastAsia" w:ascii="Arial Unicode MS" w:hAnsi="Arial Unicode MS" w:cs="Arial Unicode MS" w:eastAsia="Arial Unicode MS"/>
         </w:rPr>
         <w:t xml:space="preserve">：在</w:t>
       </w:r>
@@ -6757,7 +7014,7 @@
       </w:r>
       <w:r>
         <w:rPr>
-          <w:rFonts w:hint="eastAsia"/>
+          <w:rFonts w:hint="eastAsia" w:ascii="Arial Unicode MS" w:hAnsi="Arial Unicode MS" w:cs="Arial Unicode MS" w:eastAsia="Arial Unicode MS"/>
         </w:rPr>
         <w:t xml:space="preserve">智能体交互、新手引导体验、无门槛可视化方向得分突出的队伍。</w:t>
       </w:r>
@@ -6772,7 +7029,7 @@
       </w:pPr>
       <w:r>
         <w:rPr>
-          <w:rFonts w:hint="eastAsia"/>
+          <w:rFonts w:hint="eastAsia" w:ascii="Arial Unicode MS" w:hAnsi="Arial Unicode MS" w:cs="Arial Unicode MS" w:eastAsia="Arial Unicode MS"/>
           <w:b/>
           <w:bCs/>
         </w:rPr>
@@ -6780,7 +7037,7 @@
       </w:r>
       <w:r>
         <w:rPr>
-          <w:rFonts w:hint="eastAsia"/>
+          <w:rFonts w:hint="eastAsia" w:ascii="Arial Unicode MS" w:hAnsi="Arial Unicode MS" w:cs="Arial Unicode MS" w:eastAsia="Arial Unicode MS"/>
         </w:rPr>
         <w:t xml:space="preserve">：工具是否能做到”让一位没有任何量子背景的跨界创作者，在</w:t>
       </w:r>
@@ -6789,7 +7046,7 @@
       </w:r>
       <w:r>
         <w:rPr>
-          <w:rFonts w:hint="eastAsia"/>
+          <w:rFonts w:hint="eastAsia" w:ascii="Arial Unicode MS" w:hAnsi="Arial Unicode MS" w:cs="Arial Unicode MS" w:eastAsia="Arial Unicode MS"/>
         </w:rPr>
         <w:t xml:space="preserve">分钟内依靠智能体引导，成功在真实量子机上完成人生第一个实验，并理解其科学原理”。本奖项旨在表彰打破精英主义壁垒、把先进算力带给更多人的包容性设计。</w:t>
       </w:r>
@@ -7002,7 +7259,7 @@
         <w:ind w:left="720" w:hanging="360"/>
       </w:pPr>
       <w:rPr>
-        <w:rFonts w:ascii="Symbol" w:hAnsi="Symbol" w:cs="Symbol" w:hint="default"/>
+        <w:rFonts w:ascii="Symbol" w:hAnsi="Symbol" w:cs="Symbol" w:hint="default" w:eastAsia="Arial Unicode MS"/>
       </w:rPr>
     </w:lvl>
     <w:lvl w:ilvl="1">
@@ -7013,7 +7270,7 @@
         <w:ind w:left="1440" w:hanging="360"/>
       </w:pPr>
       <w:rPr>
-        <w:rFonts w:ascii="Courier New" w:hAnsi="Courier New" w:cs="Courier New" w:hint="default"/>
+        <w:rFonts w:ascii="Courier New" w:hAnsi="Courier New" w:cs="Courier New" w:hint="default" w:eastAsia="Arial Unicode MS"/>
       </w:rPr>
     </w:lvl>
     <w:lvl w:ilvl="2">
@@ -7024,7 +7281,7 @@
         <w:ind w:left="2160" w:hanging="360"/>
       </w:pPr>
       <w:rPr>
-        <w:rFonts w:ascii="Wingdings" w:hAnsi="Wingdings" w:cs="Wingdings" w:hint="default"/>
+        <w:rFonts w:ascii="Wingdings" w:hAnsi="Wingdings" w:cs="Wingdings" w:hint="default" w:eastAsia="Arial Unicode MS"/>
       </w:rPr>
     </w:lvl>
     <w:lvl w:ilvl="3">
@@ -7035,7 +7292,7 @@
         <w:ind w:left="2880" w:hanging="360"/>
       </w:pPr>
       <w:rPr>
-        <w:rFonts w:ascii="Symbol" w:hAnsi="Symbol" w:cs="Symbol" w:hint="default"/>
+        <w:rFonts w:ascii="Symbol" w:hAnsi="Symbol" w:cs="Symbol" w:hint="default" w:eastAsia="Arial Unicode MS"/>
       </w:rPr>
     </w:lvl>
     <w:lvl w:ilvl="4">
@@ -7046,7 +7303,7 @@
         <w:ind w:left="3600" w:hanging="360"/>
       </w:pPr>
       <w:rPr>
-        <w:rFonts w:ascii="Courier New" w:hAnsi="Courier New" w:cs="Courier New" w:hint="default"/>
+        <w:rFonts w:ascii="Courier New" w:hAnsi="Courier New" w:cs="Courier New" w:hint="default" w:eastAsia="Arial Unicode MS"/>
       </w:rPr>
     </w:lvl>
     <w:lvl w:ilvl="5">
@@ -7057,7 +7314,7 @@
         <w:ind w:left="4320" w:hanging="360"/>
       </w:pPr>
       <w:rPr>
-        <w:rFonts w:ascii="Wingdings" w:hAnsi="Wingdings" w:cs="Wingdings" w:hint="default"/>
+        <w:rFonts w:ascii="Wingdings" w:hAnsi="Wingdings" w:cs="Wingdings" w:hint="default" w:eastAsia="Arial Unicode MS"/>
       </w:rPr>
     </w:lvl>
     <w:lvl w:ilvl="6">
@@ -7068,7 +7325,7 @@
         <w:ind w:left="5040" w:hanging="360"/>
       </w:pPr>
       <w:rPr>
-        <w:rFonts w:ascii="Symbol" w:hAnsi="Symbol" w:cs="Symbol" w:hint="default"/>
+        <w:rFonts w:ascii="Symbol" w:hAnsi="Symbol" w:cs="Symbol" w:hint="default" w:eastAsia="Arial Unicode MS"/>
       </w:rPr>
     </w:lvl>
     <w:lvl w:ilvl="7">
@@ -7079,7 +7336,7 @@
         <w:ind w:left="5760" w:hanging="360"/>
       </w:pPr>
       <w:rPr>
-        <w:rFonts w:ascii="Courier New" w:hAnsi="Courier New" w:cs="Courier New" w:hint="default"/>
+        <w:rFonts w:ascii="Courier New" w:hAnsi="Courier New" w:cs="Courier New" w:hint="default" w:eastAsia="Arial Unicode MS"/>
       </w:rPr>
     </w:lvl>
     <w:lvl w:ilvl="8">
@@ -7090,7 +7347,7 @@
         <w:ind w:left="6480" w:hanging="360"/>
       </w:pPr>
       <w:rPr>
-        <w:rFonts w:ascii="Wingdings" w:hAnsi="Wingdings" w:cs="Wingdings" w:hint="default"/>
+        <w:rFonts w:ascii="Wingdings" w:hAnsi="Wingdings" w:cs="Wingdings" w:hint="default" w:eastAsia="Arial Unicode MS"/>
       </w:rPr>
     </w:lvl>
   </w:abstractNum>
@@ -7285,7 +7542,7 @@
   <w:docDefaults>
     <w:rPrDefault>
       <w:rPr>
-        <w:rFonts w:asciiTheme="minorHAnsi" w:cstheme="minorBidi" w:eastAsiaTheme="minorEastAsia" w:hAnsiTheme="minorHAnsi"/>
+        <w:rFonts w:asciiTheme="minorHAnsi" w:cstheme="minorBidi" w:hAnsiTheme="minorHAnsi" w:eastAsia="Arial Unicode MS"/>
         <w:sz w:val="24"/>
         <w:szCs w:val="24"/>
         <w:lang w:bidi="ar-SA" w:eastAsia="zh-CN" w:val="en-US"/>
@@ -7339,7 +7596,7 @@
       <w:jc w:val="center"/>
     </w:pPr>
     <w:rPr>
-      <w:rFonts w:asciiTheme="majorHAnsi" w:cstheme="majorBidi" w:eastAsiaTheme="majorEastAsia" w:hAnsiTheme="majorHAnsi"/>
+      <w:rFonts w:asciiTheme="majorHAnsi" w:cstheme="majorBidi" w:hAnsiTheme="majorHAnsi" w:eastAsia="Arial Unicode MS"/>
       <w:sz w:val="56"/>
       <w:szCs w:val="56"/>
     </w:rPr>
@@ -7351,7 +7608,7 @@
     <w:uiPriority w:val="10"/>
     <w:rsid w:val="00A10FD9"/>
     <w:rPr>
-      <w:rFonts w:asciiTheme="majorHAnsi" w:cstheme="majorBidi" w:eastAsiaTheme="majorEastAsia" w:hAnsiTheme="majorHAnsi"/>
+      <w:rFonts w:asciiTheme="majorHAnsi" w:cstheme="majorBidi" w:hAnsiTheme="majorHAnsi" w:eastAsia="Arial Unicode MS"/>
       <w:sz w:val="56"/>
       <w:szCs w:val="56"/>
     </w:rPr>
@@ -7370,7 +7627,7 @@
       </w:numPr>
     </w:pPr>
     <w:rPr>
-      <w:rFonts w:cstheme="majorBidi" w:eastAsiaTheme="majorEastAsia"/>
+      <w:rFonts w:cstheme="majorBidi" w:eastAsia="Arial Unicode MS"/>
       <w:spacing w:val="15"/>
       <w:sz w:val="28"/>
       <w:szCs w:val="28"/>
@@ -7383,7 +7640,7 @@
     <w:uiPriority w:val="11"/>
     <w:rsid w:val="00A10FD9"/>
     <w:rPr>
-      <w:rFonts w:cstheme="majorBidi" w:eastAsiaTheme="majorEastAsia"/>
+      <w:rFonts w:cstheme="majorBidi" w:eastAsia="Arial Unicode MS"/>
       <w:color w:themeColor="text1" w:themeTint="A6" w:val="595959"/>
       <w:spacing w:val="15"/>
       <w:sz w:val="28"/>
@@ -7473,7 +7730,7 @@
       <w:outlineLvl w:val="0"/>
     </w:pPr>
     <w:rPr>
-      <w:rFonts w:asciiTheme="majorHAnsi" w:cstheme="majorBidi" w:eastAsiaTheme="majorEastAsia" w:hAnsiTheme="majorHAnsi"/>
+      <w:rFonts w:asciiTheme="majorHAnsi" w:cstheme="majorBidi" w:hAnsiTheme="majorHAnsi" w:eastAsia="Arial Unicode MS"/>
       <w:color w:themeColor="accent1" w:themeShade="BF" w:val="0F4761"/>
       <w:sz w:val="40"/>
       <w:szCs w:val="40"/>
@@ -7496,7 +7753,7 @@
       <w:outlineLvl w:val="1"/>
     </w:pPr>
     <w:rPr>
-      <w:rFonts w:asciiTheme="majorHAnsi" w:cstheme="majorBidi" w:eastAsiaTheme="majorEastAsia" w:hAnsiTheme="majorHAnsi"/>
+      <w:rFonts w:asciiTheme="majorHAnsi" w:cstheme="majorBidi" w:hAnsiTheme="majorHAnsi" w:eastAsia="Arial Unicode MS"/>
       <w:color w:themeColor="accent1" w:themeShade="BF" w:val="0F4761"/>
       <w:sz w:val="32"/>
       <w:szCs w:val="32"/>
@@ -7519,7 +7776,7 @@
       <w:outlineLvl w:val="2"/>
     </w:pPr>
     <w:rPr>
-      <w:rFonts w:cstheme="majorBidi" w:eastAsiaTheme="majorEastAsia"/>
+      <w:rFonts w:cstheme="majorBidi" w:eastAsia="Arial Unicode MS"/>
       <w:color w:themeColor="accent1" w:themeShade="BF" w:val="0F4761"/>
       <w:sz w:val="28"/>
       <w:szCs w:val="28"/>
@@ -7542,7 +7799,7 @@
       <w:outlineLvl w:val="3"/>
     </w:pPr>
     <w:rPr>
-      <w:rFonts w:cstheme="majorBidi" w:eastAsiaTheme="majorEastAsia"/>
+      <w:rFonts w:cstheme="majorBidi" w:eastAsia="Arial Unicode MS"/>
       <w:i/>
       <w:iCs/>
       <w:color w:themeColor="accent1" w:themeShade="BF" w:val="0F4761"/>
@@ -7565,7 +7822,7 @@
       <w:outlineLvl w:val="4"/>
     </w:pPr>
     <w:rPr>
-      <w:rFonts w:cstheme="majorBidi" w:eastAsiaTheme="majorEastAsia"/>
+      <w:rFonts w:cstheme="majorBidi" w:eastAsia="Arial Unicode MS"/>
       <w:color w:themeColor="accent1" w:themeShade="BF" w:val="0F4761"/>
     </w:rPr>
   </w:style>
@@ -7586,7 +7843,7 @@
       <w:outlineLvl w:val="5"/>
     </w:pPr>
     <w:rPr>
-      <w:rFonts w:cstheme="majorBidi" w:eastAsiaTheme="majorEastAsia"/>
+      <w:rFonts w:cstheme="majorBidi" w:eastAsia="Arial Unicode MS"/>
       <w:i/>
       <w:iCs/>
       <w:color w:themeColor="text1" w:themeTint="A6" w:val="595959"/>
@@ -7609,7 +7866,7 @@
       <w:outlineLvl w:val="6"/>
     </w:pPr>
     <w:rPr>
-      <w:rFonts w:cstheme="majorBidi" w:eastAsiaTheme="majorEastAsia"/>
+      <w:rFonts w:cstheme="majorBidi" w:eastAsia="Arial Unicode MS"/>
       <w:color w:themeColor="text1" w:themeTint="A6" w:val="595959"/>
     </w:rPr>
   </w:style>
@@ -7630,7 +7887,7 @@
       <w:outlineLvl w:val="7"/>
     </w:pPr>
     <w:rPr>
-      <w:rFonts w:cstheme="majorBidi" w:eastAsiaTheme="majorEastAsia"/>
+      <w:rFonts w:cstheme="majorBidi" w:eastAsia="Arial Unicode MS"/>
       <w:i/>
       <w:iCs/>
       <w:color w:themeColor="text1" w:themeTint="D8" w:val="272727"/>
@@ -7653,7 +7910,7 @@
       <w:outlineLvl w:val="8"/>
     </w:pPr>
     <w:rPr>
-      <w:rFonts w:cstheme="majorBidi" w:eastAsiaTheme="majorEastAsia"/>
+      <w:rFonts w:cstheme="majorBidi" w:eastAsia="Arial Unicode MS"/>
       <w:color w:themeColor="text1" w:themeTint="D8" w:val="272727"/>
     </w:rPr>
   </w:style>
@@ -7664,7 +7921,7 @@
     <w:uiPriority w:val="9"/>
     <w:rsid w:val="00A10FD9"/>
     <w:rPr>
-      <w:rFonts w:asciiTheme="majorHAnsi" w:cstheme="majorBidi" w:eastAsiaTheme="majorEastAsia" w:hAnsiTheme="majorHAnsi"/>
+      <w:rFonts w:asciiTheme="majorHAnsi" w:cstheme="majorBidi" w:hAnsiTheme="majorHAnsi" w:eastAsia="Arial Unicode MS"/>
       <w:color w:themeColor="accent1" w:themeShade="BF" w:val="0F4761"/>
       <w:sz w:val="40"/>
       <w:szCs w:val="40"/>
@@ -7678,7 +7935,7 @@
     <w:semiHidden/>
     <w:rsid w:val="00A10FD9"/>
     <w:rPr>
-      <w:rFonts w:asciiTheme="majorHAnsi" w:cstheme="majorBidi" w:eastAsiaTheme="majorEastAsia" w:hAnsiTheme="majorHAnsi"/>
+      <w:rFonts w:asciiTheme="majorHAnsi" w:cstheme="majorBidi" w:hAnsiTheme="majorHAnsi" w:eastAsia="Arial Unicode MS"/>
       <w:color w:themeColor="accent1" w:themeShade="BF" w:val="0F4761"/>
       <w:sz w:val="32"/>
       <w:szCs w:val="32"/>
@@ -7692,7 +7949,7 @@
     <w:semiHidden/>
     <w:rsid w:val="00A10FD9"/>
     <w:rPr>
-      <w:rFonts w:cstheme="majorBidi" w:eastAsiaTheme="majorEastAsia"/>
+      <w:rFonts w:cstheme="majorBidi" w:eastAsia="Arial Unicode MS"/>
       <w:color w:themeColor="accent1" w:themeShade="BF" w:val="0F4761"/>
       <w:sz w:val="28"/>
       <w:szCs w:val="28"/>
@@ -7706,7 +7963,7 @@
     <w:semiHidden/>
     <w:rsid w:val="00A10FD9"/>
     <w:rPr>
-      <w:rFonts w:cstheme="majorBidi" w:eastAsiaTheme="majorEastAsia"/>
+      <w:rFonts w:cstheme="majorBidi" w:eastAsia="Arial Unicode MS"/>
       <w:i/>
       <w:iCs/>
       <w:color w:themeColor="accent1" w:themeShade="BF" w:val="0F4761"/>
@@ -7720,7 +7977,7 @@
     <w:semiHidden/>
     <w:rsid w:val="00A10FD9"/>
     <w:rPr>
-      <w:rFonts w:cstheme="majorBidi" w:eastAsiaTheme="majorEastAsia"/>
+      <w:rFonts w:cstheme="majorBidi" w:eastAsia="Arial Unicode MS"/>
       <w:color w:themeColor="accent1" w:themeShade="BF" w:val="0F4761"/>
     </w:rPr>
   </w:style>
@@ -7732,7 +7989,7 @@
     <w:semiHidden/>
     <w:rsid w:val="00A10FD9"/>
     <w:rPr>
-      <w:rFonts w:cstheme="majorBidi" w:eastAsiaTheme="majorEastAsia"/>
+      <w:rFonts w:cstheme="majorBidi" w:eastAsia="Arial Unicode MS"/>
       <w:i/>
       <w:iCs/>
       <w:color w:themeColor="text1" w:themeTint="A6" w:val="595959"/>
@@ -7746,7 +8003,7 @@
     <w:semiHidden/>
     <w:rsid w:val="00A10FD9"/>
     <w:rPr>
-      <w:rFonts w:cstheme="majorBidi" w:eastAsiaTheme="majorEastAsia"/>
+      <w:rFonts w:cstheme="majorBidi" w:eastAsia="Arial Unicode MS"/>
       <w:color w:themeColor="text1" w:themeTint="A6" w:val="595959"/>
     </w:rPr>
   </w:style>
@@ -7758,7 +8015,7 @@
     <w:semiHidden/>
     <w:rsid w:val="00A10FD9"/>
     <w:rPr>
-      <w:rFonts w:cstheme="majorBidi" w:eastAsiaTheme="majorEastAsia"/>
+      <w:rFonts w:cstheme="majorBidi" w:eastAsia="Arial Unicode MS"/>
       <w:i/>
       <w:iCs/>
       <w:color w:themeColor="text1" w:themeTint="D8" w:val="272727"/>
@@ -7772,7 +8029,7 @@
     <w:semiHidden/>
     <w:rsid w:val="00A10FD9"/>
     <w:rPr>
-      <w:rFonts w:cstheme="majorBidi" w:eastAsiaTheme="majorEastAsia"/>
+      <w:rFonts w:cstheme="majorBidi" w:eastAsia="Arial Unicode MS"/>
       <w:color w:themeColor="text1" w:themeTint="D8" w:val="272727"/>
     </w:rPr>
   </w:style>
@@ -7896,7 +8153,7 @@
     <w:name w:val="Verbatim Char"/>
     <w:basedOn w:val="BodyTextChar"/>
     <w:rPr>
-      <w:rFonts w:ascii="Consolas" w:hAnsi="Consolas"/>
+      <w:rFonts w:ascii="Consolas" w:hAnsi="Consolas" w:eastAsia="Arial Unicode MS"/>
       <w:sz w:val="22"/>
     </w:rPr>
   </w:style>
@@ -7930,7 +8187,7 @@
       <w:outlineLvl w:val="9"/>
     </w:pPr>
     <w:rPr>
-      <w:rFonts w:asciiTheme="majorHAnsi" w:cstheme="majorBidi" w:eastAsiaTheme="majorEastAsia" w:hAnsiTheme="majorHAnsi"/>
+      <w:rFonts w:asciiTheme="majorHAnsi" w:cstheme="majorBidi" w:hAnsiTheme="majorHAnsi" w:eastAsia="Arial Unicode MS"/>
       <w:b w:val="0"/>
       <w:bCs w:val="0"/>
       <w:color w:themeColor="accent1" w:themeShade="BF" w:val="365F91"/>
@@ -8217,11 +8474,11 @@
     <a:fontScheme name="Office">
       <a:majorFont>
         <a:latin typeface="Aptos Display" panose="02110004020202020204"/>
-        <a:ea typeface=""/>
+        <a:ea typeface="Arial Unicode MS"/>
         <a:cs typeface=""/>
         <a:font script="Jpan" typeface="游ゴシック Light"/>
         <a:font script="Hang" typeface="맑은 고딕"/>
-        <a:font script="Hans" typeface="等线 Light"/>
+        <a:font script="Hans" typeface="Arial Unicode MS"/>
         <a:font script="Hant" typeface="新細明體"/>
         <a:font script="Arab" typeface="Times New Roman"/>
         <a:font script="Hebr" typeface="Times New Roman"/>
@@ -8269,11 +8526,11 @@
       </a:majorFont>
       <a:minorFont>
         <a:latin typeface="Aptos" panose="02110004020202020204"/>
-        <a:ea typeface=""/>
+        <a:ea typeface="Arial Unicode MS"/>
         <a:cs typeface=""/>
         <a:font script="Jpan" typeface="游明朝"/>
         <a:font script="Hang" typeface="맑은 고딕"/>
-        <a:font script="Hans" typeface="等线"/>
+        <a:font script="Hans" typeface="Arial Unicode MS"/>
         <a:font script="Hant" typeface="新細明體"/>
         <a:font script="Arab" typeface="Arial"/>
         <a:font script="Hebr" typeface="Arial"/>

</xml_diff>

<commit_message>
Clarify contestant submission and evidence guidance
</commit_message>
<xml_diff>
--- a/LoomQ-赛题.docx
+++ b/LoomQ-赛题.docx
@@ -1720,16 +1720,7 @@
         <w:rPr>
           <w:rFonts w:hint="eastAsia" w:ascii="Arial Unicode MS" w:hAnsi="Arial Unicode MS" w:cs="Arial Unicode MS" w:eastAsia="Arial Unicode MS"/>
         </w:rPr>
-        <w:t xml:space="preserve">驱动，关闭</w:t>
-      </w:r>
-      <w:r>
-        <w:t xml:space="preserve"> </w:t>
-      </w:r>
-      <w:r>
-        <w:rPr>
-          <w:rFonts w:hint="eastAsia" w:ascii="Arial Unicode MS" w:hAnsi="Arial Unicode MS" w:cs="Arial Unicode MS" w:eastAsia="Arial Unicode MS"/>
-        </w:rPr>
-        <w:t xml:space="preserve">thinking；最终答案仍由客观测试判定，不使用</w:t>
+        <w:t xml:space="preserve">驱动；最终答案仍由客观测试判定，不使用</w:t>
       </w:r>
       <w:r>
         <w:t xml:space="preserve"> LLM </w:t>

</xml_diff>

<commit_message>
rename starter kit package (#11)
</commit_message>
<xml_diff>
--- a/LoomQ-赛题.docx
+++ b/LoomQ-赛题.docx
@@ -1632,7 +1632,7 @@
         <w:rPr>
           <w:rStyle w:val="VerbatimChar"/>
         </w:rPr>
-        <w:t xml:space="preserve">starter-kit/adapter.py</w:t>
+        <w:t xml:space="preserve">starter_kit/adapter.py</w:t>
       </w:r>
       <w:r>
         <w:t xml:space="preserve"> </w:t>
@@ -2681,7 +2681,7 @@
           <w:b/>
           <w:bCs/>
         </w:rPr>
-        <w:t xml:space="preserve">starter-kit/</w:t>
+        <w:t xml:space="preserve">starter_kit/</w:t>
       </w:r>
       <w:r>
         <w:rPr>
@@ -2711,7 +2711,7 @@
         <w:rPr>
           <w:rStyle w:val="VerbatimChar"/>
         </w:rPr>
-        <w:t xml:space="preserve">starter-kit/submission.yaml</w:t>
+        <w:t xml:space="preserve">starter_kit/submission.yaml</w:t>
       </w:r>
       <w:r>
         <w:rPr>
@@ -2726,7 +2726,7 @@
         <w:rPr>
           <w:rStyle w:val="VerbatimChar"/>
         </w:rPr>
-        <w:t xml:space="preserve">starter-kit/adapter.py</w:t>
+        <w:t xml:space="preserve">starter_kit/adapter.py</w:t>
       </w:r>
       <w:r>
         <w:t xml:space="preserve">。</w:t>
@@ -4086,7 +4086,7 @@
         <w:rPr>
           <w:rStyle w:val="VerbatimChar"/>
         </w:rPr>
-        <w:t xml:space="preserve">python3 starter-kit/prepare_submission.py --team-id &lt;TEAM_ID&gt;</w:t>
+        <w:t xml:space="preserve">python3 starter_kit/prepare_submission.py --team-id &lt;TEAM_ID&gt;</w:t>
       </w:r>
       <w:r>
         <w:rPr>

</xml_diff>

<commit_message>
fix contest duration through Aug 25
</commit_message>
<xml_diff>
--- a/LoomQ-赛题.docx
+++ b/LoomQ-赛题.docx
@@ -109,16 +109,16 @@
         <w:rPr>
           <w:rFonts w:hint="eastAsia" w:ascii="Arial Unicode MS" w:hAnsi="Arial Unicode MS" w:cs="Arial Unicode MS" w:eastAsia="Arial Unicode MS"/>
         </w:rPr>
-        <w:t xml:space="preserve">：96</w:t>
-      </w:r>
-      <w:r>
-        <w:t xml:space="preserve"> </w:t>
-      </w:r>
-      <w:r>
-        <w:rPr>
-          <w:rFonts w:hint="eastAsia" w:ascii="Arial Unicode MS" w:hAnsi="Arial Unicode MS" w:cs="Arial Unicode MS" w:eastAsia="Arial Unicode MS"/>
-        </w:rPr>
-        <w:t xml:space="preserve">小时</w:t>
+        <w:t xml:space="preserve">：8 月 1 日 — 8 月 25 日（线上赛）</w:t>
+      </w:r>
+      <w:r>
+        <w:t xml:space="preserve"> </w:t>
+      </w:r>
+      <w:r>
+        <w:rPr>
+          <w:rFonts w:hint="eastAsia" w:ascii="Arial Unicode MS" w:hAnsi="Arial Unicode MS" w:cs="Arial Unicode MS" w:eastAsia="Arial Unicode MS"/>
+        </w:rPr>
+        <w:t xml:space="preserve"/>
       </w:r>
       <w:r>
         <w:t xml:space="preserve"> </w:t>

</xml_diff>